<commit_message>
Refactor GPS and soil sensor test sketches
Refactors GPS and soil sensor unit-test sketches: GPSArduinoTest migrated from SoftwareSerial to HardwareSerial for ESP32 (NEO-M8N), updates RX/TX pins and baud, revises LED behavior and adds diagnostic logging and lock handling. YagoArduinoUno fixes Modbus register mapping and scaling (temperature, moisture, pH), improves CRC/error handling, cleans up DE/RE control and serial flow, and enhances serial output formatting. Also updates the soil sensor unit-test document binary. These changes improve reliability and diagnostics for embedded testing.
</commit_message>
<xml_diff>
--- a/docs/Unit test for soil sensors.docx
+++ b/docs/Unit test for soil sensors.docx
@@ -29,7 +29,7 @@
                     <pic:cNvPicPr/>
                   </pic:nvPicPr>
                   <pic:blipFill>
-                    <a:blip r:embed="rId4"/>
+                    <a:blip r:embed="rId5"/>
                     <a:stretch>
                       <a:fillRect/>
                     </a:stretch>
@@ -71,7 +71,7 @@
                     <pic:cNvPicPr/>
                   </pic:nvPicPr>
                   <pic:blipFill>
-                    <a:blip r:embed="rId5"/>
+                    <a:blip r:embed="rId6"/>
                     <a:stretch>
                       <a:fillRect/>
                     </a:stretch>
@@ -100,10 +100,301 @@
         <w:t>2pinseonsorESP32</w:t>
       </w:r>
     </w:p>
+    <w:p>
+      <w:pPr>
+        <w:rPr>
+          <w:b/>
+        </w:rPr>
+      </w:pPr>
+      <w:r>
+        <w:rPr>
+          <w:b/>
+          <w:sz w:val="36"/>
+          <w:szCs w:val="36"/>
+        </w:rPr>
+        <w:t>Test</w:t>
+      </w:r>
+    </w:p>
+    <w:p>
+      <w:pPr>
+        <w:rPr>
+          <w:bCs/>
+        </w:rPr>
+      </w:pPr>
+      <w:r>
+        <w:rPr>
+          <w:bCs/>
+        </w:rPr>
+        <w:lastRenderedPageBreak/>
+        <w:t>tip inserted:</w:t>
+      </w:r>
+    </w:p>
+    <w:p>
+      <w:pPr>
+        <w:rPr>
+          <w:bCs/>
+        </w:rPr>
+      </w:pPr>
+      <w:r>
+        <w:rPr>
+          <w:bCs/>
+        </w:rPr>
+        <w:drawing>
+          <wp:inline distT="0" distB="0" distL="0" distR="0" wp14:anchorId="5B7B6886" wp14:editId="651CB11E">
+            <wp:extent cx="5943600" cy="2195195"/>
+            <wp:effectExtent l="0" t="0" r="0" b="0"/>
+            <wp:docPr id="1159401506" name="Picture 1"/>
+            <wp:cNvGraphicFramePr>
+              <a:graphicFrameLocks xmlns:a="http://schemas.openxmlformats.org/drawingml/2006/main" noChangeAspect="1"/>
+            </wp:cNvGraphicFramePr>
+            <a:graphic xmlns:a="http://schemas.openxmlformats.org/drawingml/2006/main">
+              <a:graphicData uri="http://schemas.openxmlformats.org/drawingml/2006/picture">
+                <pic:pic xmlns:pic="http://schemas.openxmlformats.org/drawingml/2006/picture">
+                  <pic:nvPicPr>
+                    <pic:cNvPr id="1159401506" name=""/>
+                    <pic:cNvPicPr/>
+                  </pic:nvPicPr>
+                  <pic:blipFill>
+                    <a:blip r:embed="rId7"/>
+                    <a:stretch>
+                      <a:fillRect/>
+                    </a:stretch>
+                  </pic:blipFill>
+                  <pic:spPr>
+                    <a:xfrm>
+                      <a:off x="0" y="0"/>
+                      <a:ext cx="5943600" cy="2195195"/>
+                    </a:xfrm>
+                    <a:prstGeom prst="rect">
+                      <a:avLst/>
+                    </a:prstGeom>
+                  </pic:spPr>
+                </pic:pic>
+              </a:graphicData>
+            </a:graphic>
+          </wp:inline>
+        </w:drawing>
+      </w:r>
+    </w:p>
+    <w:p>
+      <w:r>
+        <w:t>¼ inserted:</w:t>
+      </w:r>
+    </w:p>
+    <w:p>
+      <w:r>
+        <w:drawing>
+          <wp:inline distT="0" distB="0" distL="0" distR="0" wp14:anchorId="16A2C424" wp14:editId="3B820205">
+            <wp:extent cx="5943600" cy="868680"/>
+            <wp:effectExtent l="0" t="0" r="0" b="7620"/>
+            <wp:docPr id="1888856385" name="Picture 1"/>
+            <wp:cNvGraphicFramePr>
+              <a:graphicFrameLocks xmlns:a="http://schemas.openxmlformats.org/drawingml/2006/main" noChangeAspect="1"/>
+            </wp:cNvGraphicFramePr>
+            <a:graphic xmlns:a="http://schemas.openxmlformats.org/drawingml/2006/main">
+              <a:graphicData uri="http://schemas.openxmlformats.org/drawingml/2006/picture">
+                <pic:pic xmlns:pic="http://schemas.openxmlformats.org/drawingml/2006/picture">
+                  <pic:nvPicPr>
+                    <pic:cNvPr id="1888856385" name=""/>
+                    <pic:cNvPicPr/>
+                  </pic:nvPicPr>
+                  <pic:blipFill>
+                    <a:blip r:embed="rId8"/>
+                    <a:stretch>
+                      <a:fillRect/>
+                    </a:stretch>
+                  </pic:blipFill>
+                  <pic:spPr>
+                    <a:xfrm>
+                      <a:off x="0" y="0"/>
+                      <a:ext cx="5943600" cy="868680"/>
+                    </a:xfrm>
+                    <a:prstGeom prst="rect">
+                      <a:avLst/>
+                    </a:prstGeom>
+                  </pic:spPr>
+                </pic:pic>
+              </a:graphicData>
+            </a:graphic>
+          </wp:inline>
+        </w:drawing>
+      </w:r>
+    </w:p>
+    <w:p>
+      <w:r>
+        <w:t>½ inserted:</w:t>
+      </w:r>
+    </w:p>
+    <w:p>
+      <w:r>
+        <w:drawing>
+          <wp:inline distT="0" distB="0" distL="0" distR="0" wp14:anchorId="7411359D" wp14:editId="71057A02">
+            <wp:extent cx="5943600" cy="781685"/>
+            <wp:effectExtent l="0" t="0" r="0" b="0"/>
+            <wp:docPr id="906243336" name="Picture 1"/>
+            <wp:cNvGraphicFramePr>
+              <a:graphicFrameLocks xmlns:a="http://schemas.openxmlformats.org/drawingml/2006/main" noChangeAspect="1"/>
+            </wp:cNvGraphicFramePr>
+            <a:graphic xmlns:a="http://schemas.openxmlformats.org/drawingml/2006/main">
+              <a:graphicData uri="http://schemas.openxmlformats.org/drawingml/2006/picture">
+                <pic:pic xmlns:pic="http://schemas.openxmlformats.org/drawingml/2006/picture">
+                  <pic:nvPicPr>
+                    <pic:cNvPr id="906243336" name=""/>
+                    <pic:cNvPicPr/>
+                  </pic:nvPicPr>
+                  <pic:blipFill>
+                    <a:blip r:embed="rId9"/>
+                    <a:stretch>
+                      <a:fillRect/>
+                    </a:stretch>
+                  </pic:blipFill>
+                  <pic:spPr>
+                    <a:xfrm>
+                      <a:off x="0" y="0"/>
+                      <a:ext cx="5943600" cy="781685"/>
+                    </a:xfrm>
+                    <a:prstGeom prst="rect">
+                      <a:avLst/>
+                    </a:prstGeom>
+                  </pic:spPr>
+                </pic:pic>
+              </a:graphicData>
+            </a:graphic>
+          </wp:inline>
+        </w:drawing>
+      </w:r>
+    </w:p>
+    <w:p>
+      <w:r>
+        <w:t>fully inserted:</w:t>
+      </w:r>
+    </w:p>
+    <w:p>
+      <w:r>
+        <w:drawing>
+          <wp:inline distT="0" distB="0" distL="0" distR="0" wp14:anchorId="2D617CF7" wp14:editId="25C0EC06">
+            <wp:extent cx="5943600" cy="802005"/>
+            <wp:effectExtent l="0" t="0" r="0" b="0"/>
+            <wp:docPr id="1240211564" name="Picture 1"/>
+            <wp:cNvGraphicFramePr>
+              <a:graphicFrameLocks xmlns:a="http://schemas.openxmlformats.org/drawingml/2006/main" noChangeAspect="1"/>
+            </wp:cNvGraphicFramePr>
+            <a:graphic xmlns:a="http://schemas.openxmlformats.org/drawingml/2006/main">
+              <a:graphicData uri="http://schemas.openxmlformats.org/drawingml/2006/picture">
+                <pic:pic xmlns:pic="http://schemas.openxmlformats.org/drawingml/2006/picture">
+                  <pic:nvPicPr>
+                    <pic:cNvPr id="1240211564" name=""/>
+                    <pic:cNvPicPr/>
+                  </pic:nvPicPr>
+                  <pic:blipFill>
+                    <a:blip r:embed="rId10"/>
+                    <a:stretch>
+                      <a:fillRect/>
+                    </a:stretch>
+                  </pic:blipFill>
+                  <pic:spPr>
+                    <a:xfrm>
+                      <a:off x="0" y="0"/>
+                      <a:ext cx="5943600" cy="802005"/>
+                    </a:xfrm>
+                    <a:prstGeom prst="rect">
+                      <a:avLst/>
+                    </a:prstGeom>
+                  </pic:spPr>
+                </pic:pic>
+              </a:graphicData>
+            </a:graphic>
+          </wp:inline>
+        </w:drawing>
+      </w:r>
+    </w:p>
+    <w:p>
+      <w:r>
+        <w:t>Sand:</w:t>
+      </w:r>
+    </w:p>
+    <w:p>
+      <w:r>
+        <w:drawing>
+          <wp:inline distT="0" distB="0" distL="0" distR="0" wp14:anchorId="3B0D3F21" wp14:editId="65862D25">
+            <wp:extent cx="5943600" cy="594995"/>
+            <wp:effectExtent l="0" t="0" r="0" b="0"/>
+            <wp:docPr id="1057611350" name="Picture 1"/>
+            <wp:cNvGraphicFramePr>
+              <a:graphicFrameLocks xmlns:a="http://schemas.openxmlformats.org/drawingml/2006/main" noChangeAspect="1"/>
+            </wp:cNvGraphicFramePr>
+            <a:graphic xmlns:a="http://schemas.openxmlformats.org/drawingml/2006/main">
+              <a:graphicData uri="http://schemas.openxmlformats.org/drawingml/2006/picture">
+                <pic:pic xmlns:pic="http://schemas.openxmlformats.org/drawingml/2006/picture">
+                  <pic:nvPicPr>
+                    <pic:cNvPr id="1057611350" name=""/>
+                    <pic:cNvPicPr/>
+                  </pic:nvPicPr>
+                  <pic:blipFill>
+                    <a:blip r:embed="rId11"/>
+                    <a:stretch>
+                      <a:fillRect/>
+                    </a:stretch>
+                  </pic:blipFill>
+                  <pic:spPr>
+                    <a:xfrm>
+                      <a:off x="0" y="0"/>
+                      <a:ext cx="5943600" cy="594995"/>
+                    </a:xfrm>
+                    <a:prstGeom prst="rect">
+                      <a:avLst/>
+                    </a:prstGeom>
+                  </pic:spPr>
+                </pic:pic>
+              </a:graphicData>
+            </a:graphic>
+          </wp:inline>
+        </w:drawing>
+      </w:r>
+    </w:p>
+    <w:p>
+      <w:r>
+        <w:lastRenderedPageBreak/>
+        <w:drawing>
+          <wp:inline distT="0" distB="0" distL="0" distR="0" wp14:anchorId="076BC2B1" wp14:editId="7DAC9AD1">
+            <wp:extent cx="5943600" cy="1188085"/>
+            <wp:effectExtent l="0" t="0" r="0" b="0"/>
+            <wp:docPr id="1821280050" name="Picture 1"/>
+            <wp:cNvGraphicFramePr>
+              <a:graphicFrameLocks xmlns:a="http://schemas.openxmlformats.org/drawingml/2006/main" noChangeAspect="1"/>
+            </wp:cNvGraphicFramePr>
+            <a:graphic xmlns:a="http://schemas.openxmlformats.org/drawingml/2006/main">
+              <a:graphicData uri="http://schemas.openxmlformats.org/drawingml/2006/picture">
+                <pic:pic xmlns:pic="http://schemas.openxmlformats.org/drawingml/2006/picture">
+                  <pic:nvPicPr>
+                    <pic:cNvPr id="1821280050" name=""/>
+                    <pic:cNvPicPr/>
+                  </pic:nvPicPr>
+                  <pic:blipFill>
+                    <a:blip r:embed="rId12"/>
+                    <a:stretch>
+                      <a:fillRect/>
+                    </a:stretch>
+                  </pic:blipFill>
+                  <pic:spPr>
+                    <a:xfrm>
+                      <a:off x="0" y="0"/>
+                      <a:ext cx="5943600" cy="1188085"/>
+                    </a:xfrm>
+                    <a:prstGeom prst="rect">
+                      <a:avLst/>
+                    </a:prstGeom>
+                  </pic:spPr>
+                </pic:pic>
+              </a:graphicData>
+            </a:graphic>
+          </wp:inline>
+        </w:drawing>
+      </w:r>
+    </w:p>
     <w:p/>
     <w:p>
       <w:r>
-        <w:lastRenderedPageBreak/>
         <w:t>YAGO soil sensor (incomplete)</w:t>
       </w:r>
     </w:p>
@@ -130,7 +421,7 @@
                     </pic:cNvPicPr>
                   </pic:nvPicPr>
                   <pic:blipFill>
-                    <a:blip r:embed="rId6">
+                    <a:blip r:embed="rId13">
                       <a:extLst>
                         <a:ext uri="{28A0092B-C50C-407E-A947-70E740481C1C}">
                           <a14:useLocalDpi xmlns:a14="http://schemas.microsoft.com/office/drawing/2010/main" val="0"/>
@@ -167,6 +458,7 @@
         <w:rPr>
           <w:noProof/>
         </w:rPr>
+        <w:lastRenderedPageBreak/>
         <w:drawing>
           <wp:inline distT="0" distB="0" distL="0" distR="0" wp14:anchorId="7B9D7A23" wp14:editId="35873359">
             <wp:extent cx="5943600" cy="3434080"/>
@@ -183,7 +475,7 @@
                     <pic:cNvPicPr/>
                   </pic:nvPicPr>
                   <pic:blipFill>
-                    <a:blip r:embed="rId7"/>
+                    <a:blip r:embed="rId14"/>
                     <a:stretch>
                       <a:fillRect/>
                     </a:stretch>
@@ -209,7 +501,6 @@
         <w:rPr>
           <w:noProof/>
         </w:rPr>
-        <w:lastRenderedPageBreak/>
         <w:drawing>
           <wp:inline distT="0" distB="0" distL="0" distR="0" wp14:anchorId="46AB71C5" wp14:editId="340F2E35">
             <wp:extent cx="5943600" cy="3649980"/>
@@ -226,7 +517,7 @@
                     <pic:cNvPicPr/>
                   </pic:nvPicPr>
                   <pic:blipFill>
-                    <a:blip r:embed="rId8"/>
+                    <a:blip r:embed="rId15"/>
                     <a:stretch>
                       <a:fillRect/>
                     </a:stretch>
@@ -270,7 +561,7 @@
                     <pic:cNvPicPr/>
                   </pic:nvPicPr>
                   <pic:blipFill>
-                    <a:blip r:embed="rId9"/>
+                    <a:blip r:embed="rId16"/>
                     <a:stretch>
                       <a:fillRect/>
                     </a:stretch>
@@ -299,6 +590,1830 @@
     <w:p>
       <w:r>
         <w:t>Initial test impression (without inserting in soil): Soil moisture is kind of BS. Stuck in 29%. Temperature is accurate, compares well with thermometer.</w:t>
+      </w:r>
+    </w:p>
+    <w:p/>
+    <w:p>
+      <w:pPr>
+        <w:rPr>
+          <w:b/>
+          <w:bCs/>
+        </w:rPr>
+      </w:pPr>
+      <w:r>
+        <w:rPr>
+          <w:b/>
+          <w:bCs/>
+        </w:rPr>
+        <w:t>Test with wet soil</w:t>
+      </w:r>
+    </w:p>
+    <w:p/>
+    <w:p>
+      <w:r>
+        <w:rPr>
+          <w:b/>
+          <w:bCs/>
+        </w:rPr>
+        <w:lastRenderedPageBreak/>
+        <w:t xml:space="preserve">- </w:t>
+      </w:r>
+      <w:r>
+        <w:t>instant reading upon insertion</w:t>
+      </w:r>
+      <w:r>
+        <w:drawing>
+          <wp:inline distT="0" distB="0" distL="0" distR="0" wp14:anchorId="2654FC78" wp14:editId="430B58F6">
+            <wp:extent cx="5943600" cy="1749425"/>
+            <wp:effectExtent l="0" t="0" r="0" b="3175"/>
+            <wp:docPr id="2074314174" name="Picture 1"/>
+            <wp:cNvGraphicFramePr>
+              <a:graphicFrameLocks xmlns:a="http://schemas.openxmlformats.org/drawingml/2006/main" noChangeAspect="1"/>
+            </wp:cNvGraphicFramePr>
+            <a:graphic xmlns:a="http://schemas.openxmlformats.org/drawingml/2006/main">
+              <a:graphicData uri="http://schemas.openxmlformats.org/drawingml/2006/picture">
+                <pic:pic xmlns:pic="http://schemas.openxmlformats.org/drawingml/2006/picture">
+                  <pic:nvPicPr>
+                    <pic:cNvPr id="2074314174" name=""/>
+                    <pic:cNvPicPr/>
+                  </pic:nvPicPr>
+                  <pic:blipFill>
+                    <a:blip r:embed="rId17"/>
+                    <a:stretch>
+                      <a:fillRect/>
+                    </a:stretch>
+                  </pic:blipFill>
+                  <pic:spPr>
+                    <a:xfrm>
+                      <a:off x="0" y="0"/>
+                      <a:ext cx="5943600" cy="1749425"/>
+                    </a:xfrm>
+                    <a:prstGeom prst="rect">
+                      <a:avLst/>
+                    </a:prstGeom>
+                  </pic:spPr>
+                </pic:pic>
+              </a:graphicData>
+            </a:graphic>
+          </wp:inline>
+        </w:drawing>
+      </w:r>
+    </w:p>
+    <w:p>
+      <w:r>
+        <w:rPr>
+          <w:noProof/>
+        </w:rPr>
+        <w:drawing>
+          <wp:inline distT="0" distB="0" distL="0" distR="0" wp14:anchorId="4B707C9A" wp14:editId="458D7517">
+            <wp:extent cx="3547907" cy="2662446"/>
+            <wp:effectExtent l="4763" t="0" r="317" b="318"/>
+            <wp:docPr id="1194171482" name="Picture 1"/>
+            <wp:cNvGraphicFramePr>
+              <a:graphicFrameLocks xmlns:a="http://schemas.openxmlformats.org/drawingml/2006/main" noChangeAspect="1"/>
+            </wp:cNvGraphicFramePr>
+            <a:graphic xmlns:a="http://schemas.openxmlformats.org/drawingml/2006/main">
+              <a:graphicData uri="http://schemas.openxmlformats.org/drawingml/2006/picture">
+                <pic:pic xmlns:pic="http://schemas.openxmlformats.org/drawingml/2006/picture">
+                  <pic:nvPicPr>
+                    <pic:cNvPr id="0" name="Picture 1"/>
+                    <pic:cNvPicPr>
+                      <a:picLocks noChangeAspect="1" noChangeArrowheads="1"/>
+                    </pic:cNvPicPr>
+                  </pic:nvPicPr>
+                  <pic:blipFill>
+                    <a:blip r:embed="rId18" cstate="print">
+                      <a:extLst>
+                        <a:ext uri="{28A0092B-C50C-407E-A947-70E740481C1C}">
+                          <a14:useLocalDpi xmlns:a14="http://schemas.microsoft.com/office/drawing/2010/main" val="0"/>
+                        </a:ext>
+                      </a:extLst>
+                    </a:blip>
+                    <a:srcRect/>
+                    <a:stretch>
+                      <a:fillRect/>
+                    </a:stretch>
+                  </pic:blipFill>
+                  <pic:spPr bwMode="auto">
+                    <a:xfrm rot="5400000">
+                      <a:off x="0" y="0"/>
+                      <a:ext cx="3549998" cy="2664015"/>
+                    </a:xfrm>
+                    <a:prstGeom prst="rect">
+                      <a:avLst/>
+                    </a:prstGeom>
+                    <a:noFill/>
+                    <a:ln>
+                      <a:noFill/>
+                    </a:ln>
+                  </pic:spPr>
+                </pic:pic>
+              </a:graphicData>
+            </a:graphic>
+          </wp:inline>
+        </w:drawing>
+      </w:r>
+    </w:p>
+    <w:p/>
+    <w:p>
+      <w:r>
+        <w:t>After 5 mins reading</w:t>
+      </w:r>
+    </w:p>
+    <w:p>
+      <w:r>
+        <w:drawing>
+          <wp:inline distT="0" distB="0" distL="0" distR="0" wp14:anchorId="5FF6054A" wp14:editId="1E5B57E6">
+            <wp:extent cx="5943600" cy="1557655"/>
+            <wp:effectExtent l="0" t="0" r="0" b="4445"/>
+            <wp:docPr id="125792783" name="Picture 1"/>
+            <wp:cNvGraphicFramePr>
+              <a:graphicFrameLocks xmlns:a="http://schemas.openxmlformats.org/drawingml/2006/main" noChangeAspect="1"/>
+            </wp:cNvGraphicFramePr>
+            <a:graphic xmlns:a="http://schemas.openxmlformats.org/drawingml/2006/main">
+              <a:graphicData uri="http://schemas.openxmlformats.org/drawingml/2006/picture">
+                <pic:pic xmlns:pic="http://schemas.openxmlformats.org/drawingml/2006/picture">
+                  <pic:nvPicPr>
+                    <pic:cNvPr id="125792783" name=""/>
+                    <pic:cNvPicPr/>
+                  </pic:nvPicPr>
+                  <pic:blipFill>
+                    <a:blip r:embed="rId19"/>
+                    <a:stretch>
+                      <a:fillRect/>
+                    </a:stretch>
+                  </pic:blipFill>
+                  <pic:spPr>
+                    <a:xfrm>
+                      <a:off x="0" y="0"/>
+                      <a:ext cx="5943600" cy="1557655"/>
+                    </a:xfrm>
+                    <a:prstGeom prst="rect">
+                      <a:avLst/>
+                    </a:prstGeom>
+                  </pic:spPr>
+                </pic:pic>
+              </a:graphicData>
+            </a:graphic>
+          </wp:inline>
+        </w:drawing>
+      </w:r>
+    </w:p>
+    <w:p>
+      <w:r>
+        <w:lastRenderedPageBreak/>
+        <w:t xml:space="preserve">Result after removing </w:t>
+      </w:r>
+    </w:p>
+    <w:p>
+      <w:r>
+        <w:drawing>
+          <wp:inline distT="0" distB="0" distL="0" distR="0" wp14:anchorId="02EDB9E6" wp14:editId="030AE620">
+            <wp:extent cx="5943600" cy="1720215"/>
+            <wp:effectExtent l="0" t="0" r="0" b="0"/>
+            <wp:docPr id="1064347203" name="Picture 1"/>
+            <wp:cNvGraphicFramePr>
+              <a:graphicFrameLocks xmlns:a="http://schemas.openxmlformats.org/drawingml/2006/main" noChangeAspect="1"/>
+            </wp:cNvGraphicFramePr>
+            <a:graphic xmlns:a="http://schemas.openxmlformats.org/drawingml/2006/main">
+              <a:graphicData uri="http://schemas.openxmlformats.org/drawingml/2006/picture">
+                <pic:pic xmlns:pic="http://schemas.openxmlformats.org/drawingml/2006/picture">
+                  <pic:nvPicPr>
+                    <pic:cNvPr id="1064347203" name=""/>
+                    <pic:cNvPicPr/>
+                  </pic:nvPicPr>
+                  <pic:blipFill>
+                    <a:blip r:embed="rId20"/>
+                    <a:stretch>
+                      <a:fillRect/>
+                    </a:stretch>
+                  </pic:blipFill>
+                  <pic:spPr>
+                    <a:xfrm>
+                      <a:off x="0" y="0"/>
+                      <a:ext cx="5943600" cy="1720215"/>
+                    </a:xfrm>
+                    <a:prstGeom prst="rect">
+                      <a:avLst/>
+                    </a:prstGeom>
+                  </pic:spPr>
+                </pic:pic>
+              </a:graphicData>
+            </a:graphic>
+          </wp:inline>
+        </w:drawing>
+      </w:r>
+    </w:p>
+    <w:p>
+      <w:r>
+        <w:t>Half inserted result:</w:t>
+      </w:r>
+    </w:p>
+    <w:p>
+      <w:r>
+        <w:drawing>
+          <wp:inline distT="0" distB="0" distL="0" distR="0" wp14:anchorId="28426D19" wp14:editId="7D16A9CC">
+            <wp:extent cx="5943600" cy="840105"/>
+            <wp:effectExtent l="0" t="0" r="0" b="0"/>
+            <wp:docPr id="854908898" name="Picture 1"/>
+            <wp:cNvGraphicFramePr>
+              <a:graphicFrameLocks xmlns:a="http://schemas.openxmlformats.org/drawingml/2006/main" noChangeAspect="1"/>
+            </wp:cNvGraphicFramePr>
+            <a:graphic xmlns:a="http://schemas.openxmlformats.org/drawingml/2006/main">
+              <a:graphicData uri="http://schemas.openxmlformats.org/drawingml/2006/picture">
+                <pic:pic xmlns:pic="http://schemas.openxmlformats.org/drawingml/2006/picture">
+                  <pic:nvPicPr>
+                    <pic:cNvPr id="854908898" name=""/>
+                    <pic:cNvPicPr/>
+                  </pic:nvPicPr>
+                  <pic:blipFill>
+                    <a:blip r:embed="rId21"/>
+                    <a:stretch>
+                      <a:fillRect/>
+                    </a:stretch>
+                  </pic:blipFill>
+                  <pic:spPr>
+                    <a:xfrm>
+                      <a:off x="0" y="0"/>
+                      <a:ext cx="5943600" cy="840105"/>
+                    </a:xfrm>
+                    <a:prstGeom prst="rect">
+                      <a:avLst/>
+                    </a:prstGeom>
+                  </pic:spPr>
+                </pic:pic>
+              </a:graphicData>
+            </a:graphic>
+          </wp:inline>
+        </w:drawing>
+      </w:r>
+    </w:p>
+    <w:p>
+      <w:r>
+        <w:t>¾ inserted:</w:t>
+      </w:r>
+    </w:p>
+    <w:p>
+      <w:r>
+        <w:drawing>
+          <wp:inline distT="0" distB="0" distL="0" distR="0" wp14:anchorId="4CF26750" wp14:editId="4C4E22CA">
+            <wp:extent cx="5943600" cy="793750"/>
+            <wp:effectExtent l="0" t="0" r="0" b="6350"/>
+            <wp:docPr id="444832979" name="Picture 1"/>
+            <wp:cNvGraphicFramePr>
+              <a:graphicFrameLocks xmlns:a="http://schemas.openxmlformats.org/drawingml/2006/main" noChangeAspect="1"/>
+            </wp:cNvGraphicFramePr>
+            <a:graphic xmlns:a="http://schemas.openxmlformats.org/drawingml/2006/main">
+              <a:graphicData uri="http://schemas.openxmlformats.org/drawingml/2006/picture">
+                <pic:pic xmlns:pic="http://schemas.openxmlformats.org/drawingml/2006/picture">
+                  <pic:nvPicPr>
+                    <pic:cNvPr id="444832979" name=""/>
+                    <pic:cNvPicPr/>
+                  </pic:nvPicPr>
+                  <pic:blipFill>
+                    <a:blip r:embed="rId22"/>
+                    <a:stretch>
+                      <a:fillRect/>
+                    </a:stretch>
+                  </pic:blipFill>
+                  <pic:spPr>
+                    <a:xfrm>
+                      <a:off x="0" y="0"/>
+                      <a:ext cx="5943600" cy="793750"/>
+                    </a:xfrm>
+                    <a:prstGeom prst="rect">
+                      <a:avLst/>
+                    </a:prstGeom>
+                  </pic:spPr>
+                </pic:pic>
+              </a:graphicData>
+            </a:graphic>
+          </wp:inline>
+        </w:drawing>
+      </w:r>
+    </w:p>
+    <w:p>
+      <w:r>
+        <w:t>¼ inserted:</w:t>
+      </w:r>
+    </w:p>
+    <w:p>
+      <w:r>
+        <w:drawing>
+          <wp:inline distT="0" distB="0" distL="0" distR="0" wp14:anchorId="39DC2730" wp14:editId="5D89E7BF">
+            <wp:extent cx="5943600" cy="695960"/>
+            <wp:effectExtent l="0" t="0" r="0" b="8890"/>
+            <wp:docPr id="1394605734" name="Picture 1"/>
+            <wp:cNvGraphicFramePr>
+              <a:graphicFrameLocks xmlns:a="http://schemas.openxmlformats.org/drawingml/2006/main" noChangeAspect="1"/>
+            </wp:cNvGraphicFramePr>
+            <a:graphic xmlns:a="http://schemas.openxmlformats.org/drawingml/2006/main">
+              <a:graphicData uri="http://schemas.openxmlformats.org/drawingml/2006/picture">
+                <pic:pic xmlns:pic="http://schemas.openxmlformats.org/drawingml/2006/picture">
+                  <pic:nvPicPr>
+                    <pic:cNvPr id="1394605734" name=""/>
+                    <pic:cNvPicPr/>
+                  </pic:nvPicPr>
+                  <pic:blipFill>
+                    <a:blip r:embed="rId23"/>
+                    <a:stretch>
+                      <a:fillRect/>
+                    </a:stretch>
+                  </pic:blipFill>
+                  <pic:spPr>
+                    <a:xfrm>
+                      <a:off x="0" y="0"/>
+                      <a:ext cx="5943600" cy="695960"/>
+                    </a:xfrm>
+                    <a:prstGeom prst="rect">
+                      <a:avLst/>
+                    </a:prstGeom>
+                  </pic:spPr>
+                </pic:pic>
+              </a:graphicData>
+            </a:graphic>
+          </wp:inline>
+        </w:drawing>
+      </w:r>
+    </w:p>
+    <w:p>
+      <w:r>
+        <w:t>tip only:</w:t>
+      </w:r>
+    </w:p>
+    <w:p>
+      <w:r>
+        <w:drawing>
+          <wp:inline distT="0" distB="0" distL="0" distR="0" wp14:anchorId="591F7019" wp14:editId="7BCB0530">
+            <wp:extent cx="5943600" cy="743585"/>
+            <wp:effectExtent l="0" t="0" r="0" b="0"/>
+            <wp:docPr id="482501441" name="Picture 1"/>
+            <wp:cNvGraphicFramePr>
+              <a:graphicFrameLocks xmlns:a="http://schemas.openxmlformats.org/drawingml/2006/main" noChangeAspect="1"/>
+            </wp:cNvGraphicFramePr>
+            <a:graphic xmlns:a="http://schemas.openxmlformats.org/drawingml/2006/main">
+              <a:graphicData uri="http://schemas.openxmlformats.org/drawingml/2006/picture">
+                <pic:pic xmlns:pic="http://schemas.openxmlformats.org/drawingml/2006/picture">
+                  <pic:nvPicPr>
+                    <pic:cNvPr id="482501441" name=""/>
+                    <pic:cNvPicPr/>
+                  </pic:nvPicPr>
+                  <pic:blipFill>
+                    <a:blip r:embed="rId24"/>
+                    <a:stretch>
+                      <a:fillRect/>
+                    </a:stretch>
+                  </pic:blipFill>
+                  <pic:spPr>
+                    <a:xfrm>
+                      <a:off x="0" y="0"/>
+                      <a:ext cx="5943600" cy="743585"/>
+                    </a:xfrm>
+                    <a:prstGeom prst="rect">
+                      <a:avLst/>
+                    </a:prstGeom>
+                  </pic:spPr>
+                </pic:pic>
+              </a:graphicData>
+            </a:graphic>
+          </wp:inline>
+        </w:drawing>
+      </w:r>
+    </w:p>
+    <w:p>
+      <w:r>
+        <w:t>Fully inserted (incuding the black part)(after code fix):</w:t>
+      </w:r>
+    </w:p>
+    <w:p>
+      <w:r>
+        <w:drawing>
+          <wp:inline distT="0" distB="0" distL="0" distR="0" wp14:anchorId="0EAD0349" wp14:editId="1374EF9B">
+            <wp:extent cx="5943600" cy="709295"/>
+            <wp:effectExtent l="0" t="0" r="0" b="0"/>
+            <wp:docPr id="788014086" name="Picture 1"/>
+            <wp:cNvGraphicFramePr>
+              <a:graphicFrameLocks xmlns:a="http://schemas.openxmlformats.org/drawingml/2006/main" noChangeAspect="1"/>
+            </wp:cNvGraphicFramePr>
+            <a:graphic xmlns:a="http://schemas.openxmlformats.org/drawingml/2006/main">
+              <a:graphicData uri="http://schemas.openxmlformats.org/drawingml/2006/picture">
+                <pic:pic xmlns:pic="http://schemas.openxmlformats.org/drawingml/2006/picture">
+                  <pic:nvPicPr>
+                    <pic:cNvPr id="788014086" name=""/>
+                    <pic:cNvPicPr/>
+                  </pic:nvPicPr>
+                  <pic:blipFill>
+                    <a:blip r:embed="rId25"/>
+                    <a:stretch>
+                      <a:fillRect/>
+                    </a:stretch>
+                  </pic:blipFill>
+                  <pic:spPr>
+                    <a:xfrm>
+                      <a:off x="0" y="0"/>
+                      <a:ext cx="5943600" cy="709295"/>
+                    </a:xfrm>
+                    <a:prstGeom prst="rect">
+                      <a:avLst/>
+                    </a:prstGeom>
+                  </pic:spPr>
+                </pic:pic>
+              </a:graphicData>
+            </a:graphic>
+          </wp:inline>
+        </w:drawing>
+      </w:r>
+    </w:p>
+    <w:p>
+      <w:r>
+        <w:lastRenderedPageBreak/>
+        <w:t>Edge of the container:</w:t>
+      </w:r>
+    </w:p>
+    <w:p>
+      <w:r>
+        <w:drawing>
+          <wp:inline distT="0" distB="0" distL="0" distR="0" wp14:anchorId="61933014" wp14:editId="0719492A">
+            <wp:extent cx="5943600" cy="800100"/>
+            <wp:effectExtent l="0" t="0" r="0" b="0"/>
+            <wp:docPr id="1154192934" name="Picture 1"/>
+            <wp:cNvGraphicFramePr>
+              <a:graphicFrameLocks xmlns:a="http://schemas.openxmlformats.org/drawingml/2006/main" noChangeAspect="1"/>
+            </wp:cNvGraphicFramePr>
+            <a:graphic xmlns:a="http://schemas.openxmlformats.org/drawingml/2006/main">
+              <a:graphicData uri="http://schemas.openxmlformats.org/drawingml/2006/picture">
+                <pic:pic xmlns:pic="http://schemas.openxmlformats.org/drawingml/2006/picture">
+                  <pic:nvPicPr>
+                    <pic:cNvPr id="1154192934" name=""/>
+                    <pic:cNvPicPr/>
+                  </pic:nvPicPr>
+                  <pic:blipFill>
+                    <a:blip r:embed="rId26"/>
+                    <a:stretch>
+                      <a:fillRect/>
+                    </a:stretch>
+                  </pic:blipFill>
+                  <pic:spPr>
+                    <a:xfrm>
+                      <a:off x="0" y="0"/>
+                      <a:ext cx="5943600" cy="800100"/>
+                    </a:xfrm>
+                    <a:prstGeom prst="rect">
+                      <a:avLst/>
+                    </a:prstGeom>
+                  </pic:spPr>
+                </pic:pic>
+              </a:graphicData>
+            </a:graphic>
+          </wp:inline>
+        </w:drawing>
+      </w:r>
+      <w:r>
+        <w:rPr>
+          <w:noProof/>
+        </w:rPr>
+        <w:drawing>
+          <wp:inline distT="0" distB="0" distL="0" distR="0" wp14:anchorId="4C46F9F6" wp14:editId="5A7158C3">
+            <wp:extent cx="3128223" cy="2346501"/>
+            <wp:effectExtent l="0" t="9208" r="6033" b="6032"/>
+            <wp:docPr id="822080456" name="Picture 2"/>
+            <wp:cNvGraphicFramePr>
+              <a:graphicFrameLocks xmlns:a="http://schemas.openxmlformats.org/drawingml/2006/main" noChangeAspect="1"/>
+            </wp:cNvGraphicFramePr>
+            <a:graphic xmlns:a="http://schemas.openxmlformats.org/drawingml/2006/main">
+              <a:graphicData uri="http://schemas.openxmlformats.org/drawingml/2006/picture">
+                <pic:pic xmlns:pic="http://schemas.openxmlformats.org/drawingml/2006/picture">
+                  <pic:nvPicPr>
+                    <pic:cNvPr id="0" name="Picture 2"/>
+                    <pic:cNvPicPr>
+                      <a:picLocks noChangeAspect="1" noChangeArrowheads="1"/>
+                    </pic:cNvPicPr>
+                  </pic:nvPicPr>
+                  <pic:blipFill>
+                    <a:blip r:embed="rId27" cstate="print">
+                      <a:extLst>
+                        <a:ext uri="{28A0092B-C50C-407E-A947-70E740481C1C}">
+                          <a14:useLocalDpi xmlns:a14="http://schemas.microsoft.com/office/drawing/2010/main" val="0"/>
+                        </a:ext>
+                      </a:extLst>
+                    </a:blip>
+                    <a:srcRect/>
+                    <a:stretch>
+                      <a:fillRect/>
+                    </a:stretch>
+                  </pic:blipFill>
+                  <pic:spPr bwMode="auto">
+                    <a:xfrm rot="5400000">
+                      <a:off x="0" y="0"/>
+                      <a:ext cx="3134352" cy="2351098"/>
+                    </a:xfrm>
+                    <a:prstGeom prst="rect">
+                      <a:avLst/>
+                    </a:prstGeom>
+                    <a:noFill/>
+                    <a:ln>
+                      <a:noFill/>
+                    </a:ln>
+                  </pic:spPr>
+                </pic:pic>
+              </a:graphicData>
+            </a:graphic>
+          </wp:inline>
+        </w:drawing>
+      </w:r>
+    </w:p>
+    <w:p>
+      <w:r>
+        <w:t>Other edge of the soil: (soil feels cold to touch)</w:t>
+      </w:r>
+    </w:p>
+    <w:p>
+      <w:r>
+        <w:drawing>
+          <wp:inline distT="0" distB="0" distL="0" distR="0" wp14:anchorId="0C47AF76" wp14:editId="036F2FEB">
+            <wp:extent cx="5943600" cy="815975"/>
+            <wp:effectExtent l="0" t="0" r="0" b="3175"/>
+            <wp:docPr id="1337365919" name="Picture 1"/>
+            <wp:cNvGraphicFramePr>
+              <a:graphicFrameLocks xmlns:a="http://schemas.openxmlformats.org/drawingml/2006/main" noChangeAspect="1"/>
+            </wp:cNvGraphicFramePr>
+            <a:graphic xmlns:a="http://schemas.openxmlformats.org/drawingml/2006/main">
+              <a:graphicData uri="http://schemas.openxmlformats.org/drawingml/2006/picture">
+                <pic:pic xmlns:pic="http://schemas.openxmlformats.org/drawingml/2006/picture">
+                  <pic:nvPicPr>
+                    <pic:cNvPr id="1337365919" name=""/>
+                    <pic:cNvPicPr/>
+                  </pic:nvPicPr>
+                  <pic:blipFill>
+                    <a:blip r:embed="rId28"/>
+                    <a:stretch>
+                      <a:fillRect/>
+                    </a:stretch>
+                  </pic:blipFill>
+                  <pic:spPr>
+                    <a:xfrm>
+                      <a:off x="0" y="0"/>
+                      <a:ext cx="5943600" cy="815975"/>
+                    </a:xfrm>
+                    <a:prstGeom prst="rect">
+                      <a:avLst/>
+                    </a:prstGeom>
+                  </pic:spPr>
+                </pic:pic>
+              </a:graphicData>
+            </a:graphic>
+          </wp:inline>
+        </w:drawing>
+      </w:r>
+    </w:p>
+    <w:p/>
+    <w:p>
+      <w:r>
+        <w:rPr>
+          <w:noProof/>
+        </w:rPr>
+        <w:lastRenderedPageBreak/>
+        <w:drawing>
+          <wp:inline distT="0" distB="0" distL="0" distR="0" wp14:anchorId="23BFE22F" wp14:editId="7B2F237C">
+            <wp:extent cx="5943600" cy="4455160"/>
+            <wp:effectExtent l="1270" t="0" r="1270" b="1270"/>
+            <wp:docPr id="730085877" name="Picture 3"/>
+            <wp:cNvGraphicFramePr>
+              <a:graphicFrameLocks xmlns:a="http://schemas.openxmlformats.org/drawingml/2006/main" noChangeAspect="1"/>
+            </wp:cNvGraphicFramePr>
+            <a:graphic xmlns:a="http://schemas.openxmlformats.org/drawingml/2006/main">
+              <a:graphicData uri="http://schemas.openxmlformats.org/drawingml/2006/picture">
+                <pic:pic xmlns:pic="http://schemas.openxmlformats.org/drawingml/2006/picture">
+                  <pic:nvPicPr>
+                    <pic:cNvPr id="0" name="Picture 3"/>
+                    <pic:cNvPicPr>
+                      <a:picLocks noChangeAspect="1" noChangeArrowheads="1"/>
+                    </pic:cNvPicPr>
+                  </pic:nvPicPr>
+                  <pic:blipFill>
+                    <a:blip r:embed="rId29" cstate="print">
+                      <a:extLst>
+                        <a:ext uri="{28A0092B-C50C-407E-A947-70E740481C1C}">
+                          <a14:useLocalDpi xmlns:a14="http://schemas.microsoft.com/office/drawing/2010/main" val="0"/>
+                        </a:ext>
+                      </a:extLst>
+                    </a:blip>
+                    <a:srcRect/>
+                    <a:stretch>
+                      <a:fillRect/>
+                    </a:stretch>
+                  </pic:blipFill>
+                  <pic:spPr bwMode="auto">
+                    <a:xfrm rot="5400000">
+                      <a:off x="0" y="0"/>
+                      <a:ext cx="5943600" cy="4455160"/>
+                    </a:xfrm>
+                    <a:prstGeom prst="rect">
+                      <a:avLst/>
+                    </a:prstGeom>
+                    <a:noFill/>
+                    <a:ln>
+                      <a:noFill/>
+                    </a:ln>
+                  </pic:spPr>
+                </pic:pic>
+              </a:graphicData>
+            </a:graphic>
+          </wp:inline>
+        </w:drawing>
+      </w:r>
+    </w:p>
+    <w:p/>
+    <w:p/>
+    <w:p/>
+    <w:p>
+      <w:pPr>
+        <w:rPr>
+          <w:b/>
+          <w:bCs/>
+        </w:rPr>
+      </w:pPr>
+      <w:r>
+        <w:rPr>
+          <w:b/>
+          <w:bCs/>
+        </w:rPr>
+        <w:t>SAND TEST</w:t>
+      </w:r>
+    </w:p>
+    <w:p>
+      <w:pPr>
+        <w:rPr>
+          <w:b/>
+          <w:bCs/>
+        </w:rPr>
+      </w:pPr>
+      <w:r>
+        <w:rPr>
+          <w:b/>
+          <w:bCs/>
+        </w:rPr>
+        <w:drawing>
+          <wp:inline distT="0" distB="0" distL="0" distR="0" wp14:anchorId="24455516" wp14:editId="42B7E560">
+            <wp:extent cx="5943600" cy="741045"/>
+            <wp:effectExtent l="0" t="0" r="0" b="1905"/>
+            <wp:docPr id="1142745565" name="Picture 1"/>
+            <wp:cNvGraphicFramePr>
+              <a:graphicFrameLocks xmlns:a="http://schemas.openxmlformats.org/drawingml/2006/main" noChangeAspect="1"/>
+            </wp:cNvGraphicFramePr>
+            <a:graphic xmlns:a="http://schemas.openxmlformats.org/drawingml/2006/main">
+              <a:graphicData uri="http://schemas.openxmlformats.org/drawingml/2006/picture">
+                <pic:pic xmlns:pic="http://schemas.openxmlformats.org/drawingml/2006/picture">
+                  <pic:nvPicPr>
+                    <pic:cNvPr id="1142745565" name=""/>
+                    <pic:cNvPicPr/>
+                  </pic:nvPicPr>
+                  <pic:blipFill>
+                    <a:blip r:embed="rId30"/>
+                    <a:stretch>
+                      <a:fillRect/>
+                    </a:stretch>
+                  </pic:blipFill>
+                  <pic:spPr>
+                    <a:xfrm>
+                      <a:off x="0" y="0"/>
+                      <a:ext cx="5943600" cy="741045"/>
+                    </a:xfrm>
+                    <a:prstGeom prst="rect">
+                      <a:avLst/>
+                    </a:prstGeom>
+                  </pic:spPr>
+                </pic:pic>
+              </a:graphicData>
+            </a:graphic>
+          </wp:inline>
+        </w:drawing>
+      </w:r>
+    </w:p>
+    <w:p>
+      <w:r>
+        <w:rPr>
+          <w:noProof/>
+        </w:rPr>
+        <w:lastRenderedPageBreak/>
+        <w:drawing>
+          <wp:inline distT="0" distB="0" distL="0" distR="0" wp14:anchorId="0A2DE552" wp14:editId="10828B85">
+            <wp:extent cx="5943600" cy="4458335"/>
+            <wp:effectExtent l="0" t="318" r="0" b="0"/>
+            <wp:docPr id="1323549349" name="Picture 5"/>
+            <wp:cNvGraphicFramePr>
+              <a:graphicFrameLocks xmlns:a="http://schemas.openxmlformats.org/drawingml/2006/main" noChangeAspect="1"/>
+            </wp:cNvGraphicFramePr>
+            <a:graphic xmlns:a="http://schemas.openxmlformats.org/drawingml/2006/main">
+              <a:graphicData uri="http://schemas.openxmlformats.org/drawingml/2006/picture">
+                <pic:pic xmlns:pic="http://schemas.openxmlformats.org/drawingml/2006/picture">
+                  <pic:nvPicPr>
+                    <pic:cNvPr id="0" name="Picture 5"/>
+                    <pic:cNvPicPr>
+                      <a:picLocks noChangeAspect="1" noChangeArrowheads="1"/>
+                    </pic:cNvPicPr>
+                  </pic:nvPicPr>
+                  <pic:blipFill>
+                    <a:blip r:embed="rId31" cstate="print">
+                      <a:extLst>
+                        <a:ext uri="{28A0092B-C50C-407E-A947-70E740481C1C}">
+                          <a14:useLocalDpi xmlns:a14="http://schemas.microsoft.com/office/drawing/2010/main" val="0"/>
+                        </a:ext>
+                      </a:extLst>
+                    </a:blip>
+                    <a:srcRect/>
+                    <a:stretch>
+                      <a:fillRect/>
+                    </a:stretch>
+                  </pic:blipFill>
+                  <pic:spPr bwMode="auto">
+                    <a:xfrm rot="5400000">
+                      <a:off x="0" y="0"/>
+                      <a:ext cx="5943600" cy="4458335"/>
+                    </a:xfrm>
+                    <a:prstGeom prst="rect">
+                      <a:avLst/>
+                    </a:prstGeom>
+                    <a:noFill/>
+                    <a:ln>
+                      <a:noFill/>
+                    </a:ln>
+                  </pic:spPr>
+                </pic:pic>
+              </a:graphicData>
+            </a:graphic>
+          </wp:inline>
+        </w:drawing>
+      </w:r>
+    </w:p>
+    <w:p/>
+    <w:p>
+      <w:r>
+        <w:t>Dry soil with plant</w:t>
+      </w:r>
+      <w:r>
+        <w:t xml:space="preserve"> (with tea bag, it makes it acidic)</w:t>
+      </w:r>
+      <w:r>
+        <w:t>:</w:t>
+      </w:r>
+    </w:p>
+    <w:p>
+      <w:r>
+        <w:drawing>
+          <wp:inline distT="0" distB="0" distL="0" distR="0" wp14:anchorId="5629D2AB" wp14:editId="5455B3B1">
+            <wp:extent cx="5943600" cy="1443990"/>
+            <wp:effectExtent l="0" t="0" r="0" b="3810"/>
+            <wp:docPr id="1399303184" name="Picture 1"/>
+            <wp:cNvGraphicFramePr>
+              <a:graphicFrameLocks xmlns:a="http://schemas.openxmlformats.org/drawingml/2006/main" noChangeAspect="1"/>
+            </wp:cNvGraphicFramePr>
+            <a:graphic xmlns:a="http://schemas.openxmlformats.org/drawingml/2006/main">
+              <a:graphicData uri="http://schemas.openxmlformats.org/drawingml/2006/picture">
+                <pic:pic xmlns:pic="http://schemas.openxmlformats.org/drawingml/2006/picture">
+                  <pic:nvPicPr>
+                    <pic:cNvPr id="1399303184" name=""/>
+                    <pic:cNvPicPr/>
+                  </pic:nvPicPr>
+                  <pic:blipFill>
+                    <a:blip r:embed="rId32"/>
+                    <a:stretch>
+                      <a:fillRect/>
+                    </a:stretch>
+                  </pic:blipFill>
+                  <pic:spPr>
+                    <a:xfrm>
+                      <a:off x="0" y="0"/>
+                      <a:ext cx="5943600" cy="1443990"/>
+                    </a:xfrm>
+                    <a:prstGeom prst="rect">
+                      <a:avLst/>
+                    </a:prstGeom>
+                  </pic:spPr>
+                </pic:pic>
+              </a:graphicData>
+            </a:graphic>
+          </wp:inline>
+        </w:drawing>
+      </w:r>
+    </w:p>
+    <w:p>
+      <w:r>
+        <w:rPr>
+          <w:noProof/>
+        </w:rPr>
+        <w:lastRenderedPageBreak/>
+        <w:drawing>
+          <wp:inline distT="0" distB="0" distL="0" distR="0" wp14:anchorId="465D2F69" wp14:editId="31550D77">
+            <wp:extent cx="2843988" cy="2132079"/>
+            <wp:effectExtent l="0" t="6033" r="7938" b="7937"/>
+            <wp:docPr id="68356660" name="Picture 6"/>
+            <wp:cNvGraphicFramePr>
+              <a:graphicFrameLocks xmlns:a="http://schemas.openxmlformats.org/drawingml/2006/main" noChangeAspect="1"/>
+            </wp:cNvGraphicFramePr>
+            <a:graphic xmlns:a="http://schemas.openxmlformats.org/drawingml/2006/main">
+              <a:graphicData uri="http://schemas.openxmlformats.org/drawingml/2006/picture">
+                <pic:pic xmlns:pic="http://schemas.openxmlformats.org/drawingml/2006/picture">
+                  <pic:nvPicPr>
+                    <pic:cNvPr id="0" name="Picture 6"/>
+                    <pic:cNvPicPr>
+                      <a:picLocks noChangeAspect="1" noChangeArrowheads="1"/>
+                    </pic:cNvPicPr>
+                  </pic:nvPicPr>
+                  <pic:blipFill>
+                    <a:blip r:embed="rId33" cstate="print">
+                      <a:extLst>
+                        <a:ext uri="{28A0092B-C50C-407E-A947-70E740481C1C}">
+                          <a14:useLocalDpi xmlns:a14="http://schemas.microsoft.com/office/drawing/2010/main" val="0"/>
+                        </a:ext>
+                      </a:extLst>
+                    </a:blip>
+                    <a:srcRect/>
+                    <a:stretch>
+                      <a:fillRect/>
+                    </a:stretch>
+                  </pic:blipFill>
+                  <pic:spPr bwMode="auto">
+                    <a:xfrm rot="5400000">
+                      <a:off x="0" y="0"/>
+                      <a:ext cx="2850475" cy="2136942"/>
+                    </a:xfrm>
+                    <a:prstGeom prst="rect">
+                      <a:avLst/>
+                    </a:prstGeom>
+                    <a:noFill/>
+                    <a:ln>
+                      <a:noFill/>
+                    </a:ln>
+                  </pic:spPr>
+                </pic:pic>
+              </a:graphicData>
+            </a:graphic>
+          </wp:inline>
+        </w:drawing>
+      </w:r>
+    </w:p>
+    <w:p>
+      <w:r>
+        <w:t>Result after it got wet:</w:t>
+      </w:r>
+    </w:p>
+    <w:p>
+      <w:r>
+        <w:drawing>
+          <wp:inline distT="0" distB="0" distL="0" distR="0" wp14:anchorId="72930DED" wp14:editId="167C76DB">
+            <wp:extent cx="5943600" cy="708660"/>
+            <wp:effectExtent l="0" t="0" r="0" b="0"/>
+            <wp:docPr id="2102865967" name="Picture 1"/>
+            <wp:cNvGraphicFramePr>
+              <a:graphicFrameLocks xmlns:a="http://schemas.openxmlformats.org/drawingml/2006/main" noChangeAspect="1"/>
+            </wp:cNvGraphicFramePr>
+            <a:graphic xmlns:a="http://schemas.openxmlformats.org/drawingml/2006/main">
+              <a:graphicData uri="http://schemas.openxmlformats.org/drawingml/2006/picture">
+                <pic:pic xmlns:pic="http://schemas.openxmlformats.org/drawingml/2006/picture">
+                  <pic:nvPicPr>
+                    <pic:cNvPr id="2102865967" name=""/>
+                    <pic:cNvPicPr/>
+                  </pic:nvPicPr>
+                  <pic:blipFill>
+                    <a:blip r:embed="rId34"/>
+                    <a:stretch>
+                      <a:fillRect/>
+                    </a:stretch>
+                  </pic:blipFill>
+                  <pic:spPr>
+                    <a:xfrm>
+                      <a:off x="0" y="0"/>
+                      <a:ext cx="5943600" cy="708660"/>
+                    </a:xfrm>
+                    <a:prstGeom prst="rect">
+                      <a:avLst/>
+                    </a:prstGeom>
+                  </pic:spPr>
+                </pic:pic>
+              </a:graphicData>
+            </a:graphic>
+          </wp:inline>
+        </w:drawing>
+      </w:r>
+    </w:p>
+    <w:p>
+      <w:r>
+        <w:rPr>
+          <w:noProof/>
+        </w:rPr>
+        <w:lastRenderedPageBreak/>
+        <w:drawing>
+          <wp:inline distT="0" distB="0" distL="0" distR="0" wp14:anchorId="44E286F6" wp14:editId="54F0B4CD">
+            <wp:extent cx="5943600" cy="4455795"/>
+            <wp:effectExtent l="952" t="0" r="953" b="952"/>
+            <wp:docPr id="1531503989" name="Picture 7"/>
+            <wp:cNvGraphicFramePr>
+              <a:graphicFrameLocks xmlns:a="http://schemas.openxmlformats.org/drawingml/2006/main" noChangeAspect="1"/>
+            </wp:cNvGraphicFramePr>
+            <a:graphic xmlns:a="http://schemas.openxmlformats.org/drawingml/2006/main">
+              <a:graphicData uri="http://schemas.openxmlformats.org/drawingml/2006/picture">
+                <pic:pic xmlns:pic="http://schemas.openxmlformats.org/drawingml/2006/picture">
+                  <pic:nvPicPr>
+                    <pic:cNvPr id="0" name="Picture 7"/>
+                    <pic:cNvPicPr>
+                      <a:picLocks noChangeAspect="1" noChangeArrowheads="1"/>
+                    </pic:cNvPicPr>
+                  </pic:nvPicPr>
+                  <pic:blipFill>
+                    <a:blip r:embed="rId35" cstate="print">
+                      <a:extLst>
+                        <a:ext uri="{28A0092B-C50C-407E-A947-70E740481C1C}">
+                          <a14:useLocalDpi xmlns:a14="http://schemas.microsoft.com/office/drawing/2010/main" val="0"/>
+                        </a:ext>
+                      </a:extLst>
+                    </a:blip>
+                    <a:srcRect/>
+                    <a:stretch>
+                      <a:fillRect/>
+                    </a:stretch>
+                  </pic:blipFill>
+                  <pic:spPr bwMode="auto">
+                    <a:xfrm rot="5400000">
+                      <a:off x="0" y="0"/>
+                      <a:ext cx="5943600" cy="4455795"/>
+                    </a:xfrm>
+                    <a:prstGeom prst="rect">
+                      <a:avLst/>
+                    </a:prstGeom>
+                    <a:noFill/>
+                    <a:ln>
+                      <a:noFill/>
+                    </a:ln>
+                  </pic:spPr>
+                </pic:pic>
+              </a:graphicData>
+            </a:graphic>
+          </wp:inline>
+        </w:drawing>
+      </w:r>
+    </w:p>
+    <w:p/>
+    <w:p/>
+    <w:p/>
+    <w:p/>
+    <w:p/>
+    <w:p/>
+    <w:p/>
+    <w:p/>
+    <w:p>
+      <w:pPr>
+        <w:rPr>
+          <w:b/>
+          <w:bCs/>
+          <w:sz w:val="44"/>
+          <w:szCs w:val="44"/>
+        </w:rPr>
+      </w:pPr>
+      <w:r>
+        <w:rPr>
+          <w:b/>
+          <w:bCs/>
+          <w:sz w:val="44"/>
+          <w:szCs w:val="44"/>
+        </w:rPr>
+        <w:t>Impression after soil test:</w:t>
+      </w:r>
+    </w:p>
+    <w:p>
+      <w:pPr>
+        <w:pStyle w:val="ListParagraph"/>
+        <w:numPr>
+          <w:ilvl w:val="0"/>
+          <w:numId w:val="1"/>
+        </w:numPr>
+        <w:rPr>
+          <w:sz w:val="22"/>
+          <w:szCs w:val="22"/>
+        </w:rPr>
+      </w:pPr>
+      <w:r>
+        <w:rPr>
+          <w:sz w:val="22"/>
+          <w:szCs w:val="22"/>
+        </w:rPr>
+        <w:t>temperature, moisture is kind of BS</w:t>
+      </w:r>
+    </w:p>
+    <w:p>
+      <w:pPr>
+        <w:pStyle w:val="ListParagraph"/>
+        <w:numPr>
+          <w:ilvl w:val="0"/>
+          <w:numId w:val="1"/>
+        </w:numPr>
+        <w:rPr>
+          <w:sz w:val="22"/>
+          <w:szCs w:val="22"/>
+        </w:rPr>
+      </w:pPr>
+      <w:r>
+        <w:rPr>
+          <w:sz w:val="22"/>
+          <w:szCs w:val="22"/>
+        </w:rPr>
+        <w:t>salinity lowest value is 700</w:t>
+      </w:r>
+    </w:p>
+    <w:p>
+      <w:pPr>
+        <w:pStyle w:val="ListParagraph"/>
+        <w:numPr>
+          <w:ilvl w:val="0"/>
+          <w:numId w:val="1"/>
+        </w:numPr>
+        <w:rPr>
+          <w:sz w:val="22"/>
+          <w:szCs w:val="22"/>
+        </w:rPr>
+      </w:pPr>
+      <w:r>
+        <w:rPr>
+          <w:sz w:val="22"/>
+          <w:szCs w:val="22"/>
+        </w:rPr>
+        <w:t>soil PH seems legit due to the acidic result of soil when it is infused with tea bags.</w:t>
+      </w:r>
+    </w:p>
+    <w:p>
+      <w:pPr>
+        <w:pStyle w:val="ListParagraph"/>
+        <w:numPr>
+          <w:ilvl w:val="0"/>
+          <w:numId w:val="1"/>
+        </w:numPr>
+        <w:rPr>
+          <w:sz w:val="22"/>
+          <w:szCs w:val="22"/>
+        </w:rPr>
+      </w:pPr>
+      <w:r>
+        <w:rPr>
+          <w:sz w:val="22"/>
+          <w:szCs w:val="22"/>
+        </w:rPr>
+        <w:t>soil with plants result in nutrients are considerably lower.</w:t>
+      </w:r>
+    </w:p>
+    <w:p>
+      <w:pPr>
+        <w:rPr>
+          <w:sz w:val="22"/>
+          <w:szCs w:val="22"/>
+        </w:rPr>
+      </w:pPr>
+    </w:p>
+    <w:p>
+      <w:pPr>
+        <w:rPr>
+          <w:b/>
+          <w:bCs/>
+          <w:sz w:val="32"/>
+          <w:szCs w:val="32"/>
+        </w:rPr>
+      </w:pPr>
+      <w:r>
+        <w:rPr>
+          <w:b/>
+          <w:bCs/>
+          <w:sz w:val="32"/>
+          <w:szCs w:val="32"/>
+        </w:rPr>
+        <w:t>Corrected code results:</w:t>
+      </w:r>
+    </w:p>
+    <w:p>
+      <w:pPr>
+        <w:rPr>
+          <w:sz w:val="22"/>
+          <w:szCs w:val="22"/>
+        </w:rPr>
+      </w:pPr>
+      <w:r>
+        <w:rPr>
+          <w:sz w:val="22"/>
+          <w:szCs w:val="22"/>
+        </w:rPr>
+        <w:t>Pin fully inserted:</w:t>
+      </w:r>
+    </w:p>
+    <w:p>
+      <w:pPr>
+        <w:rPr>
+          <w:sz w:val="22"/>
+          <w:szCs w:val="22"/>
+        </w:rPr>
+      </w:pPr>
+      <w:r>
+        <w:rPr>
+          <w:sz w:val="22"/>
+          <w:szCs w:val="22"/>
+        </w:rPr>
+        <w:drawing>
+          <wp:inline distT="0" distB="0" distL="0" distR="0" wp14:anchorId="47B2F7C7" wp14:editId="14E50316">
+            <wp:extent cx="5943600" cy="1231265"/>
+            <wp:effectExtent l="0" t="0" r="0" b="6985"/>
+            <wp:docPr id="1017696693" name="Picture 1"/>
+            <wp:cNvGraphicFramePr>
+              <a:graphicFrameLocks xmlns:a="http://schemas.openxmlformats.org/drawingml/2006/main" noChangeAspect="1"/>
+            </wp:cNvGraphicFramePr>
+            <a:graphic xmlns:a="http://schemas.openxmlformats.org/drawingml/2006/main">
+              <a:graphicData uri="http://schemas.openxmlformats.org/drawingml/2006/picture">
+                <pic:pic xmlns:pic="http://schemas.openxmlformats.org/drawingml/2006/picture">
+                  <pic:nvPicPr>
+                    <pic:cNvPr id="1017696693" name=""/>
+                    <pic:cNvPicPr/>
+                  </pic:nvPicPr>
+                  <pic:blipFill>
+                    <a:blip r:embed="rId36"/>
+                    <a:stretch>
+                      <a:fillRect/>
+                    </a:stretch>
+                  </pic:blipFill>
+                  <pic:spPr>
+                    <a:xfrm>
+                      <a:off x="0" y="0"/>
+                      <a:ext cx="5943600" cy="1231265"/>
+                    </a:xfrm>
+                    <a:prstGeom prst="rect">
+                      <a:avLst/>
+                    </a:prstGeom>
+                  </pic:spPr>
+                </pic:pic>
+              </a:graphicData>
+            </a:graphic>
+          </wp:inline>
+        </w:drawing>
+      </w:r>
+    </w:p>
+    <w:p>
+      <w:pPr>
+        <w:rPr>
+          <w:sz w:val="22"/>
+          <w:szCs w:val="22"/>
+        </w:rPr>
+      </w:pPr>
+      <w:r>
+        <w:rPr>
+          <w:sz w:val="22"/>
+          <w:szCs w:val="22"/>
+        </w:rPr>
+        <w:t>¾ inserted</w:t>
+      </w:r>
+    </w:p>
+    <w:p>
+      <w:pPr>
+        <w:rPr>
+          <w:sz w:val="22"/>
+          <w:szCs w:val="22"/>
+        </w:rPr>
+      </w:pPr>
+      <w:r>
+        <w:rPr>
+          <w:sz w:val="22"/>
+          <w:szCs w:val="22"/>
+        </w:rPr>
+        <w:drawing>
+          <wp:inline distT="0" distB="0" distL="0" distR="0" wp14:anchorId="30D69841" wp14:editId="34A9FB35">
+            <wp:extent cx="5943600" cy="1301115"/>
+            <wp:effectExtent l="0" t="0" r="0" b="0"/>
+            <wp:docPr id="2123095637" name="Picture 1"/>
+            <wp:cNvGraphicFramePr>
+              <a:graphicFrameLocks xmlns:a="http://schemas.openxmlformats.org/drawingml/2006/main" noChangeAspect="1"/>
+            </wp:cNvGraphicFramePr>
+            <a:graphic xmlns:a="http://schemas.openxmlformats.org/drawingml/2006/main">
+              <a:graphicData uri="http://schemas.openxmlformats.org/drawingml/2006/picture">
+                <pic:pic xmlns:pic="http://schemas.openxmlformats.org/drawingml/2006/picture">
+                  <pic:nvPicPr>
+                    <pic:cNvPr id="2123095637" name=""/>
+                    <pic:cNvPicPr/>
+                  </pic:nvPicPr>
+                  <pic:blipFill>
+                    <a:blip r:embed="rId37"/>
+                    <a:stretch>
+                      <a:fillRect/>
+                    </a:stretch>
+                  </pic:blipFill>
+                  <pic:spPr>
+                    <a:xfrm>
+                      <a:off x="0" y="0"/>
+                      <a:ext cx="5943600" cy="1301115"/>
+                    </a:xfrm>
+                    <a:prstGeom prst="rect">
+                      <a:avLst/>
+                    </a:prstGeom>
+                  </pic:spPr>
+                </pic:pic>
+              </a:graphicData>
+            </a:graphic>
+          </wp:inline>
+        </w:drawing>
+      </w:r>
+    </w:p>
+    <w:p>
+      <w:pPr>
+        <w:rPr>
+          <w:sz w:val="22"/>
+          <w:szCs w:val="22"/>
+        </w:rPr>
+      </w:pPr>
+      <w:r>
+        <w:rPr>
+          <w:sz w:val="22"/>
+          <w:szCs w:val="22"/>
+        </w:rPr>
+        <w:t>half inserted:</w:t>
+      </w:r>
+    </w:p>
+    <w:p>
+      <w:pPr>
+        <w:rPr>
+          <w:sz w:val="22"/>
+          <w:szCs w:val="22"/>
+        </w:rPr>
+      </w:pPr>
+      <w:r>
+        <w:rPr>
+          <w:sz w:val="22"/>
+          <w:szCs w:val="22"/>
+        </w:rPr>
+        <w:lastRenderedPageBreak/>
+        <w:drawing>
+          <wp:inline distT="0" distB="0" distL="0" distR="0" wp14:anchorId="27CBA201" wp14:editId="079521D7">
+            <wp:extent cx="5943600" cy="2262505"/>
+            <wp:effectExtent l="0" t="0" r="0" b="4445"/>
+            <wp:docPr id="1256038860" name="Picture 1"/>
+            <wp:cNvGraphicFramePr>
+              <a:graphicFrameLocks xmlns:a="http://schemas.openxmlformats.org/drawingml/2006/main" noChangeAspect="1"/>
+            </wp:cNvGraphicFramePr>
+            <a:graphic xmlns:a="http://schemas.openxmlformats.org/drawingml/2006/main">
+              <a:graphicData uri="http://schemas.openxmlformats.org/drawingml/2006/picture">
+                <pic:pic xmlns:pic="http://schemas.openxmlformats.org/drawingml/2006/picture">
+                  <pic:nvPicPr>
+                    <pic:cNvPr id="1256038860" name=""/>
+                    <pic:cNvPicPr/>
+                  </pic:nvPicPr>
+                  <pic:blipFill>
+                    <a:blip r:embed="rId38"/>
+                    <a:stretch>
+                      <a:fillRect/>
+                    </a:stretch>
+                  </pic:blipFill>
+                  <pic:spPr>
+                    <a:xfrm>
+                      <a:off x="0" y="0"/>
+                      <a:ext cx="5943600" cy="2262505"/>
+                    </a:xfrm>
+                    <a:prstGeom prst="rect">
+                      <a:avLst/>
+                    </a:prstGeom>
+                  </pic:spPr>
+                </pic:pic>
+              </a:graphicData>
+            </a:graphic>
+          </wp:inline>
+        </w:drawing>
+      </w:r>
+    </w:p>
+    <w:p>
+      <w:pPr>
+        <w:rPr>
+          <w:sz w:val="22"/>
+          <w:szCs w:val="22"/>
+        </w:rPr>
+      </w:pPr>
+      <w:r>
+        <w:rPr>
+          <w:sz w:val="22"/>
+          <w:szCs w:val="22"/>
+        </w:rPr>
+        <w:t>¼ inserted</w:t>
+      </w:r>
+    </w:p>
+    <w:p>
+      <w:pPr>
+        <w:rPr>
+          <w:sz w:val="22"/>
+          <w:szCs w:val="22"/>
+        </w:rPr>
+      </w:pPr>
+      <w:r>
+        <w:rPr>
+          <w:sz w:val="22"/>
+          <w:szCs w:val="22"/>
+        </w:rPr>
+        <w:drawing>
+          <wp:inline distT="0" distB="0" distL="0" distR="0" wp14:anchorId="29B3B912" wp14:editId="610BC330">
+            <wp:extent cx="5943600" cy="756285"/>
+            <wp:effectExtent l="0" t="0" r="0" b="5715"/>
+            <wp:docPr id="1222811294" name="Picture 1"/>
+            <wp:cNvGraphicFramePr>
+              <a:graphicFrameLocks xmlns:a="http://schemas.openxmlformats.org/drawingml/2006/main" noChangeAspect="1"/>
+            </wp:cNvGraphicFramePr>
+            <a:graphic xmlns:a="http://schemas.openxmlformats.org/drawingml/2006/main">
+              <a:graphicData uri="http://schemas.openxmlformats.org/drawingml/2006/picture">
+                <pic:pic xmlns:pic="http://schemas.openxmlformats.org/drawingml/2006/picture">
+                  <pic:nvPicPr>
+                    <pic:cNvPr id="1222811294" name=""/>
+                    <pic:cNvPicPr/>
+                  </pic:nvPicPr>
+                  <pic:blipFill>
+                    <a:blip r:embed="rId39"/>
+                    <a:stretch>
+                      <a:fillRect/>
+                    </a:stretch>
+                  </pic:blipFill>
+                  <pic:spPr>
+                    <a:xfrm>
+                      <a:off x="0" y="0"/>
+                      <a:ext cx="5943600" cy="756285"/>
+                    </a:xfrm>
+                    <a:prstGeom prst="rect">
+                      <a:avLst/>
+                    </a:prstGeom>
+                  </pic:spPr>
+                </pic:pic>
+              </a:graphicData>
+            </a:graphic>
+          </wp:inline>
+        </w:drawing>
+      </w:r>
+    </w:p>
+    <w:p>
+      <w:pPr>
+        <w:rPr>
+          <w:sz w:val="22"/>
+          <w:szCs w:val="22"/>
+        </w:rPr>
+      </w:pPr>
+      <w:r>
+        <w:rPr>
+          <w:sz w:val="22"/>
+          <w:szCs w:val="22"/>
+        </w:rPr>
+        <w:t>tip inserted:</w:t>
+      </w:r>
+    </w:p>
+    <w:p>
+      <w:pPr>
+        <w:rPr>
+          <w:sz w:val="22"/>
+          <w:szCs w:val="22"/>
+        </w:rPr>
+      </w:pPr>
+      <w:r>
+        <w:rPr>
+          <w:sz w:val="22"/>
+          <w:szCs w:val="22"/>
+        </w:rPr>
+        <w:drawing>
+          <wp:inline distT="0" distB="0" distL="0" distR="0" wp14:anchorId="124A3556" wp14:editId="6B6F90E3">
+            <wp:extent cx="5943600" cy="793750"/>
+            <wp:effectExtent l="0" t="0" r="0" b="6350"/>
+            <wp:docPr id="19003313" name="Picture 1"/>
+            <wp:cNvGraphicFramePr>
+              <a:graphicFrameLocks xmlns:a="http://schemas.openxmlformats.org/drawingml/2006/main" noChangeAspect="1"/>
+            </wp:cNvGraphicFramePr>
+            <a:graphic xmlns:a="http://schemas.openxmlformats.org/drawingml/2006/main">
+              <a:graphicData uri="http://schemas.openxmlformats.org/drawingml/2006/picture">
+                <pic:pic xmlns:pic="http://schemas.openxmlformats.org/drawingml/2006/picture">
+                  <pic:nvPicPr>
+                    <pic:cNvPr id="19003313" name=""/>
+                    <pic:cNvPicPr/>
+                  </pic:nvPicPr>
+                  <pic:blipFill>
+                    <a:blip r:embed="rId40"/>
+                    <a:stretch>
+                      <a:fillRect/>
+                    </a:stretch>
+                  </pic:blipFill>
+                  <pic:spPr>
+                    <a:xfrm>
+                      <a:off x="0" y="0"/>
+                      <a:ext cx="5943600" cy="793750"/>
+                    </a:xfrm>
+                    <a:prstGeom prst="rect">
+                      <a:avLst/>
+                    </a:prstGeom>
+                  </pic:spPr>
+                </pic:pic>
+              </a:graphicData>
+            </a:graphic>
+          </wp:inline>
+        </w:drawing>
+      </w:r>
+    </w:p>
+    <w:p>
+      <w:pPr>
+        <w:rPr>
+          <w:sz w:val="22"/>
+          <w:szCs w:val="22"/>
+        </w:rPr>
+      </w:pPr>
+    </w:p>
+    <w:p>
+      <w:pPr>
+        <w:rPr>
+          <w:sz w:val="22"/>
+          <w:szCs w:val="22"/>
+        </w:rPr>
+      </w:pPr>
+      <w:r>
+        <w:rPr>
+          <w:sz w:val="22"/>
+          <w:szCs w:val="22"/>
+        </w:rPr>
+        <w:t>Inserted in sand:</w:t>
+      </w:r>
+    </w:p>
+    <w:p>
+      <w:pPr>
+        <w:rPr>
+          <w:sz w:val="22"/>
+          <w:szCs w:val="22"/>
+        </w:rPr>
+      </w:pPr>
+      <w:r>
+        <w:rPr>
+          <w:sz w:val="22"/>
+          <w:szCs w:val="22"/>
+        </w:rPr>
+        <w:drawing>
+          <wp:inline distT="0" distB="0" distL="0" distR="0" wp14:anchorId="1F26E10B" wp14:editId="2738A812">
+            <wp:extent cx="5943600" cy="889000"/>
+            <wp:effectExtent l="0" t="0" r="0" b="6350"/>
+            <wp:docPr id="2070399905" name="Picture 1"/>
+            <wp:cNvGraphicFramePr>
+              <a:graphicFrameLocks xmlns:a="http://schemas.openxmlformats.org/drawingml/2006/main" noChangeAspect="1"/>
+            </wp:cNvGraphicFramePr>
+            <a:graphic xmlns:a="http://schemas.openxmlformats.org/drawingml/2006/main">
+              <a:graphicData uri="http://schemas.openxmlformats.org/drawingml/2006/picture">
+                <pic:pic xmlns:pic="http://schemas.openxmlformats.org/drawingml/2006/picture">
+                  <pic:nvPicPr>
+                    <pic:cNvPr id="2070399905" name=""/>
+                    <pic:cNvPicPr/>
+                  </pic:nvPicPr>
+                  <pic:blipFill>
+                    <a:blip r:embed="rId41"/>
+                    <a:stretch>
+                      <a:fillRect/>
+                    </a:stretch>
+                  </pic:blipFill>
+                  <pic:spPr>
+                    <a:xfrm>
+                      <a:off x="0" y="0"/>
+                      <a:ext cx="5943600" cy="889000"/>
+                    </a:xfrm>
+                    <a:prstGeom prst="rect">
+                      <a:avLst/>
+                    </a:prstGeom>
+                  </pic:spPr>
+                </pic:pic>
+              </a:graphicData>
+            </a:graphic>
+          </wp:inline>
+        </w:drawing>
+      </w:r>
+    </w:p>
+    <w:p>
+      <w:pPr>
+        <w:rPr>
+          <w:sz w:val="22"/>
+          <w:szCs w:val="22"/>
+        </w:rPr>
+      </w:pPr>
+      <w:r>
+        <w:rPr>
+          <w:sz w:val="22"/>
+          <w:szCs w:val="22"/>
+        </w:rPr>
+        <w:t>Fully inserted (including the black part) for 5 mins:</w:t>
+      </w:r>
+    </w:p>
+    <w:p>
+      <w:pPr>
+        <w:rPr>
+          <w:sz w:val="22"/>
+          <w:szCs w:val="22"/>
+        </w:rPr>
+      </w:pPr>
+      <w:r>
+        <w:rPr>
+          <w:sz w:val="22"/>
+          <w:szCs w:val="22"/>
+        </w:rPr>
+        <w:drawing>
+          <wp:inline distT="0" distB="0" distL="0" distR="0" wp14:anchorId="06F660B0" wp14:editId="7A58852F">
+            <wp:extent cx="5943600" cy="1440180"/>
+            <wp:effectExtent l="0" t="0" r="0" b="7620"/>
+            <wp:docPr id="1416303993" name="Picture 1"/>
+            <wp:cNvGraphicFramePr>
+              <a:graphicFrameLocks xmlns:a="http://schemas.openxmlformats.org/drawingml/2006/main" noChangeAspect="1"/>
+            </wp:cNvGraphicFramePr>
+            <a:graphic xmlns:a="http://schemas.openxmlformats.org/drawingml/2006/main">
+              <a:graphicData uri="http://schemas.openxmlformats.org/drawingml/2006/picture">
+                <pic:pic xmlns:pic="http://schemas.openxmlformats.org/drawingml/2006/picture">
+                  <pic:nvPicPr>
+                    <pic:cNvPr id="1416303993" name=""/>
+                    <pic:cNvPicPr/>
+                  </pic:nvPicPr>
+                  <pic:blipFill>
+                    <a:blip r:embed="rId42"/>
+                    <a:stretch>
+                      <a:fillRect/>
+                    </a:stretch>
+                  </pic:blipFill>
+                  <pic:spPr>
+                    <a:xfrm>
+                      <a:off x="0" y="0"/>
+                      <a:ext cx="5943600" cy="1440180"/>
+                    </a:xfrm>
+                    <a:prstGeom prst="rect">
+                      <a:avLst/>
+                    </a:prstGeom>
+                  </pic:spPr>
+                </pic:pic>
+              </a:graphicData>
+            </a:graphic>
+          </wp:inline>
+        </w:drawing>
+      </w:r>
+    </w:p>
+    <w:p>
+      <w:pPr>
+        <w:rPr>
+          <w:sz w:val="22"/>
+          <w:szCs w:val="22"/>
+        </w:rPr>
+      </w:pPr>
+    </w:p>
+    <w:p>
+      <w:pPr>
+        <w:rPr>
+          <w:sz w:val="22"/>
+          <w:szCs w:val="22"/>
+        </w:rPr>
+      </w:pPr>
+      <w:r>
+        <w:rPr>
+          <w:sz w:val="22"/>
+          <w:szCs w:val="22"/>
+        </w:rPr>
+        <w:t>dry soil with plant and tea bags:</w:t>
+      </w:r>
+    </w:p>
+    <w:p>
+      <w:pPr>
+        <w:rPr>
+          <w:sz w:val="22"/>
+          <w:szCs w:val="22"/>
+        </w:rPr>
+      </w:pPr>
+      <w:r>
+        <w:rPr>
+          <w:sz w:val="22"/>
+          <w:szCs w:val="22"/>
+        </w:rPr>
+        <w:drawing>
+          <wp:inline distT="0" distB="0" distL="0" distR="0" wp14:anchorId="5DEF09D4" wp14:editId="42784DD6">
+            <wp:extent cx="5943600" cy="840740"/>
+            <wp:effectExtent l="0" t="0" r="0" b="0"/>
+            <wp:docPr id="2108291838" name="Picture 1"/>
+            <wp:cNvGraphicFramePr>
+              <a:graphicFrameLocks xmlns:a="http://schemas.openxmlformats.org/drawingml/2006/main" noChangeAspect="1"/>
+            </wp:cNvGraphicFramePr>
+            <a:graphic xmlns:a="http://schemas.openxmlformats.org/drawingml/2006/main">
+              <a:graphicData uri="http://schemas.openxmlformats.org/drawingml/2006/picture">
+                <pic:pic xmlns:pic="http://schemas.openxmlformats.org/drawingml/2006/picture">
+                  <pic:nvPicPr>
+                    <pic:cNvPr id="2108291838" name=""/>
+                    <pic:cNvPicPr/>
+                  </pic:nvPicPr>
+                  <pic:blipFill>
+                    <a:blip r:embed="rId43"/>
+                    <a:stretch>
+                      <a:fillRect/>
+                    </a:stretch>
+                  </pic:blipFill>
+                  <pic:spPr>
+                    <a:xfrm>
+                      <a:off x="0" y="0"/>
+                      <a:ext cx="5943600" cy="840740"/>
+                    </a:xfrm>
+                    <a:prstGeom prst="rect">
+                      <a:avLst/>
+                    </a:prstGeom>
+                  </pic:spPr>
+                </pic:pic>
+              </a:graphicData>
+            </a:graphic>
+          </wp:inline>
+        </w:drawing>
+      </w:r>
+    </w:p>
+    <w:p>
+      <w:pPr>
+        <w:rPr>
+          <w:sz w:val="22"/>
+          <w:szCs w:val="22"/>
+        </w:rPr>
+      </w:pPr>
+      <w:r>
+        <w:rPr>
+          <w:sz w:val="22"/>
+          <w:szCs w:val="22"/>
+        </w:rPr>
+        <w:t>wet soil with plant:</w:t>
+      </w:r>
+    </w:p>
+    <w:p>
+      <w:pPr>
+        <w:rPr>
+          <w:sz w:val="22"/>
+          <w:szCs w:val="22"/>
+        </w:rPr>
+      </w:pPr>
+      <w:r>
+        <w:rPr>
+          <w:sz w:val="22"/>
+          <w:szCs w:val="22"/>
+        </w:rPr>
+        <w:drawing>
+          <wp:inline distT="0" distB="0" distL="0" distR="0" wp14:anchorId="51B88697" wp14:editId="2117704B">
+            <wp:extent cx="5943600" cy="783590"/>
+            <wp:effectExtent l="0" t="0" r="0" b="0"/>
+            <wp:docPr id="504113103" name="Picture 1"/>
+            <wp:cNvGraphicFramePr>
+              <a:graphicFrameLocks xmlns:a="http://schemas.openxmlformats.org/drawingml/2006/main" noChangeAspect="1"/>
+            </wp:cNvGraphicFramePr>
+            <a:graphic xmlns:a="http://schemas.openxmlformats.org/drawingml/2006/main">
+              <a:graphicData uri="http://schemas.openxmlformats.org/drawingml/2006/picture">
+                <pic:pic xmlns:pic="http://schemas.openxmlformats.org/drawingml/2006/picture">
+                  <pic:nvPicPr>
+                    <pic:cNvPr id="504113103" name=""/>
+                    <pic:cNvPicPr/>
+                  </pic:nvPicPr>
+                  <pic:blipFill>
+                    <a:blip r:embed="rId44"/>
+                    <a:stretch>
+                      <a:fillRect/>
+                    </a:stretch>
+                  </pic:blipFill>
+                  <pic:spPr>
+                    <a:xfrm>
+                      <a:off x="0" y="0"/>
+                      <a:ext cx="5943600" cy="783590"/>
+                    </a:xfrm>
+                    <a:prstGeom prst="rect">
+                      <a:avLst/>
+                    </a:prstGeom>
+                  </pic:spPr>
+                </pic:pic>
+              </a:graphicData>
+            </a:graphic>
+          </wp:inline>
+        </w:drawing>
+      </w:r>
+    </w:p>
+    <w:p>
+      <w:pPr>
+        <w:rPr>
+          <w:sz w:val="22"/>
+          <w:szCs w:val="22"/>
+        </w:rPr>
+      </w:pPr>
+    </w:p>
+    <w:p>
+      <w:pPr>
+        <w:rPr>
+          <w:sz w:val="22"/>
+          <w:szCs w:val="22"/>
+        </w:rPr>
+      </w:pPr>
+    </w:p>
+    <w:p>
+      <w:pPr>
+        <w:rPr>
+          <w:sz w:val="22"/>
+          <w:szCs w:val="22"/>
+        </w:rPr>
+      </w:pPr>
+      <w:r>
+        <w:rPr>
+          <w:sz w:val="22"/>
+          <w:szCs w:val="22"/>
+        </w:rPr>
+        <w:t>2 SENSORS together:</w:t>
+      </w:r>
+    </w:p>
+    <w:p>
+      <w:pPr>
+        <w:rPr>
+          <w:sz w:val="22"/>
+          <w:szCs w:val="22"/>
+        </w:rPr>
+      </w:pPr>
+      <w:r>
+        <w:rPr>
+          <w:sz w:val="22"/>
+          <w:szCs w:val="22"/>
+        </w:rPr>
+        <w:drawing>
+          <wp:inline distT="0" distB="0" distL="0" distR="0" wp14:anchorId="71F6BF55" wp14:editId="5DD35061">
+            <wp:extent cx="5943600" cy="895350"/>
+            <wp:effectExtent l="0" t="0" r="0" b="0"/>
+            <wp:docPr id="281584378" name="Picture 1"/>
+            <wp:cNvGraphicFramePr>
+              <a:graphicFrameLocks xmlns:a="http://schemas.openxmlformats.org/drawingml/2006/main" noChangeAspect="1"/>
+            </wp:cNvGraphicFramePr>
+            <a:graphic xmlns:a="http://schemas.openxmlformats.org/drawingml/2006/main">
+              <a:graphicData uri="http://schemas.openxmlformats.org/drawingml/2006/picture">
+                <pic:pic xmlns:pic="http://schemas.openxmlformats.org/drawingml/2006/picture">
+                  <pic:nvPicPr>
+                    <pic:cNvPr id="281584378" name=""/>
+                    <pic:cNvPicPr/>
+                  </pic:nvPicPr>
+                  <pic:blipFill>
+                    <a:blip r:embed="rId45"/>
+                    <a:stretch>
+                      <a:fillRect/>
+                    </a:stretch>
+                  </pic:blipFill>
+                  <pic:spPr>
+                    <a:xfrm>
+                      <a:off x="0" y="0"/>
+                      <a:ext cx="5943600" cy="895350"/>
+                    </a:xfrm>
+                    <a:prstGeom prst="rect">
+                      <a:avLst/>
+                    </a:prstGeom>
+                  </pic:spPr>
+                </pic:pic>
+              </a:graphicData>
+            </a:graphic>
+          </wp:inline>
+        </w:drawing>
+      </w:r>
+      <w:r>
+        <w:rPr>
+          <w:sz w:val="22"/>
+          <w:szCs w:val="22"/>
+        </w:rPr>
+        <w:drawing>
+          <wp:inline distT="0" distB="0" distL="0" distR="0" wp14:anchorId="35151298" wp14:editId="39569B1D">
+            <wp:extent cx="5943600" cy="873125"/>
+            <wp:effectExtent l="0" t="0" r="0" b="3175"/>
+            <wp:docPr id="548726024" name="Picture 1"/>
+            <wp:cNvGraphicFramePr>
+              <a:graphicFrameLocks xmlns:a="http://schemas.openxmlformats.org/drawingml/2006/main" noChangeAspect="1"/>
+            </wp:cNvGraphicFramePr>
+            <a:graphic xmlns:a="http://schemas.openxmlformats.org/drawingml/2006/main">
+              <a:graphicData uri="http://schemas.openxmlformats.org/drawingml/2006/picture">
+                <pic:pic xmlns:pic="http://schemas.openxmlformats.org/drawingml/2006/picture">
+                  <pic:nvPicPr>
+                    <pic:cNvPr id="548726024" name=""/>
+                    <pic:cNvPicPr/>
+                  </pic:nvPicPr>
+                  <pic:blipFill>
+                    <a:blip r:embed="rId46"/>
+                    <a:stretch>
+                      <a:fillRect/>
+                    </a:stretch>
+                  </pic:blipFill>
+                  <pic:spPr>
+                    <a:xfrm>
+                      <a:off x="0" y="0"/>
+                      <a:ext cx="5943600" cy="873125"/>
+                    </a:xfrm>
+                    <a:prstGeom prst="rect">
+                      <a:avLst/>
+                    </a:prstGeom>
+                  </pic:spPr>
+                </pic:pic>
+              </a:graphicData>
+            </a:graphic>
+          </wp:inline>
+        </w:drawing>
+      </w:r>
+    </w:p>
+    <w:p>
+      <w:pPr>
+        <w:rPr>
+          <w:sz w:val="22"/>
+          <w:szCs w:val="22"/>
+        </w:rPr>
+      </w:pPr>
+      <w:r>
+        <w:rPr>
+          <w:sz w:val="22"/>
+          <w:szCs w:val="22"/>
+        </w:rPr>
+        <w:t>Verdict: soil moisture sensor needs calibration, it gets to 100% easily.</w:t>
       </w:r>
     </w:p>
     <w:sectPr>
@@ -309,6 +2424,126 @@
     </w:sectPr>
   </w:body>
 </w:document>
+</file>
+
+<file path=word/numbering.xml><?xml version="1.0" encoding="utf-8"?>
+<w:numbering xmlns:wpc="http://schemas.microsoft.com/office/word/2010/wordprocessingCanvas" xmlns:cx="http://schemas.microsoft.com/office/drawing/2014/chartex" xmlns:cx1="http://schemas.microsoft.com/office/drawing/2015/9/8/chartex" xmlns:cx2="http://schemas.microsoft.com/office/drawing/2015/10/21/chartex" xmlns:cx3="http://schemas.microsoft.com/office/drawing/2016/5/9/chartex" xmlns:cx4="http://schemas.microsoft.com/office/drawing/2016/5/10/chartex" xmlns:cx5="http://schemas.microsoft.com/office/drawing/2016/5/11/chartex" xmlns:cx6="http://schemas.microsoft.com/office/drawing/2016/5/12/chartex" xmlns:cx7="http://schemas.microsoft.com/office/drawing/2016/5/13/chartex" xmlns:cx8="http://schemas.microsoft.com/office/drawing/2016/5/14/chartex" xmlns:mc="http://schemas.openxmlformats.org/markup-compatibility/2006" xmlns:aink="http://schemas.microsoft.com/office/drawing/2016/ink" xmlns:am3d="http://schemas.microsoft.com/office/drawing/2017/model3d" xmlns:o="urn:schemas-microsoft-com:office:office" xmlns:oel="http://schemas.microsoft.com/office/2019/extlst" xmlns:r="http://schemas.openxmlformats.org/officeDocument/2006/relationships" xmlns:m="http://schemas.openxmlformats.org/officeDocument/2006/math" xmlns:v="urn:schemas-microsoft-com:vml" xmlns:wp14="http://schemas.microsoft.com/office/word/2010/wordprocessingDrawing" xmlns:wp="http://schemas.openxmlformats.org/drawingml/2006/wordprocessingDrawing" xmlns:w10="urn:schemas-microsoft-com:office:word" xmlns:w="http://schemas.openxmlformats.org/wordprocessingml/2006/main" xmlns:w14="http://schemas.microsoft.com/office/word/2010/wordml" xmlns:w15="http://schemas.microsoft.com/office/word/2012/wordml" xmlns:w16cei="http://schemas.microsoft.com/office/word/2026/wordml/cei" xmlns:w16cex="http://schemas.microsoft.com/office/word/2018/wordml/cex" xmlns:w16cid="http://schemas.microsoft.com/office/word/2016/wordml/cid" xmlns:w16="http://schemas.microsoft.com/office/word/2018/wordml" xmlns:w16du="http://schemas.microsoft.com/office/word/2023/wordml/word16du" xmlns:w16sdtdh="http://schemas.microsoft.com/office/word/2020/wordml/sdtdatahash" xmlns:w16sdtfl="http://schemas.microsoft.com/office/word/2024/wordml/sdtformatlock" xmlns:w16se="http://schemas.microsoft.com/office/word/2015/wordml/symex" xmlns:wpg="http://schemas.microsoft.com/office/word/2010/wordprocessingGroup" xmlns:wpi="http://schemas.microsoft.com/office/word/2010/wordprocessingInk" xmlns:wne="http://schemas.microsoft.com/office/word/2006/wordml" xmlns:wps="http://schemas.microsoft.com/office/word/2010/wordprocessingShape" mc:Ignorable="w14 w15 w16se w16cid w16 w16cex w16sdtdh w16sdtfl w16du wp14">
+  <w:abstractNum w:abstractNumId="0" w15:restartNumberingAfterBreak="0">
+    <w:nsid w:val="65065F77"/>
+    <w:multiLevelType w:val="hybridMultilevel"/>
+    <w:tmpl w:val="0F72D102"/>
+    <w:lvl w:ilvl="0" w:tplc="C5BE944E">
+      <w:numFmt w:val="bullet"/>
+      <w:lvlText w:val="-"/>
+      <w:lvlJc w:val="left"/>
+      <w:pPr>
+        <w:ind w:left="720" w:hanging="360"/>
+      </w:pPr>
+      <w:rPr>
+        <w:rFonts w:ascii="Calibri" w:eastAsiaTheme="minorHAnsi" w:hAnsi="Calibri" w:cs="Calibri" w:hint="default"/>
+      </w:rPr>
+    </w:lvl>
+    <w:lvl w:ilvl="1" w:tplc="34090003" w:tentative="1">
+      <w:start w:val="1"/>
+      <w:numFmt w:val="bullet"/>
+      <w:lvlText w:val="o"/>
+      <w:lvlJc w:val="left"/>
+      <w:pPr>
+        <w:ind w:left="1440" w:hanging="360"/>
+      </w:pPr>
+      <w:rPr>
+        <w:rFonts w:ascii="Courier New" w:hAnsi="Courier New" w:cs="Courier New" w:hint="default"/>
+      </w:rPr>
+    </w:lvl>
+    <w:lvl w:ilvl="2" w:tplc="34090005" w:tentative="1">
+      <w:start w:val="1"/>
+      <w:numFmt w:val="bullet"/>
+      <w:lvlText w:val=""/>
+      <w:lvlJc w:val="left"/>
+      <w:pPr>
+        <w:ind w:left="2160" w:hanging="360"/>
+      </w:pPr>
+      <w:rPr>
+        <w:rFonts w:ascii="Wingdings" w:hAnsi="Wingdings" w:hint="default"/>
+      </w:rPr>
+    </w:lvl>
+    <w:lvl w:ilvl="3" w:tplc="34090001" w:tentative="1">
+      <w:start w:val="1"/>
+      <w:numFmt w:val="bullet"/>
+      <w:lvlText w:val=""/>
+      <w:lvlJc w:val="left"/>
+      <w:pPr>
+        <w:ind w:left="2880" w:hanging="360"/>
+      </w:pPr>
+      <w:rPr>
+        <w:rFonts w:ascii="Symbol" w:hAnsi="Symbol" w:hint="default"/>
+      </w:rPr>
+    </w:lvl>
+    <w:lvl w:ilvl="4" w:tplc="34090003" w:tentative="1">
+      <w:start w:val="1"/>
+      <w:numFmt w:val="bullet"/>
+      <w:lvlText w:val="o"/>
+      <w:lvlJc w:val="left"/>
+      <w:pPr>
+        <w:ind w:left="3600" w:hanging="360"/>
+      </w:pPr>
+      <w:rPr>
+        <w:rFonts w:ascii="Courier New" w:hAnsi="Courier New" w:cs="Courier New" w:hint="default"/>
+      </w:rPr>
+    </w:lvl>
+    <w:lvl w:ilvl="5" w:tplc="34090005" w:tentative="1">
+      <w:start w:val="1"/>
+      <w:numFmt w:val="bullet"/>
+      <w:lvlText w:val=""/>
+      <w:lvlJc w:val="left"/>
+      <w:pPr>
+        <w:ind w:left="4320" w:hanging="360"/>
+      </w:pPr>
+      <w:rPr>
+        <w:rFonts w:ascii="Wingdings" w:hAnsi="Wingdings" w:hint="default"/>
+      </w:rPr>
+    </w:lvl>
+    <w:lvl w:ilvl="6" w:tplc="34090001" w:tentative="1">
+      <w:start w:val="1"/>
+      <w:numFmt w:val="bullet"/>
+      <w:lvlText w:val=""/>
+      <w:lvlJc w:val="left"/>
+      <w:pPr>
+        <w:ind w:left="5040" w:hanging="360"/>
+      </w:pPr>
+      <w:rPr>
+        <w:rFonts w:ascii="Symbol" w:hAnsi="Symbol" w:hint="default"/>
+      </w:rPr>
+    </w:lvl>
+    <w:lvl w:ilvl="7" w:tplc="34090003" w:tentative="1">
+      <w:start w:val="1"/>
+      <w:numFmt w:val="bullet"/>
+      <w:lvlText w:val="o"/>
+      <w:lvlJc w:val="left"/>
+      <w:pPr>
+        <w:ind w:left="5760" w:hanging="360"/>
+      </w:pPr>
+      <w:rPr>
+        <w:rFonts w:ascii="Courier New" w:hAnsi="Courier New" w:cs="Courier New" w:hint="default"/>
+      </w:rPr>
+    </w:lvl>
+    <w:lvl w:ilvl="8" w:tplc="34090005" w:tentative="1">
+      <w:start w:val="1"/>
+      <w:numFmt w:val="bullet"/>
+      <w:lvlText w:val=""/>
+      <w:lvlJc w:val="left"/>
+      <w:pPr>
+        <w:ind w:left="6480" w:hanging="360"/>
+      </w:pPr>
+      <w:rPr>
+        <w:rFonts w:ascii="Wingdings" w:hAnsi="Wingdings" w:hint="default"/>
+      </w:rPr>
+    </w:lvl>
+  </w:abstractNum>
+  <w:num w:numId="1" w16cid:durableId="170995013">
+    <w:abstractNumId w:val="0"/>
+  </w:num>
+</w:numbering>
 </file>
 
 <file path=word/styles.xml><?xml version="1.0" encoding="utf-8"?>

</xml_diff>

<commit_message>
Add GPS doc; update soil sensor unit tests
Adds a new docs/GPS Test.docx and updates docs/Unit test for soil sensors.docx. Updates ESP32 2-pin soil sensor sketch: adjusts calibration values (dry=3300, wet=500), sets 12-bit ADC resolution, simplifies mapping/printing and bounds moisture percent. Extends Yago Arduino Uno sketch by appending a commented PH calibration and Modbus-reading implementation (two-point calibration, CRC, register parsing and formatted output). Also fixes file endings/formatting.
</commit_message>
<xml_diff>
--- a/docs/Unit test for soil sensors.docx
+++ b/docs/Unit test for soil sensors.docx
@@ -4,7 +4,15 @@
   <w:body>
     <w:p>
       <w:r>
-        <w:t>2 pin moisture sensor</w:t>
+        <w:t xml:space="preserve">2 pin moisture </w:t>
+      </w:r>
+      <w:proofErr w:type="gramStart"/>
+      <w:r>
+        <w:t>sensor</w:t>
+      </w:r>
+      <w:proofErr w:type="gramEnd"/>
+      <w:r>
+        <w:t xml:space="preserve"> (needs calibration)</w:t>
       </w:r>
     </w:p>
     <w:p/>
@@ -138,6 +146,7 @@
       <w:r>
         <w:rPr>
           <w:bCs/>
+          <w:noProof/>
         </w:rPr>
         <w:drawing>
           <wp:inline distT="0" distB="0" distL="0" distR="0" wp14:anchorId="5B7B6886" wp14:editId="651CB11E">
@@ -183,6 +192,9 @@
     </w:p>
     <w:p>
       <w:r>
+        <w:rPr>
+          <w:noProof/>
+        </w:rPr>
         <w:drawing>
           <wp:inline distT="0" distB="0" distL="0" distR="0" wp14:anchorId="16A2C424" wp14:editId="3B820205">
             <wp:extent cx="5943600" cy="868680"/>
@@ -227,6 +239,9 @@
     </w:p>
     <w:p>
       <w:r>
+        <w:rPr>
+          <w:noProof/>
+        </w:rPr>
         <w:drawing>
           <wp:inline distT="0" distB="0" distL="0" distR="0" wp14:anchorId="7411359D" wp14:editId="71057A02">
             <wp:extent cx="5943600" cy="781685"/>
@@ -271,6 +286,9 @@
     </w:p>
     <w:p>
       <w:r>
+        <w:rPr>
+          <w:noProof/>
+        </w:rPr>
         <w:drawing>
           <wp:inline distT="0" distB="0" distL="0" distR="0" wp14:anchorId="2D617CF7" wp14:editId="25C0EC06">
             <wp:extent cx="5943600" cy="802005"/>
@@ -315,6 +333,9 @@
     </w:p>
     <w:p>
       <w:r>
+        <w:rPr>
+          <w:noProof/>
+        </w:rPr>
         <w:drawing>
           <wp:inline distT="0" distB="0" distL="0" distR="0" wp14:anchorId="3B0D3F21" wp14:editId="65862D25">
             <wp:extent cx="5943600" cy="594995"/>
@@ -354,6 +375,9 @@
     </w:p>
     <w:p>
       <w:r>
+        <w:rPr>
+          <w:noProof/>
+        </w:rPr>
         <w:lastRenderedPageBreak/>
         <w:drawing>
           <wp:inline distT="0" distB="0" distL="0" distR="0" wp14:anchorId="076BC2B1" wp14:editId="7DAC9AD1">
@@ -584,15 +608,2880 @@
     </w:p>
     <w:p>
       <w:r>
-        <w:t>Source code: embedded/soil sensor unit test/YagoArduinoUno</w:t>
-      </w:r>
-    </w:p>
-    <w:p>
-      <w:r>
-        <w:t>Initial test impression (without inserting in soil): Soil moisture is kind of BS. Stuck in 29%. Temperature is accurate, compares well with thermometer.</w:t>
+        <w:t>Source code: embedded/soil sensor unit test/</w:t>
+      </w:r>
+      <w:proofErr w:type="spellStart"/>
+      <w:r>
+        <w:t>YagoArduinoUno</w:t>
+      </w:r>
+      <w:proofErr w:type="spellEnd"/>
+    </w:p>
+    <w:p>
+      <w:pPr>
+        <w:rPr>
+          <w:sz w:val="22"/>
+          <w:szCs w:val="22"/>
+        </w:rPr>
+      </w:pPr>
+      <w:r>
+        <w:rPr>
+          <w:sz w:val="22"/>
+          <w:szCs w:val="22"/>
+        </w:rPr>
+        <w:t>Soil without plant</w:t>
+      </w:r>
+    </w:p>
+    <w:tbl>
+      <w:tblPr>
+        <w:tblStyle w:val="TableGrid"/>
+        <w:tblW w:w="0" w:type="auto"/>
+        <w:tblLook w:val="04A0" w:firstRow="1" w:lastRow="0" w:firstColumn="1" w:lastColumn="0" w:noHBand="0" w:noVBand="1"/>
+      </w:tblPr>
+      <w:tblGrid>
+        <w:gridCol w:w="1386"/>
+        <w:gridCol w:w="1459"/>
+        <w:gridCol w:w="1228"/>
+        <w:gridCol w:w="1262"/>
+        <w:gridCol w:w="1262"/>
+        <w:gridCol w:w="1107"/>
+        <w:gridCol w:w="1107"/>
+      </w:tblGrid>
+      <w:tr>
+        <w:tc>
+          <w:tcPr>
+            <w:tcW w:w="1386" w:type="dxa"/>
+            <w:vAlign w:val="center"/>
+          </w:tcPr>
+          <w:p>
+            <w:pPr>
+              <w:rPr>
+                <w:rFonts w:cstheme="minorHAnsi"/>
+                <w:sz w:val="22"/>
+                <w:szCs w:val="22"/>
+              </w:rPr>
+            </w:pPr>
+            <w:r>
+              <w:rPr>
+                <w:rStyle w:val="Strong"/>
+                <w:rFonts w:cstheme="minorHAnsi"/>
+                <w:sz w:val="22"/>
+                <w:szCs w:val="22"/>
+              </w:rPr>
+              <w:t>Parameter</w:t>
+            </w:r>
+          </w:p>
+        </w:tc>
+        <w:tc>
+          <w:tcPr>
+            <w:tcW w:w="1459" w:type="dxa"/>
+            <w:vAlign w:val="center"/>
+          </w:tcPr>
+          <w:p>
+            <w:pPr>
+              <w:rPr>
+                <w:rFonts w:cstheme="minorHAnsi"/>
+                <w:sz w:val="22"/>
+                <w:szCs w:val="22"/>
+              </w:rPr>
+            </w:pPr>
+            <w:r>
+              <w:rPr>
+                <w:rStyle w:val="Strong"/>
+                <w:rFonts w:cstheme="minorHAnsi"/>
+                <w:sz w:val="22"/>
+                <w:szCs w:val="22"/>
+              </w:rPr>
+              <w:t>Pin Fully Inserted</w:t>
+            </w:r>
+          </w:p>
+        </w:tc>
+        <w:tc>
+          <w:tcPr>
+            <w:tcW w:w="1228" w:type="dxa"/>
+            <w:vAlign w:val="center"/>
+          </w:tcPr>
+          <w:p>
+            <w:pPr>
+              <w:rPr>
+                <w:rFonts w:cstheme="minorHAnsi"/>
+                <w:sz w:val="22"/>
+                <w:szCs w:val="22"/>
+              </w:rPr>
+            </w:pPr>
+            <w:r>
+              <w:rPr>
+                <w:rStyle w:val="Strong"/>
+                <w:rFonts w:cstheme="minorHAnsi"/>
+                <w:sz w:val="22"/>
+                <w:szCs w:val="22"/>
+              </w:rPr>
+              <w:t>¾ Inserted</w:t>
+            </w:r>
+          </w:p>
+        </w:tc>
+        <w:tc>
+          <w:tcPr>
+            <w:tcW w:w="1262" w:type="dxa"/>
+            <w:vAlign w:val="center"/>
+          </w:tcPr>
+          <w:p>
+            <w:pPr>
+              <w:rPr>
+                <w:rFonts w:cstheme="minorHAnsi"/>
+                <w:sz w:val="22"/>
+                <w:szCs w:val="22"/>
+              </w:rPr>
+            </w:pPr>
+            <w:r>
+              <w:rPr>
+                <w:rStyle w:val="Strong"/>
+                <w:rFonts w:cstheme="minorHAnsi"/>
+                <w:sz w:val="22"/>
+                <w:szCs w:val="22"/>
+              </w:rPr>
+              <w:t>Half Inserted</w:t>
+            </w:r>
+          </w:p>
+        </w:tc>
+        <w:tc>
+          <w:tcPr>
+            <w:tcW w:w="1262" w:type="dxa"/>
+            <w:vAlign w:val="center"/>
+          </w:tcPr>
+          <w:p>
+            <w:pPr>
+              <w:rPr>
+                <w:rFonts w:cstheme="minorHAnsi"/>
+                <w:sz w:val="22"/>
+                <w:szCs w:val="22"/>
+              </w:rPr>
+            </w:pPr>
+            <w:r>
+              <w:rPr>
+                <w:rStyle w:val="Strong"/>
+                <w:rFonts w:cstheme="minorHAnsi"/>
+                <w:sz w:val="22"/>
+                <w:szCs w:val="22"/>
+              </w:rPr>
+              <w:t>¼ Inserted</w:t>
+            </w:r>
+          </w:p>
+        </w:tc>
+        <w:tc>
+          <w:tcPr>
+            <w:tcW w:w="1107" w:type="dxa"/>
+            <w:vAlign w:val="center"/>
+          </w:tcPr>
+          <w:p>
+            <w:pPr>
+              <w:rPr>
+                <w:sz w:val="22"/>
+                <w:szCs w:val="22"/>
+              </w:rPr>
+            </w:pPr>
+            <w:r>
+              <w:rPr>
+                <w:rStyle w:val="Strong"/>
+                <w:rFonts w:cstheme="minorHAnsi"/>
+                <w:sz w:val="22"/>
+                <w:szCs w:val="22"/>
+              </w:rPr>
+              <w:t>Tip inserted</w:t>
+            </w:r>
+          </w:p>
+        </w:tc>
+        <w:tc>
+          <w:tcPr>
+            <w:tcW w:w="1107" w:type="dxa"/>
+          </w:tcPr>
+          <w:p>
+            <w:pPr>
+              <w:rPr>
+                <w:rStyle w:val="Strong"/>
+                <w:rFonts w:cstheme="minorHAnsi"/>
+                <w:sz w:val="22"/>
+                <w:szCs w:val="22"/>
+              </w:rPr>
+            </w:pPr>
+            <w:r>
+              <w:rPr>
+                <w:rStyle w:val="Strong"/>
+                <w:rFonts w:cstheme="minorHAnsi"/>
+                <w:sz w:val="22"/>
+                <w:szCs w:val="22"/>
+              </w:rPr>
+              <w:t xml:space="preserve">Device fully inserted </w:t>
+            </w:r>
+            <w:r>
+              <w:rPr>
+                <w:rStyle w:val="Strong"/>
+              </w:rPr>
+              <w:t>(5 mins)</w:t>
+            </w:r>
+          </w:p>
+        </w:tc>
+      </w:tr>
+      <w:tr>
+        <w:tc>
+          <w:tcPr>
+            <w:tcW w:w="1386" w:type="dxa"/>
+            <w:vAlign w:val="center"/>
+          </w:tcPr>
+          <w:p>
+            <w:pPr>
+              <w:rPr>
+                <w:rFonts w:cstheme="minorHAnsi"/>
+                <w:sz w:val="22"/>
+                <w:szCs w:val="22"/>
+              </w:rPr>
+            </w:pPr>
+            <w:r>
+              <w:rPr>
+                <w:rFonts w:cstheme="minorHAnsi"/>
+                <w:b/>
+                <w:bCs/>
+                <w:sz w:val="22"/>
+                <w:szCs w:val="22"/>
+              </w:rPr>
+              <w:t>Temperature</w:t>
+            </w:r>
+          </w:p>
+        </w:tc>
+        <w:tc>
+          <w:tcPr>
+            <w:tcW w:w="1459" w:type="dxa"/>
+            <w:vAlign w:val="center"/>
+          </w:tcPr>
+          <w:p>
+            <w:pPr>
+              <w:rPr>
+                <w:rFonts w:cstheme="minorHAnsi"/>
+                <w:sz w:val="22"/>
+                <w:szCs w:val="22"/>
+              </w:rPr>
+            </w:pPr>
+            <w:r>
+              <w:rPr>
+                <w:rFonts w:cstheme="minorHAnsi"/>
+                <w:sz w:val="22"/>
+                <w:szCs w:val="22"/>
+              </w:rPr>
+              <w:t>31.7 °C</w:t>
+            </w:r>
+          </w:p>
+        </w:tc>
+        <w:tc>
+          <w:tcPr>
+            <w:tcW w:w="1228" w:type="dxa"/>
+            <w:vAlign w:val="center"/>
+          </w:tcPr>
+          <w:p>
+            <w:pPr>
+              <w:rPr>
+                <w:rFonts w:cstheme="minorHAnsi"/>
+                <w:sz w:val="22"/>
+                <w:szCs w:val="22"/>
+              </w:rPr>
+            </w:pPr>
+            <w:r>
+              <w:rPr>
+                <w:rFonts w:cstheme="minorHAnsi"/>
+                <w:sz w:val="22"/>
+                <w:szCs w:val="22"/>
+              </w:rPr>
+              <w:t>31.5 °C</w:t>
+            </w:r>
+          </w:p>
+        </w:tc>
+        <w:tc>
+          <w:tcPr>
+            <w:tcW w:w="1262" w:type="dxa"/>
+            <w:vAlign w:val="center"/>
+          </w:tcPr>
+          <w:p>
+            <w:pPr>
+              <w:rPr>
+                <w:rFonts w:cstheme="minorHAnsi"/>
+                <w:sz w:val="22"/>
+                <w:szCs w:val="22"/>
+              </w:rPr>
+            </w:pPr>
+            <w:r>
+              <w:rPr>
+                <w:rFonts w:cstheme="minorHAnsi"/>
+                <w:sz w:val="22"/>
+                <w:szCs w:val="22"/>
+              </w:rPr>
+              <w:t>31.4 °C</w:t>
+            </w:r>
+          </w:p>
+        </w:tc>
+        <w:tc>
+          <w:tcPr>
+            <w:tcW w:w="1262" w:type="dxa"/>
+            <w:vAlign w:val="center"/>
+          </w:tcPr>
+          <w:p>
+            <w:pPr>
+              <w:rPr>
+                <w:rFonts w:cstheme="minorHAnsi"/>
+                <w:sz w:val="22"/>
+                <w:szCs w:val="22"/>
+              </w:rPr>
+            </w:pPr>
+            <w:r>
+              <w:rPr>
+                <w:rFonts w:cstheme="minorHAnsi"/>
+                <w:sz w:val="22"/>
+                <w:szCs w:val="22"/>
+              </w:rPr>
+              <w:t>31.2 °C</w:t>
+            </w:r>
+          </w:p>
+        </w:tc>
+        <w:tc>
+          <w:tcPr>
+            <w:tcW w:w="1107" w:type="dxa"/>
+            <w:vAlign w:val="center"/>
+          </w:tcPr>
+          <w:p>
+            <w:pPr>
+              <w:rPr>
+                <w:sz w:val="22"/>
+                <w:szCs w:val="22"/>
+              </w:rPr>
+            </w:pPr>
+            <w:r>
+              <w:rPr>
+                <w:rFonts w:cstheme="minorHAnsi"/>
+                <w:sz w:val="22"/>
+                <w:szCs w:val="22"/>
+              </w:rPr>
+              <w:t>31.</w:t>
+            </w:r>
+            <w:r>
+              <w:rPr>
+                <w:rFonts w:cstheme="minorHAnsi"/>
+                <w:sz w:val="22"/>
+                <w:szCs w:val="22"/>
+              </w:rPr>
+              <w:t>0</w:t>
+            </w:r>
+            <w:r>
+              <w:rPr>
+                <w:rFonts w:cstheme="minorHAnsi"/>
+                <w:sz w:val="22"/>
+                <w:szCs w:val="22"/>
+              </w:rPr>
+              <w:t xml:space="preserve"> °C</w:t>
+            </w:r>
+          </w:p>
+        </w:tc>
+        <w:tc>
+          <w:tcPr>
+            <w:tcW w:w="1107" w:type="dxa"/>
+            <w:vAlign w:val="center"/>
+          </w:tcPr>
+          <w:p>
+            <w:pPr>
+              <w:rPr>
+                <w:rFonts w:cstheme="minorHAnsi"/>
+                <w:sz w:val="22"/>
+                <w:szCs w:val="22"/>
+              </w:rPr>
+            </w:pPr>
+            <w:r>
+              <w:rPr>
+                <w:rFonts w:cstheme="minorHAnsi"/>
+                <w:sz w:val="22"/>
+                <w:szCs w:val="22"/>
+              </w:rPr>
+              <w:t>29.9</w:t>
+            </w:r>
+            <w:r>
+              <w:rPr>
+                <w:rFonts w:cstheme="minorHAnsi"/>
+                <w:sz w:val="22"/>
+                <w:szCs w:val="22"/>
+              </w:rPr>
+              <w:t xml:space="preserve"> °C</w:t>
+            </w:r>
+          </w:p>
+        </w:tc>
+      </w:tr>
+      <w:tr>
+        <w:tc>
+          <w:tcPr>
+            <w:tcW w:w="1386" w:type="dxa"/>
+            <w:vAlign w:val="center"/>
+          </w:tcPr>
+          <w:p>
+            <w:pPr>
+              <w:rPr>
+                <w:rFonts w:cstheme="minorHAnsi"/>
+                <w:sz w:val="22"/>
+                <w:szCs w:val="22"/>
+              </w:rPr>
+            </w:pPr>
+            <w:r>
+              <w:rPr>
+                <w:rFonts w:cstheme="minorHAnsi"/>
+                <w:b/>
+                <w:bCs/>
+                <w:sz w:val="22"/>
+                <w:szCs w:val="22"/>
+              </w:rPr>
+              <w:t>Moisture</w:t>
+            </w:r>
+          </w:p>
+        </w:tc>
+        <w:tc>
+          <w:tcPr>
+            <w:tcW w:w="1459" w:type="dxa"/>
+            <w:vAlign w:val="center"/>
+          </w:tcPr>
+          <w:p>
+            <w:pPr>
+              <w:rPr>
+                <w:rFonts w:cstheme="minorHAnsi"/>
+                <w:sz w:val="22"/>
+                <w:szCs w:val="22"/>
+              </w:rPr>
+            </w:pPr>
+            <w:r>
+              <w:rPr>
+                <w:rFonts w:cstheme="minorHAnsi"/>
+                <w:sz w:val="22"/>
+                <w:szCs w:val="22"/>
+              </w:rPr>
+              <w:t>39.5 %</w:t>
+            </w:r>
+          </w:p>
+        </w:tc>
+        <w:tc>
+          <w:tcPr>
+            <w:tcW w:w="1228" w:type="dxa"/>
+            <w:vAlign w:val="center"/>
+          </w:tcPr>
+          <w:p>
+            <w:pPr>
+              <w:rPr>
+                <w:rFonts w:cstheme="minorHAnsi"/>
+                <w:sz w:val="22"/>
+                <w:szCs w:val="22"/>
+              </w:rPr>
+            </w:pPr>
+            <w:r>
+              <w:rPr>
+                <w:rFonts w:cstheme="minorHAnsi"/>
+                <w:sz w:val="22"/>
+                <w:szCs w:val="22"/>
+              </w:rPr>
+              <w:t>30.6 %</w:t>
+            </w:r>
+          </w:p>
+        </w:tc>
+        <w:tc>
+          <w:tcPr>
+            <w:tcW w:w="1262" w:type="dxa"/>
+            <w:vAlign w:val="center"/>
+          </w:tcPr>
+          <w:p>
+            <w:pPr>
+              <w:rPr>
+                <w:rFonts w:cstheme="minorHAnsi"/>
+                <w:sz w:val="22"/>
+                <w:szCs w:val="22"/>
+              </w:rPr>
+            </w:pPr>
+            <w:r>
+              <w:rPr>
+                <w:rFonts w:cstheme="minorHAnsi"/>
+                <w:sz w:val="22"/>
+                <w:szCs w:val="22"/>
+              </w:rPr>
+              <w:t>30.8 %</w:t>
+            </w:r>
+          </w:p>
+        </w:tc>
+        <w:tc>
+          <w:tcPr>
+            <w:tcW w:w="1262" w:type="dxa"/>
+            <w:vAlign w:val="center"/>
+          </w:tcPr>
+          <w:p>
+            <w:pPr>
+              <w:rPr>
+                <w:rFonts w:cstheme="minorHAnsi"/>
+                <w:sz w:val="22"/>
+                <w:szCs w:val="22"/>
+              </w:rPr>
+            </w:pPr>
+            <w:r>
+              <w:rPr>
+                <w:rFonts w:cstheme="minorHAnsi"/>
+                <w:sz w:val="22"/>
+                <w:szCs w:val="22"/>
+              </w:rPr>
+              <w:t>13.2 %</w:t>
+            </w:r>
+          </w:p>
+        </w:tc>
+        <w:tc>
+          <w:tcPr>
+            <w:tcW w:w="1107" w:type="dxa"/>
+            <w:vAlign w:val="center"/>
+          </w:tcPr>
+          <w:p>
+            <w:pPr>
+              <w:rPr>
+                <w:sz w:val="22"/>
+                <w:szCs w:val="22"/>
+              </w:rPr>
+            </w:pPr>
+            <w:r>
+              <w:rPr>
+                <w:rFonts w:cstheme="minorHAnsi"/>
+                <w:sz w:val="22"/>
+                <w:szCs w:val="22"/>
+              </w:rPr>
+              <w:t>4.0</w:t>
+            </w:r>
+            <w:r>
+              <w:rPr>
+                <w:rFonts w:cstheme="minorHAnsi"/>
+                <w:sz w:val="22"/>
+                <w:szCs w:val="22"/>
+              </w:rPr>
+              <w:t xml:space="preserve"> %</w:t>
+            </w:r>
+          </w:p>
+        </w:tc>
+        <w:tc>
+          <w:tcPr>
+            <w:tcW w:w="1107" w:type="dxa"/>
+            <w:vAlign w:val="center"/>
+          </w:tcPr>
+          <w:p>
+            <w:pPr>
+              <w:rPr>
+                <w:rFonts w:cstheme="minorHAnsi"/>
+                <w:sz w:val="22"/>
+                <w:szCs w:val="22"/>
+              </w:rPr>
+            </w:pPr>
+            <w:r>
+              <w:rPr>
+                <w:rFonts w:cstheme="minorHAnsi"/>
+                <w:sz w:val="22"/>
+                <w:szCs w:val="22"/>
+              </w:rPr>
+              <w:t>39.8</w:t>
+            </w:r>
+            <w:r>
+              <w:rPr>
+                <w:rFonts w:cstheme="minorHAnsi"/>
+                <w:sz w:val="22"/>
+                <w:szCs w:val="22"/>
+              </w:rPr>
+              <w:t xml:space="preserve"> %</w:t>
+            </w:r>
+          </w:p>
+        </w:tc>
+      </w:tr>
+      <w:tr>
+        <w:tc>
+          <w:tcPr>
+            <w:tcW w:w="1386" w:type="dxa"/>
+            <w:vAlign w:val="center"/>
+          </w:tcPr>
+          <w:p>
+            <w:pPr>
+              <w:rPr>
+                <w:rFonts w:cstheme="minorHAnsi"/>
+                <w:sz w:val="22"/>
+                <w:szCs w:val="22"/>
+              </w:rPr>
+            </w:pPr>
+            <w:r>
+              <w:rPr>
+                <w:rFonts w:cstheme="minorHAnsi"/>
+                <w:b/>
+                <w:bCs/>
+                <w:sz w:val="22"/>
+                <w:szCs w:val="22"/>
+              </w:rPr>
+              <w:t>Conductivity (EC)</w:t>
+            </w:r>
+          </w:p>
+        </w:tc>
+        <w:tc>
+          <w:tcPr>
+            <w:tcW w:w="1459" w:type="dxa"/>
+            <w:vAlign w:val="center"/>
+          </w:tcPr>
+          <w:p>
+            <w:pPr>
+              <w:rPr>
+                <w:rFonts w:cstheme="minorHAnsi"/>
+                <w:sz w:val="22"/>
+                <w:szCs w:val="22"/>
+              </w:rPr>
+            </w:pPr>
+            <w:r>
+              <w:rPr>
+                <w:rFonts w:cstheme="minorHAnsi"/>
+                <w:sz w:val="22"/>
+                <w:szCs w:val="22"/>
+              </w:rPr>
+              <w:t>125 µs/cm</w:t>
+            </w:r>
+          </w:p>
+        </w:tc>
+        <w:tc>
+          <w:tcPr>
+            <w:tcW w:w="1228" w:type="dxa"/>
+            <w:vAlign w:val="center"/>
+          </w:tcPr>
+          <w:p>
+            <w:pPr>
+              <w:rPr>
+                <w:rFonts w:cstheme="minorHAnsi"/>
+                <w:sz w:val="22"/>
+                <w:szCs w:val="22"/>
+              </w:rPr>
+            </w:pPr>
+            <w:r>
+              <w:rPr>
+                <w:rFonts w:cstheme="minorHAnsi"/>
+                <w:sz w:val="22"/>
+                <w:szCs w:val="22"/>
+              </w:rPr>
+              <w:t>95 µs/cm</w:t>
+            </w:r>
+          </w:p>
+        </w:tc>
+        <w:tc>
+          <w:tcPr>
+            <w:tcW w:w="1262" w:type="dxa"/>
+            <w:vAlign w:val="center"/>
+          </w:tcPr>
+          <w:p>
+            <w:pPr>
+              <w:rPr>
+                <w:rFonts w:cstheme="minorHAnsi"/>
+                <w:sz w:val="22"/>
+                <w:szCs w:val="22"/>
+              </w:rPr>
+            </w:pPr>
+            <w:r>
+              <w:rPr>
+                <w:rFonts w:cstheme="minorHAnsi"/>
+                <w:sz w:val="22"/>
+                <w:szCs w:val="22"/>
+              </w:rPr>
+              <w:t>91 µs/cm</w:t>
+            </w:r>
+          </w:p>
+        </w:tc>
+        <w:tc>
+          <w:tcPr>
+            <w:tcW w:w="1262" w:type="dxa"/>
+            <w:vAlign w:val="center"/>
+          </w:tcPr>
+          <w:p>
+            <w:pPr>
+              <w:rPr>
+                <w:rFonts w:cstheme="minorHAnsi"/>
+                <w:sz w:val="22"/>
+                <w:szCs w:val="22"/>
+              </w:rPr>
+            </w:pPr>
+            <w:r>
+              <w:rPr>
+                <w:rFonts w:cstheme="minorHAnsi"/>
+                <w:sz w:val="22"/>
+                <w:szCs w:val="22"/>
+              </w:rPr>
+              <w:t>33 µs/cm</w:t>
+            </w:r>
+          </w:p>
+        </w:tc>
+        <w:tc>
+          <w:tcPr>
+            <w:tcW w:w="1107" w:type="dxa"/>
+            <w:vAlign w:val="center"/>
+          </w:tcPr>
+          <w:p>
+            <w:pPr>
+              <w:rPr>
+                <w:sz w:val="22"/>
+                <w:szCs w:val="22"/>
+              </w:rPr>
+            </w:pPr>
+            <w:r>
+              <w:rPr>
+                <w:rFonts w:cstheme="minorHAnsi"/>
+                <w:sz w:val="22"/>
+                <w:szCs w:val="22"/>
+              </w:rPr>
+              <w:t>13</w:t>
+            </w:r>
+            <w:r>
+              <w:rPr>
+                <w:rFonts w:cstheme="minorHAnsi"/>
+                <w:sz w:val="22"/>
+                <w:szCs w:val="22"/>
+              </w:rPr>
+              <w:t xml:space="preserve"> µs/cm</w:t>
+            </w:r>
+          </w:p>
+        </w:tc>
+        <w:tc>
+          <w:tcPr>
+            <w:tcW w:w="1107" w:type="dxa"/>
+            <w:vAlign w:val="center"/>
+          </w:tcPr>
+          <w:p>
+            <w:pPr>
+              <w:rPr>
+                <w:rFonts w:cstheme="minorHAnsi"/>
+                <w:sz w:val="22"/>
+                <w:szCs w:val="22"/>
+              </w:rPr>
+            </w:pPr>
+            <w:r>
+              <w:rPr>
+                <w:rFonts w:cstheme="minorHAnsi"/>
+                <w:sz w:val="22"/>
+                <w:szCs w:val="22"/>
+              </w:rPr>
+              <w:t>138</w:t>
+            </w:r>
+            <w:r>
+              <w:rPr>
+                <w:rFonts w:cstheme="minorHAnsi"/>
+                <w:sz w:val="22"/>
+                <w:szCs w:val="22"/>
+              </w:rPr>
+              <w:t xml:space="preserve"> µs/cm</w:t>
+            </w:r>
+          </w:p>
+        </w:tc>
+      </w:tr>
+      <w:tr>
+        <w:tc>
+          <w:tcPr>
+            <w:tcW w:w="1386" w:type="dxa"/>
+            <w:vAlign w:val="center"/>
+          </w:tcPr>
+          <w:p>
+            <w:pPr>
+              <w:rPr>
+                <w:rFonts w:cstheme="minorHAnsi"/>
+                <w:sz w:val="22"/>
+                <w:szCs w:val="22"/>
+              </w:rPr>
+            </w:pPr>
+            <w:r>
+              <w:rPr>
+                <w:rFonts w:cstheme="minorHAnsi"/>
+                <w:b/>
+                <w:bCs/>
+                <w:sz w:val="22"/>
+                <w:szCs w:val="22"/>
+              </w:rPr>
+              <w:t>Soil pH</w:t>
+            </w:r>
+          </w:p>
+        </w:tc>
+        <w:tc>
+          <w:tcPr>
+            <w:tcW w:w="1459" w:type="dxa"/>
+            <w:vAlign w:val="center"/>
+          </w:tcPr>
+          <w:p>
+            <w:pPr>
+              <w:rPr>
+                <w:rFonts w:cstheme="minorHAnsi"/>
+                <w:sz w:val="22"/>
+                <w:szCs w:val="22"/>
+              </w:rPr>
+            </w:pPr>
+            <w:r>
+              <w:rPr>
+                <w:rFonts w:cstheme="minorHAnsi"/>
+                <w:sz w:val="22"/>
+                <w:szCs w:val="22"/>
+              </w:rPr>
+              <w:t>7.37</w:t>
+            </w:r>
+          </w:p>
+        </w:tc>
+        <w:tc>
+          <w:tcPr>
+            <w:tcW w:w="1228" w:type="dxa"/>
+            <w:vAlign w:val="center"/>
+          </w:tcPr>
+          <w:p>
+            <w:pPr>
+              <w:rPr>
+                <w:rFonts w:cstheme="minorHAnsi"/>
+                <w:sz w:val="22"/>
+                <w:szCs w:val="22"/>
+              </w:rPr>
+            </w:pPr>
+            <w:r>
+              <w:rPr>
+                <w:rFonts w:cstheme="minorHAnsi"/>
+                <w:sz w:val="22"/>
+                <w:szCs w:val="22"/>
+              </w:rPr>
+              <w:t>7.20</w:t>
+            </w:r>
+          </w:p>
+        </w:tc>
+        <w:tc>
+          <w:tcPr>
+            <w:tcW w:w="1262" w:type="dxa"/>
+            <w:vAlign w:val="center"/>
+          </w:tcPr>
+          <w:p>
+            <w:pPr>
+              <w:rPr>
+                <w:rFonts w:cstheme="minorHAnsi"/>
+                <w:sz w:val="22"/>
+                <w:szCs w:val="22"/>
+              </w:rPr>
+            </w:pPr>
+            <w:r>
+              <w:rPr>
+                <w:rFonts w:cstheme="minorHAnsi"/>
+                <w:sz w:val="22"/>
+                <w:szCs w:val="22"/>
+              </w:rPr>
+              <w:t>7.15</w:t>
+            </w:r>
+          </w:p>
+        </w:tc>
+        <w:tc>
+          <w:tcPr>
+            <w:tcW w:w="1262" w:type="dxa"/>
+            <w:vAlign w:val="center"/>
+          </w:tcPr>
+          <w:p>
+            <w:pPr>
+              <w:rPr>
+                <w:rFonts w:cstheme="minorHAnsi"/>
+                <w:sz w:val="22"/>
+                <w:szCs w:val="22"/>
+              </w:rPr>
+            </w:pPr>
+            <w:r>
+              <w:rPr>
+                <w:rFonts w:cstheme="minorHAnsi"/>
+                <w:sz w:val="22"/>
+                <w:szCs w:val="22"/>
+              </w:rPr>
+              <w:t>7.32</w:t>
+            </w:r>
+          </w:p>
+        </w:tc>
+        <w:tc>
+          <w:tcPr>
+            <w:tcW w:w="1107" w:type="dxa"/>
+            <w:vAlign w:val="center"/>
+          </w:tcPr>
+          <w:p>
+            <w:pPr>
+              <w:rPr>
+                <w:sz w:val="22"/>
+                <w:szCs w:val="22"/>
+              </w:rPr>
+            </w:pPr>
+            <w:r>
+              <w:rPr>
+                <w:rFonts w:cstheme="minorHAnsi"/>
+                <w:sz w:val="22"/>
+                <w:szCs w:val="22"/>
+              </w:rPr>
+              <w:t>7.</w:t>
+            </w:r>
+            <w:r>
+              <w:rPr>
+                <w:rFonts w:cstheme="minorHAnsi"/>
+                <w:sz w:val="22"/>
+                <w:szCs w:val="22"/>
+              </w:rPr>
+              <w:t>00</w:t>
+            </w:r>
+          </w:p>
+        </w:tc>
+        <w:tc>
+          <w:tcPr>
+            <w:tcW w:w="1107" w:type="dxa"/>
+            <w:vAlign w:val="center"/>
+          </w:tcPr>
+          <w:p>
+            <w:pPr>
+              <w:rPr>
+                <w:rFonts w:cstheme="minorHAnsi"/>
+                <w:sz w:val="22"/>
+                <w:szCs w:val="22"/>
+              </w:rPr>
+            </w:pPr>
+            <w:r>
+              <w:rPr>
+                <w:rFonts w:cstheme="minorHAnsi"/>
+                <w:sz w:val="22"/>
+                <w:szCs w:val="22"/>
+              </w:rPr>
+              <w:t>7.</w:t>
+            </w:r>
+            <w:r>
+              <w:rPr>
+                <w:rFonts w:cstheme="minorHAnsi"/>
+                <w:sz w:val="22"/>
+                <w:szCs w:val="22"/>
+              </w:rPr>
+              <w:t>01</w:t>
+            </w:r>
+          </w:p>
+        </w:tc>
+      </w:tr>
+      <w:tr>
+        <w:tc>
+          <w:tcPr>
+            <w:tcW w:w="1386" w:type="dxa"/>
+            <w:vAlign w:val="center"/>
+          </w:tcPr>
+          <w:p>
+            <w:pPr>
+              <w:rPr>
+                <w:rFonts w:cstheme="minorHAnsi"/>
+                <w:sz w:val="22"/>
+                <w:szCs w:val="22"/>
+              </w:rPr>
+            </w:pPr>
+            <w:r>
+              <w:rPr>
+                <w:rFonts w:cstheme="minorHAnsi"/>
+                <w:b/>
+                <w:bCs/>
+                <w:sz w:val="22"/>
+                <w:szCs w:val="22"/>
+              </w:rPr>
+              <w:t>Salinity / TDS</w:t>
+            </w:r>
+          </w:p>
+        </w:tc>
+        <w:tc>
+          <w:tcPr>
+            <w:tcW w:w="1459" w:type="dxa"/>
+            <w:vAlign w:val="center"/>
+          </w:tcPr>
+          <w:p>
+            <w:pPr>
+              <w:rPr>
+                <w:rFonts w:cstheme="minorHAnsi"/>
+                <w:sz w:val="22"/>
+                <w:szCs w:val="22"/>
+              </w:rPr>
+            </w:pPr>
+            <w:r>
+              <w:rPr>
+                <w:rFonts w:cstheme="minorHAnsi"/>
+                <w:sz w:val="22"/>
+                <w:szCs w:val="22"/>
+              </w:rPr>
+              <w:t>75 mg/L</w:t>
+            </w:r>
+          </w:p>
+        </w:tc>
+        <w:tc>
+          <w:tcPr>
+            <w:tcW w:w="1228" w:type="dxa"/>
+            <w:vAlign w:val="center"/>
+          </w:tcPr>
+          <w:p>
+            <w:pPr>
+              <w:rPr>
+                <w:rFonts w:cstheme="minorHAnsi"/>
+                <w:sz w:val="22"/>
+                <w:szCs w:val="22"/>
+              </w:rPr>
+            </w:pPr>
+            <w:r>
+              <w:rPr>
+                <w:rFonts w:cstheme="minorHAnsi"/>
+                <w:sz w:val="22"/>
+                <w:szCs w:val="22"/>
+              </w:rPr>
+              <w:t>57 mg/L</w:t>
+            </w:r>
+          </w:p>
+        </w:tc>
+        <w:tc>
+          <w:tcPr>
+            <w:tcW w:w="1262" w:type="dxa"/>
+            <w:vAlign w:val="center"/>
+          </w:tcPr>
+          <w:p>
+            <w:pPr>
+              <w:rPr>
+                <w:rFonts w:cstheme="minorHAnsi"/>
+                <w:sz w:val="22"/>
+                <w:szCs w:val="22"/>
+              </w:rPr>
+            </w:pPr>
+            <w:r>
+              <w:rPr>
+                <w:rFonts w:cstheme="minorHAnsi"/>
+                <w:sz w:val="22"/>
+                <w:szCs w:val="22"/>
+              </w:rPr>
+              <w:t>55 mg/L</w:t>
+            </w:r>
+          </w:p>
+        </w:tc>
+        <w:tc>
+          <w:tcPr>
+            <w:tcW w:w="1262" w:type="dxa"/>
+            <w:vAlign w:val="center"/>
+          </w:tcPr>
+          <w:p>
+            <w:pPr>
+              <w:rPr>
+                <w:rFonts w:cstheme="minorHAnsi"/>
+                <w:sz w:val="22"/>
+                <w:szCs w:val="22"/>
+              </w:rPr>
+            </w:pPr>
+            <w:r>
+              <w:rPr>
+                <w:rFonts w:cstheme="minorHAnsi"/>
+                <w:sz w:val="22"/>
+                <w:szCs w:val="22"/>
+              </w:rPr>
+              <w:t>19 mg/L</w:t>
+            </w:r>
+          </w:p>
+        </w:tc>
+        <w:tc>
+          <w:tcPr>
+            <w:tcW w:w="1107" w:type="dxa"/>
+            <w:vAlign w:val="center"/>
+          </w:tcPr>
+          <w:p>
+            <w:pPr>
+              <w:rPr>
+                <w:sz w:val="22"/>
+                <w:szCs w:val="22"/>
+              </w:rPr>
+            </w:pPr>
+            <w:r>
+              <w:rPr>
+                <w:rFonts w:cstheme="minorHAnsi"/>
+                <w:sz w:val="22"/>
+                <w:szCs w:val="22"/>
+              </w:rPr>
+              <w:t xml:space="preserve">7 </w:t>
+            </w:r>
+            <w:r>
+              <w:rPr>
+                <w:rFonts w:cstheme="minorHAnsi"/>
+                <w:sz w:val="22"/>
+                <w:szCs w:val="22"/>
+              </w:rPr>
+              <w:t>mg/L</w:t>
+            </w:r>
+          </w:p>
+        </w:tc>
+        <w:tc>
+          <w:tcPr>
+            <w:tcW w:w="1107" w:type="dxa"/>
+            <w:vAlign w:val="center"/>
+          </w:tcPr>
+          <w:p>
+            <w:pPr>
+              <w:rPr>
+                <w:rFonts w:cstheme="minorHAnsi"/>
+                <w:sz w:val="22"/>
+                <w:szCs w:val="22"/>
+              </w:rPr>
+            </w:pPr>
+            <w:r>
+              <w:rPr>
+                <w:rFonts w:cstheme="minorHAnsi"/>
+                <w:sz w:val="22"/>
+                <w:szCs w:val="22"/>
+              </w:rPr>
+              <w:t xml:space="preserve">86 </w:t>
+            </w:r>
+            <w:r>
+              <w:rPr>
+                <w:rFonts w:cstheme="minorHAnsi"/>
+                <w:sz w:val="22"/>
+                <w:szCs w:val="22"/>
+              </w:rPr>
+              <w:t>mg/L</w:t>
+            </w:r>
+          </w:p>
+        </w:tc>
+      </w:tr>
+      <w:tr>
+        <w:tc>
+          <w:tcPr>
+            <w:tcW w:w="1386" w:type="dxa"/>
+            <w:vAlign w:val="center"/>
+          </w:tcPr>
+          <w:p>
+            <w:pPr>
+              <w:rPr>
+                <w:rFonts w:cstheme="minorHAnsi"/>
+                <w:sz w:val="22"/>
+                <w:szCs w:val="22"/>
+              </w:rPr>
+            </w:pPr>
+            <w:r>
+              <w:rPr>
+                <w:rFonts w:cstheme="minorHAnsi"/>
+                <w:b/>
+                <w:bCs/>
+                <w:sz w:val="22"/>
+                <w:szCs w:val="22"/>
+              </w:rPr>
+              <w:t>Nitrogen (N)</w:t>
+            </w:r>
+          </w:p>
+        </w:tc>
+        <w:tc>
+          <w:tcPr>
+            <w:tcW w:w="1459" w:type="dxa"/>
+            <w:vAlign w:val="center"/>
+          </w:tcPr>
+          <w:p>
+            <w:pPr>
+              <w:rPr>
+                <w:rFonts w:cstheme="minorHAnsi"/>
+                <w:sz w:val="22"/>
+                <w:szCs w:val="22"/>
+              </w:rPr>
+            </w:pPr>
+            <w:r>
+              <w:rPr>
+                <w:rFonts w:cstheme="minorHAnsi"/>
+                <w:sz w:val="22"/>
+                <w:szCs w:val="22"/>
+              </w:rPr>
+              <w:t>31 mg/kg</w:t>
+            </w:r>
+          </w:p>
+        </w:tc>
+        <w:tc>
+          <w:tcPr>
+            <w:tcW w:w="1228" w:type="dxa"/>
+            <w:vAlign w:val="center"/>
+          </w:tcPr>
+          <w:p>
+            <w:pPr>
+              <w:rPr>
+                <w:rFonts w:cstheme="minorHAnsi"/>
+                <w:sz w:val="22"/>
+                <w:szCs w:val="22"/>
+              </w:rPr>
+            </w:pPr>
+            <w:r>
+              <w:rPr>
+                <w:rFonts w:cstheme="minorHAnsi"/>
+                <w:sz w:val="22"/>
+                <w:szCs w:val="22"/>
+              </w:rPr>
+              <w:t>27 mg/kg</w:t>
+            </w:r>
+          </w:p>
+        </w:tc>
+        <w:tc>
+          <w:tcPr>
+            <w:tcW w:w="1262" w:type="dxa"/>
+            <w:vAlign w:val="center"/>
+          </w:tcPr>
+          <w:p>
+            <w:pPr>
+              <w:rPr>
+                <w:rFonts w:cstheme="minorHAnsi"/>
+                <w:sz w:val="22"/>
+                <w:szCs w:val="22"/>
+              </w:rPr>
+            </w:pPr>
+            <w:r>
+              <w:rPr>
+                <w:rFonts w:cstheme="minorHAnsi"/>
+                <w:sz w:val="22"/>
+                <w:szCs w:val="22"/>
+              </w:rPr>
+              <w:t>25 mg/kg</w:t>
+            </w:r>
+          </w:p>
+        </w:tc>
+        <w:tc>
+          <w:tcPr>
+            <w:tcW w:w="1262" w:type="dxa"/>
+            <w:vAlign w:val="center"/>
+          </w:tcPr>
+          <w:p>
+            <w:pPr>
+              <w:rPr>
+                <w:rFonts w:cstheme="minorHAnsi"/>
+                <w:sz w:val="22"/>
+                <w:szCs w:val="22"/>
+              </w:rPr>
+            </w:pPr>
+            <w:r>
+              <w:rPr>
+                <w:rFonts w:cstheme="minorHAnsi"/>
+                <w:sz w:val="22"/>
+                <w:szCs w:val="22"/>
+              </w:rPr>
+              <w:t>9 mg/kg</w:t>
+            </w:r>
+          </w:p>
+        </w:tc>
+        <w:tc>
+          <w:tcPr>
+            <w:tcW w:w="1107" w:type="dxa"/>
+            <w:vAlign w:val="center"/>
+          </w:tcPr>
+          <w:p>
+            <w:pPr>
+              <w:rPr>
+                <w:sz w:val="22"/>
+                <w:szCs w:val="22"/>
+              </w:rPr>
+            </w:pPr>
+            <w:r>
+              <w:rPr>
+                <w:rFonts w:cstheme="minorHAnsi"/>
+                <w:sz w:val="22"/>
+                <w:szCs w:val="22"/>
+              </w:rPr>
+              <w:t>4</w:t>
+            </w:r>
+            <w:r>
+              <w:rPr>
+                <w:rFonts w:cstheme="minorHAnsi"/>
+                <w:sz w:val="22"/>
+                <w:szCs w:val="22"/>
+              </w:rPr>
+              <w:t xml:space="preserve"> mg/kg</w:t>
+            </w:r>
+          </w:p>
+        </w:tc>
+        <w:tc>
+          <w:tcPr>
+            <w:tcW w:w="1107" w:type="dxa"/>
+            <w:vAlign w:val="center"/>
+          </w:tcPr>
+          <w:p>
+            <w:pPr>
+              <w:rPr>
+                <w:rFonts w:cstheme="minorHAnsi"/>
+                <w:sz w:val="22"/>
+                <w:szCs w:val="22"/>
+              </w:rPr>
+            </w:pPr>
+            <w:r>
+              <w:rPr>
+                <w:rFonts w:cstheme="minorHAnsi"/>
+                <w:sz w:val="22"/>
+                <w:szCs w:val="22"/>
+              </w:rPr>
+              <w:t>32</w:t>
+            </w:r>
+            <w:r>
+              <w:rPr>
+                <w:rFonts w:cstheme="minorHAnsi"/>
+                <w:sz w:val="22"/>
+                <w:szCs w:val="22"/>
+              </w:rPr>
+              <w:t xml:space="preserve"> mg/kg</w:t>
+            </w:r>
+          </w:p>
+        </w:tc>
+      </w:tr>
+      <w:tr>
+        <w:tc>
+          <w:tcPr>
+            <w:tcW w:w="1386" w:type="dxa"/>
+            <w:vAlign w:val="center"/>
+          </w:tcPr>
+          <w:p>
+            <w:pPr>
+              <w:rPr>
+                <w:rFonts w:cstheme="minorHAnsi"/>
+                <w:sz w:val="22"/>
+                <w:szCs w:val="22"/>
+              </w:rPr>
+            </w:pPr>
+            <w:r>
+              <w:rPr>
+                <w:rFonts w:cstheme="minorHAnsi"/>
+                <w:b/>
+                <w:bCs/>
+                <w:sz w:val="22"/>
+                <w:szCs w:val="22"/>
+              </w:rPr>
+              <w:lastRenderedPageBreak/>
+              <w:t>Phosphorus (P)</w:t>
+            </w:r>
+          </w:p>
+        </w:tc>
+        <w:tc>
+          <w:tcPr>
+            <w:tcW w:w="1459" w:type="dxa"/>
+            <w:vAlign w:val="center"/>
+          </w:tcPr>
+          <w:p>
+            <w:pPr>
+              <w:rPr>
+                <w:rFonts w:cstheme="minorHAnsi"/>
+                <w:sz w:val="22"/>
+                <w:szCs w:val="22"/>
+              </w:rPr>
+            </w:pPr>
+            <w:r>
+              <w:rPr>
+                <w:rFonts w:cstheme="minorHAnsi"/>
+                <w:sz w:val="22"/>
+                <w:szCs w:val="22"/>
+              </w:rPr>
+              <w:t>4 mg/kg</w:t>
+            </w:r>
+          </w:p>
+        </w:tc>
+        <w:tc>
+          <w:tcPr>
+            <w:tcW w:w="1228" w:type="dxa"/>
+            <w:vAlign w:val="center"/>
+          </w:tcPr>
+          <w:p>
+            <w:pPr>
+              <w:rPr>
+                <w:rFonts w:cstheme="minorHAnsi"/>
+                <w:sz w:val="22"/>
+                <w:szCs w:val="22"/>
+              </w:rPr>
+            </w:pPr>
+            <w:r>
+              <w:rPr>
+                <w:rFonts w:cstheme="minorHAnsi"/>
+                <w:sz w:val="22"/>
+                <w:szCs w:val="22"/>
+              </w:rPr>
+              <w:t>3 mg/kg</w:t>
+            </w:r>
+          </w:p>
+        </w:tc>
+        <w:tc>
+          <w:tcPr>
+            <w:tcW w:w="1262" w:type="dxa"/>
+            <w:vAlign w:val="center"/>
+          </w:tcPr>
+          <w:p>
+            <w:pPr>
+              <w:rPr>
+                <w:rFonts w:cstheme="minorHAnsi"/>
+                <w:sz w:val="22"/>
+                <w:szCs w:val="22"/>
+              </w:rPr>
+            </w:pPr>
+            <w:r>
+              <w:rPr>
+                <w:rFonts w:cstheme="minorHAnsi"/>
+                <w:sz w:val="22"/>
+                <w:szCs w:val="22"/>
+              </w:rPr>
+              <w:t>3 mg/kg</w:t>
+            </w:r>
+          </w:p>
+        </w:tc>
+        <w:tc>
+          <w:tcPr>
+            <w:tcW w:w="1262" w:type="dxa"/>
+            <w:vAlign w:val="center"/>
+          </w:tcPr>
+          <w:p>
+            <w:pPr>
+              <w:rPr>
+                <w:rFonts w:cstheme="minorHAnsi"/>
+                <w:sz w:val="22"/>
+                <w:szCs w:val="22"/>
+              </w:rPr>
+            </w:pPr>
+            <w:r>
+              <w:rPr>
+                <w:rFonts w:cstheme="minorHAnsi"/>
+                <w:sz w:val="22"/>
+                <w:szCs w:val="22"/>
+              </w:rPr>
+              <w:t>1 mg/kg</w:t>
+            </w:r>
+          </w:p>
+        </w:tc>
+        <w:tc>
+          <w:tcPr>
+            <w:tcW w:w="1107" w:type="dxa"/>
+            <w:vAlign w:val="center"/>
+          </w:tcPr>
+          <w:p>
+            <w:pPr>
+              <w:rPr>
+                <w:sz w:val="22"/>
+                <w:szCs w:val="22"/>
+              </w:rPr>
+            </w:pPr>
+            <w:r>
+              <w:rPr>
+                <w:rFonts w:cstheme="minorHAnsi"/>
+                <w:sz w:val="22"/>
+                <w:szCs w:val="22"/>
+              </w:rPr>
+              <w:t>1 mg/kg</w:t>
+            </w:r>
+          </w:p>
+        </w:tc>
+        <w:tc>
+          <w:tcPr>
+            <w:tcW w:w="1107" w:type="dxa"/>
+            <w:vAlign w:val="center"/>
+          </w:tcPr>
+          <w:p>
+            <w:pPr>
+              <w:rPr>
+                <w:rFonts w:cstheme="minorHAnsi"/>
+                <w:sz w:val="22"/>
+                <w:szCs w:val="22"/>
+              </w:rPr>
+            </w:pPr>
+            <w:r>
+              <w:rPr>
+                <w:rFonts w:cstheme="minorHAnsi"/>
+                <w:sz w:val="22"/>
+                <w:szCs w:val="22"/>
+              </w:rPr>
+              <w:t>4</w:t>
+            </w:r>
+            <w:r>
+              <w:rPr>
+                <w:rFonts w:cstheme="minorHAnsi"/>
+                <w:sz w:val="22"/>
+                <w:szCs w:val="22"/>
+              </w:rPr>
+              <w:t xml:space="preserve"> mg/kg</w:t>
+            </w:r>
+          </w:p>
+        </w:tc>
+      </w:tr>
+      <w:tr>
+        <w:tc>
+          <w:tcPr>
+            <w:tcW w:w="1386" w:type="dxa"/>
+            <w:vAlign w:val="center"/>
+          </w:tcPr>
+          <w:p>
+            <w:pPr>
+              <w:rPr>
+                <w:rFonts w:cstheme="minorHAnsi"/>
+                <w:sz w:val="22"/>
+                <w:szCs w:val="22"/>
+              </w:rPr>
+            </w:pPr>
+            <w:r>
+              <w:rPr>
+                <w:rFonts w:cstheme="minorHAnsi"/>
+                <w:b/>
+                <w:bCs/>
+                <w:sz w:val="22"/>
+                <w:szCs w:val="22"/>
+              </w:rPr>
+              <w:t>Potassium (K)</w:t>
+            </w:r>
+          </w:p>
+        </w:tc>
+        <w:tc>
+          <w:tcPr>
+            <w:tcW w:w="1459" w:type="dxa"/>
+            <w:vAlign w:val="center"/>
+          </w:tcPr>
+          <w:p>
+            <w:pPr>
+              <w:rPr>
+                <w:rFonts w:cstheme="minorHAnsi"/>
+                <w:sz w:val="22"/>
+                <w:szCs w:val="22"/>
+              </w:rPr>
+            </w:pPr>
+            <w:r>
+              <w:rPr>
+                <w:rFonts w:cstheme="minorHAnsi"/>
+                <w:sz w:val="22"/>
+                <w:szCs w:val="22"/>
+              </w:rPr>
+              <w:t>36 mg/kg</w:t>
+            </w:r>
+          </w:p>
+        </w:tc>
+        <w:tc>
+          <w:tcPr>
+            <w:tcW w:w="1228" w:type="dxa"/>
+            <w:vAlign w:val="center"/>
+          </w:tcPr>
+          <w:p>
+            <w:pPr>
+              <w:rPr>
+                <w:rFonts w:cstheme="minorHAnsi"/>
+                <w:sz w:val="22"/>
+                <w:szCs w:val="22"/>
+              </w:rPr>
+            </w:pPr>
+            <w:r>
+              <w:rPr>
+                <w:rFonts w:cstheme="minorHAnsi"/>
+                <w:sz w:val="22"/>
+                <w:szCs w:val="22"/>
+              </w:rPr>
+              <w:t>30 mg/kg</w:t>
+            </w:r>
+          </w:p>
+        </w:tc>
+        <w:tc>
+          <w:tcPr>
+            <w:tcW w:w="1262" w:type="dxa"/>
+            <w:vAlign w:val="center"/>
+          </w:tcPr>
+          <w:p>
+            <w:pPr>
+              <w:rPr>
+                <w:rFonts w:cstheme="minorHAnsi"/>
+                <w:sz w:val="22"/>
+                <w:szCs w:val="22"/>
+              </w:rPr>
+            </w:pPr>
+            <w:r>
+              <w:rPr>
+                <w:rFonts w:cstheme="minorHAnsi"/>
+                <w:sz w:val="22"/>
+                <w:szCs w:val="22"/>
+              </w:rPr>
+              <w:t>29 mg/kg</w:t>
+            </w:r>
+          </w:p>
+        </w:tc>
+        <w:tc>
+          <w:tcPr>
+            <w:tcW w:w="1262" w:type="dxa"/>
+            <w:vAlign w:val="center"/>
+          </w:tcPr>
+          <w:p>
+            <w:pPr>
+              <w:rPr>
+                <w:rFonts w:cstheme="minorHAnsi"/>
+                <w:sz w:val="22"/>
+                <w:szCs w:val="22"/>
+              </w:rPr>
+            </w:pPr>
+            <w:r>
+              <w:rPr>
+                <w:rFonts w:cstheme="minorHAnsi"/>
+                <w:sz w:val="22"/>
+                <w:szCs w:val="22"/>
+              </w:rPr>
+              <w:t>11 mg/kg</w:t>
+            </w:r>
+          </w:p>
+        </w:tc>
+        <w:tc>
+          <w:tcPr>
+            <w:tcW w:w="1107" w:type="dxa"/>
+            <w:vAlign w:val="center"/>
+          </w:tcPr>
+          <w:p>
+            <w:pPr>
+              <w:rPr>
+                <w:sz w:val="22"/>
+                <w:szCs w:val="22"/>
+              </w:rPr>
+            </w:pPr>
+            <w:r>
+              <w:rPr>
+                <w:rFonts w:cstheme="minorHAnsi"/>
+                <w:sz w:val="22"/>
+                <w:szCs w:val="22"/>
+              </w:rPr>
+              <w:t>4</w:t>
+            </w:r>
+            <w:r>
+              <w:rPr>
+                <w:rFonts w:cstheme="minorHAnsi"/>
+                <w:sz w:val="22"/>
+                <w:szCs w:val="22"/>
+              </w:rPr>
+              <w:t xml:space="preserve"> mg/kg</w:t>
+            </w:r>
+          </w:p>
+        </w:tc>
+        <w:tc>
+          <w:tcPr>
+            <w:tcW w:w="1107" w:type="dxa"/>
+            <w:vAlign w:val="center"/>
+          </w:tcPr>
+          <w:p>
+            <w:pPr>
+              <w:rPr>
+                <w:rFonts w:cstheme="minorHAnsi"/>
+                <w:sz w:val="22"/>
+                <w:szCs w:val="22"/>
+              </w:rPr>
+            </w:pPr>
+            <w:r>
+              <w:rPr>
+                <w:rFonts w:cstheme="minorHAnsi"/>
+                <w:sz w:val="22"/>
+                <w:szCs w:val="22"/>
+              </w:rPr>
+              <w:t>38</w:t>
+            </w:r>
+            <w:r>
+              <w:rPr>
+                <w:rFonts w:cstheme="minorHAnsi"/>
+                <w:sz w:val="22"/>
+                <w:szCs w:val="22"/>
+              </w:rPr>
+              <w:t xml:space="preserve"> mg/kg</w:t>
+            </w:r>
+          </w:p>
+        </w:tc>
+      </w:tr>
+    </w:tbl>
+    <w:p>
+      <w:pPr>
+        <w:rPr>
+          <w:sz w:val="22"/>
+          <w:szCs w:val="22"/>
+        </w:rPr>
+      </w:pPr>
+    </w:p>
+    <w:p>
+      <w:pPr>
+        <w:rPr>
+          <w:sz w:val="22"/>
+          <w:szCs w:val="22"/>
+        </w:rPr>
+      </w:pPr>
+      <w:r>
+        <w:rPr>
+          <w:sz w:val="22"/>
+          <w:szCs w:val="22"/>
+        </w:rPr>
+        <w:t>Note: Device fully inserted is inserted sideways. Soil is not as compact anymore</w:t>
+      </w:r>
+    </w:p>
+    <w:p>
+      <w:pPr>
+        <w:rPr>
+          <w:sz w:val="22"/>
+          <w:szCs w:val="22"/>
+        </w:rPr>
+      </w:pPr>
+      <w:r>
+        <w:rPr>
+          <w:sz w:val="22"/>
+          <w:szCs w:val="22"/>
+        </w:rPr>
+        <w:t>Sand test, soil with plant,</w:t>
+      </w:r>
+    </w:p>
+    <w:tbl>
+      <w:tblPr>
+        <w:tblStyle w:val="TableGrid"/>
+        <w:tblW w:w="0" w:type="auto"/>
+        <w:tblLook w:val="04A0" w:firstRow="1" w:lastRow="0" w:firstColumn="1" w:lastColumn="0" w:noHBand="0" w:noVBand="1"/>
+      </w:tblPr>
+      <w:tblGrid>
+        <w:gridCol w:w="1386"/>
+        <w:gridCol w:w="1485"/>
+        <w:gridCol w:w="2074"/>
+        <w:gridCol w:w="1890"/>
+        <w:gridCol w:w="2250"/>
+      </w:tblGrid>
+      <w:tr>
+        <w:tc>
+          <w:tcPr>
+            <w:tcW w:w="1386" w:type="dxa"/>
+            <w:vAlign w:val="center"/>
+          </w:tcPr>
+          <w:p>
+            <w:pPr>
+              <w:rPr>
+                <w:rFonts w:cstheme="minorHAnsi"/>
+                <w:sz w:val="22"/>
+                <w:szCs w:val="22"/>
+              </w:rPr>
+            </w:pPr>
+            <w:r>
+              <w:rPr>
+                <w:rStyle w:val="Strong"/>
+                <w:rFonts w:cstheme="minorHAnsi"/>
+                <w:sz w:val="22"/>
+                <w:szCs w:val="22"/>
+              </w:rPr>
+              <w:t>Parameter</w:t>
+            </w:r>
+          </w:p>
+        </w:tc>
+        <w:tc>
+          <w:tcPr>
+            <w:tcW w:w="1485" w:type="dxa"/>
+            <w:vAlign w:val="center"/>
+          </w:tcPr>
+          <w:p>
+            <w:pPr>
+              <w:rPr>
+                <w:rFonts w:cstheme="minorHAnsi"/>
+                <w:sz w:val="22"/>
+                <w:szCs w:val="22"/>
+              </w:rPr>
+            </w:pPr>
+            <w:r>
+              <w:rPr>
+                <w:rStyle w:val="Strong"/>
+                <w:rFonts w:cstheme="minorHAnsi"/>
+                <w:sz w:val="22"/>
+                <w:szCs w:val="22"/>
+              </w:rPr>
+              <w:t>Inserted in Sand</w:t>
+            </w:r>
+          </w:p>
+        </w:tc>
+        <w:tc>
+          <w:tcPr>
+            <w:tcW w:w="2074" w:type="dxa"/>
+            <w:vAlign w:val="center"/>
+          </w:tcPr>
+          <w:p>
+            <w:pPr>
+              <w:rPr>
+                <w:rFonts w:cstheme="minorHAnsi"/>
+                <w:sz w:val="22"/>
+                <w:szCs w:val="22"/>
+              </w:rPr>
+            </w:pPr>
+            <w:r>
+              <w:rPr>
+                <w:rStyle w:val="Strong"/>
+                <w:rFonts w:cstheme="minorHAnsi"/>
+                <w:sz w:val="22"/>
+                <w:szCs w:val="22"/>
+              </w:rPr>
+              <w:t>Dry Soil with Plant and Tea Bags</w:t>
+            </w:r>
+          </w:p>
+        </w:tc>
+        <w:tc>
+          <w:tcPr>
+            <w:tcW w:w="1890" w:type="dxa"/>
+            <w:vAlign w:val="center"/>
+          </w:tcPr>
+          <w:p>
+            <w:pPr>
+              <w:rPr>
+                <w:rFonts w:cstheme="minorHAnsi"/>
+                <w:sz w:val="22"/>
+                <w:szCs w:val="22"/>
+              </w:rPr>
+            </w:pPr>
+            <w:r>
+              <w:rPr>
+                <w:rStyle w:val="Strong"/>
+                <w:rFonts w:cstheme="minorHAnsi"/>
+                <w:sz w:val="22"/>
+                <w:szCs w:val="22"/>
+              </w:rPr>
+              <w:t>Wet Soil with Plant</w:t>
+            </w:r>
+          </w:p>
+        </w:tc>
+        <w:tc>
+          <w:tcPr>
+            <w:tcW w:w="2250" w:type="dxa"/>
+            <w:vAlign w:val="center"/>
+          </w:tcPr>
+          <w:p>
+            <w:pPr>
+              <w:rPr>
+                <w:rStyle w:val="Strong"/>
+                <w:rFonts w:cstheme="minorHAnsi"/>
+                <w:sz w:val="22"/>
+                <w:szCs w:val="22"/>
+              </w:rPr>
+            </w:pPr>
+            <w:r>
+              <w:rPr>
+                <w:rStyle w:val="Strong"/>
+                <w:rFonts w:cstheme="minorHAnsi"/>
+                <w:sz w:val="22"/>
+                <w:szCs w:val="22"/>
+              </w:rPr>
+              <w:t>Inserted in Vinegar (Tip Only)</w:t>
+            </w:r>
+          </w:p>
+        </w:tc>
+      </w:tr>
+      <w:tr>
+        <w:tc>
+          <w:tcPr>
+            <w:tcW w:w="1386" w:type="dxa"/>
+            <w:vAlign w:val="center"/>
+          </w:tcPr>
+          <w:p>
+            <w:pPr>
+              <w:rPr>
+                <w:rFonts w:cstheme="minorHAnsi"/>
+                <w:sz w:val="22"/>
+                <w:szCs w:val="22"/>
+              </w:rPr>
+            </w:pPr>
+            <w:r>
+              <w:rPr>
+                <w:rFonts w:cstheme="minorHAnsi"/>
+                <w:b/>
+                <w:bCs/>
+                <w:sz w:val="22"/>
+                <w:szCs w:val="22"/>
+              </w:rPr>
+              <w:t>Temperature</w:t>
+            </w:r>
+          </w:p>
+        </w:tc>
+        <w:tc>
+          <w:tcPr>
+            <w:tcW w:w="1485" w:type="dxa"/>
+            <w:vAlign w:val="center"/>
+          </w:tcPr>
+          <w:p>
+            <w:pPr>
+              <w:rPr>
+                <w:rFonts w:cstheme="minorHAnsi"/>
+                <w:sz w:val="22"/>
+                <w:szCs w:val="22"/>
+              </w:rPr>
+            </w:pPr>
+            <w:r>
+              <w:rPr>
+                <w:rFonts w:cstheme="minorHAnsi"/>
+                <w:sz w:val="22"/>
+                <w:szCs w:val="22"/>
+              </w:rPr>
+              <w:t>30.9 °C</w:t>
+            </w:r>
+          </w:p>
+        </w:tc>
+        <w:tc>
+          <w:tcPr>
+            <w:tcW w:w="2074" w:type="dxa"/>
+            <w:vAlign w:val="center"/>
+          </w:tcPr>
+          <w:p>
+            <w:pPr>
+              <w:rPr>
+                <w:rFonts w:cstheme="minorHAnsi"/>
+                <w:sz w:val="22"/>
+                <w:szCs w:val="22"/>
+              </w:rPr>
+            </w:pPr>
+            <w:r>
+              <w:rPr>
+                <w:rFonts w:cstheme="minorHAnsi"/>
+                <w:sz w:val="22"/>
+                <w:szCs w:val="22"/>
+              </w:rPr>
+              <w:t>30.7 °C</w:t>
+            </w:r>
+          </w:p>
+        </w:tc>
+        <w:tc>
+          <w:tcPr>
+            <w:tcW w:w="1890" w:type="dxa"/>
+            <w:vAlign w:val="center"/>
+          </w:tcPr>
+          <w:p>
+            <w:pPr>
+              <w:rPr>
+                <w:rFonts w:cstheme="minorHAnsi"/>
+                <w:sz w:val="22"/>
+                <w:szCs w:val="22"/>
+              </w:rPr>
+            </w:pPr>
+            <w:r>
+              <w:rPr>
+                <w:rFonts w:cstheme="minorHAnsi"/>
+                <w:sz w:val="22"/>
+                <w:szCs w:val="22"/>
+              </w:rPr>
+              <w:t>30.7 °C</w:t>
+            </w:r>
+          </w:p>
+        </w:tc>
+        <w:tc>
+          <w:tcPr>
+            <w:tcW w:w="2250" w:type="dxa"/>
+            <w:vAlign w:val="center"/>
+          </w:tcPr>
+          <w:p>
+            <w:pPr>
+              <w:rPr>
+                <w:rFonts w:cstheme="minorHAnsi"/>
+                <w:sz w:val="22"/>
+                <w:szCs w:val="22"/>
+              </w:rPr>
+            </w:pPr>
+            <w:r>
+              <w:rPr>
+                <w:rFonts w:cstheme="minorHAnsi"/>
+                <w:sz w:val="22"/>
+                <w:szCs w:val="22"/>
+              </w:rPr>
+              <w:t>31.9 °C</w:t>
+            </w:r>
+          </w:p>
+        </w:tc>
+      </w:tr>
+      <w:tr>
+        <w:tc>
+          <w:tcPr>
+            <w:tcW w:w="1386" w:type="dxa"/>
+            <w:vAlign w:val="center"/>
+          </w:tcPr>
+          <w:p>
+            <w:pPr>
+              <w:rPr>
+                <w:rFonts w:cstheme="minorHAnsi"/>
+                <w:sz w:val="22"/>
+                <w:szCs w:val="22"/>
+              </w:rPr>
+            </w:pPr>
+            <w:r>
+              <w:rPr>
+                <w:rFonts w:cstheme="minorHAnsi"/>
+                <w:b/>
+                <w:bCs/>
+                <w:sz w:val="22"/>
+                <w:szCs w:val="22"/>
+              </w:rPr>
+              <w:t>Moisture</w:t>
+            </w:r>
+          </w:p>
+        </w:tc>
+        <w:tc>
+          <w:tcPr>
+            <w:tcW w:w="1485" w:type="dxa"/>
+            <w:vAlign w:val="center"/>
+          </w:tcPr>
+          <w:p>
+            <w:pPr>
+              <w:rPr>
+                <w:rFonts w:cstheme="minorHAnsi"/>
+                <w:sz w:val="22"/>
+                <w:szCs w:val="22"/>
+              </w:rPr>
+            </w:pPr>
+            <w:r>
+              <w:rPr>
+                <w:rFonts w:cstheme="minorHAnsi"/>
+                <w:sz w:val="22"/>
+                <w:szCs w:val="22"/>
+              </w:rPr>
+              <w:t>6.3 %</w:t>
+            </w:r>
+          </w:p>
+        </w:tc>
+        <w:tc>
+          <w:tcPr>
+            <w:tcW w:w="2074" w:type="dxa"/>
+            <w:vAlign w:val="center"/>
+          </w:tcPr>
+          <w:p>
+            <w:pPr>
+              <w:rPr>
+                <w:rFonts w:cstheme="minorHAnsi"/>
+                <w:sz w:val="22"/>
+                <w:szCs w:val="22"/>
+              </w:rPr>
+            </w:pPr>
+            <w:r>
+              <w:rPr>
+                <w:rFonts w:cstheme="minorHAnsi"/>
+                <w:sz w:val="22"/>
+                <w:szCs w:val="22"/>
+              </w:rPr>
+              <w:t>8.0 %</w:t>
+            </w:r>
+          </w:p>
+        </w:tc>
+        <w:tc>
+          <w:tcPr>
+            <w:tcW w:w="1890" w:type="dxa"/>
+            <w:vAlign w:val="center"/>
+          </w:tcPr>
+          <w:p>
+            <w:pPr>
+              <w:rPr>
+                <w:rFonts w:cstheme="minorHAnsi"/>
+                <w:sz w:val="22"/>
+                <w:szCs w:val="22"/>
+              </w:rPr>
+            </w:pPr>
+            <w:r>
+              <w:rPr>
+                <w:rFonts w:cstheme="minorHAnsi"/>
+                <w:sz w:val="22"/>
+                <w:szCs w:val="22"/>
+              </w:rPr>
+              <w:t>7.9 %</w:t>
+            </w:r>
+          </w:p>
+        </w:tc>
+        <w:tc>
+          <w:tcPr>
+            <w:tcW w:w="2250" w:type="dxa"/>
+            <w:vAlign w:val="center"/>
+          </w:tcPr>
+          <w:p>
+            <w:pPr>
+              <w:rPr>
+                <w:rFonts w:cstheme="minorHAnsi"/>
+                <w:sz w:val="22"/>
+                <w:szCs w:val="22"/>
+              </w:rPr>
+            </w:pPr>
+            <w:r>
+              <w:rPr>
+                <w:rFonts w:cstheme="minorHAnsi"/>
+                <w:sz w:val="22"/>
+                <w:szCs w:val="22"/>
+              </w:rPr>
+              <w:t>100.0 %</w:t>
+            </w:r>
+          </w:p>
+        </w:tc>
+      </w:tr>
+      <w:tr>
+        <w:tc>
+          <w:tcPr>
+            <w:tcW w:w="1386" w:type="dxa"/>
+            <w:vAlign w:val="center"/>
+          </w:tcPr>
+          <w:p>
+            <w:pPr>
+              <w:rPr>
+                <w:rFonts w:cstheme="minorHAnsi"/>
+                <w:sz w:val="22"/>
+                <w:szCs w:val="22"/>
+              </w:rPr>
+            </w:pPr>
+            <w:r>
+              <w:rPr>
+                <w:rFonts w:cstheme="minorHAnsi"/>
+                <w:b/>
+                <w:bCs/>
+                <w:sz w:val="22"/>
+                <w:szCs w:val="22"/>
+              </w:rPr>
+              <w:t>Conductivity (EC)</w:t>
+            </w:r>
+          </w:p>
+        </w:tc>
+        <w:tc>
+          <w:tcPr>
+            <w:tcW w:w="1485" w:type="dxa"/>
+            <w:vAlign w:val="center"/>
+          </w:tcPr>
+          <w:p>
+            <w:pPr>
+              <w:rPr>
+                <w:rFonts w:cstheme="minorHAnsi"/>
+                <w:sz w:val="22"/>
+                <w:szCs w:val="22"/>
+              </w:rPr>
+            </w:pPr>
+            <w:r>
+              <w:rPr>
+                <w:rFonts w:cstheme="minorHAnsi"/>
+                <w:sz w:val="22"/>
+                <w:szCs w:val="22"/>
+              </w:rPr>
+              <w:t>14 µs/cm</w:t>
+            </w:r>
+          </w:p>
+        </w:tc>
+        <w:tc>
+          <w:tcPr>
+            <w:tcW w:w="2074" w:type="dxa"/>
+            <w:vAlign w:val="center"/>
+          </w:tcPr>
+          <w:p>
+            <w:pPr>
+              <w:rPr>
+                <w:rFonts w:cstheme="minorHAnsi"/>
+                <w:sz w:val="22"/>
+                <w:szCs w:val="22"/>
+              </w:rPr>
+            </w:pPr>
+            <w:r>
+              <w:rPr>
+                <w:rFonts w:cstheme="minorHAnsi"/>
+                <w:sz w:val="22"/>
+                <w:szCs w:val="22"/>
+              </w:rPr>
+              <w:t>47 µs/cm</w:t>
+            </w:r>
+          </w:p>
+        </w:tc>
+        <w:tc>
+          <w:tcPr>
+            <w:tcW w:w="1890" w:type="dxa"/>
+            <w:vAlign w:val="center"/>
+          </w:tcPr>
+          <w:p>
+            <w:pPr>
+              <w:rPr>
+                <w:rFonts w:cstheme="minorHAnsi"/>
+                <w:sz w:val="22"/>
+                <w:szCs w:val="22"/>
+              </w:rPr>
+            </w:pPr>
+            <w:r>
+              <w:rPr>
+                <w:rFonts w:cstheme="minorHAnsi"/>
+                <w:sz w:val="22"/>
+                <w:szCs w:val="22"/>
+              </w:rPr>
+              <w:t>39 µs/cm</w:t>
+            </w:r>
+          </w:p>
+        </w:tc>
+        <w:tc>
+          <w:tcPr>
+            <w:tcW w:w="2250" w:type="dxa"/>
+            <w:vAlign w:val="center"/>
+          </w:tcPr>
+          <w:p>
+            <w:pPr>
+              <w:rPr>
+                <w:rFonts w:cstheme="minorHAnsi"/>
+                <w:sz w:val="22"/>
+                <w:szCs w:val="22"/>
+              </w:rPr>
+            </w:pPr>
+            <w:r>
+              <w:rPr>
+                <w:rFonts w:cstheme="minorHAnsi"/>
+                <w:sz w:val="22"/>
+                <w:szCs w:val="22"/>
+              </w:rPr>
+              <w:t>1042 µs/cm</w:t>
+            </w:r>
+          </w:p>
+        </w:tc>
+      </w:tr>
+      <w:tr>
+        <w:tc>
+          <w:tcPr>
+            <w:tcW w:w="1386" w:type="dxa"/>
+            <w:vAlign w:val="center"/>
+          </w:tcPr>
+          <w:p>
+            <w:pPr>
+              <w:rPr>
+                <w:rFonts w:cstheme="minorHAnsi"/>
+                <w:sz w:val="22"/>
+                <w:szCs w:val="22"/>
+              </w:rPr>
+            </w:pPr>
+            <w:r>
+              <w:rPr>
+                <w:rFonts w:cstheme="minorHAnsi"/>
+                <w:b/>
+                <w:bCs/>
+                <w:sz w:val="22"/>
+                <w:szCs w:val="22"/>
+              </w:rPr>
+              <w:t>Soil pH</w:t>
+            </w:r>
+          </w:p>
+        </w:tc>
+        <w:tc>
+          <w:tcPr>
+            <w:tcW w:w="1485" w:type="dxa"/>
+            <w:vAlign w:val="center"/>
+          </w:tcPr>
+          <w:p>
+            <w:pPr>
+              <w:rPr>
+                <w:rFonts w:cstheme="minorHAnsi"/>
+                <w:sz w:val="22"/>
+                <w:szCs w:val="22"/>
+              </w:rPr>
+            </w:pPr>
+            <w:r>
+              <w:rPr>
+                <w:rFonts w:cstheme="minorHAnsi"/>
+                <w:sz w:val="22"/>
+                <w:szCs w:val="22"/>
+              </w:rPr>
+              <w:t>7.19</w:t>
+            </w:r>
+          </w:p>
+        </w:tc>
+        <w:tc>
+          <w:tcPr>
+            <w:tcW w:w="2074" w:type="dxa"/>
+            <w:vAlign w:val="center"/>
+          </w:tcPr>
+          <w:p>
+            <w:pPr>
+              <w:rPr>
+                <w:rFonts w:cstheme="minorHAnsi"/>
+                <w:sz w:val="22"/>
+                <w:szCs w:val="22"/>
+              </w:rPr>
+            </w:pPr>
+            <w:r>
+              <w:rPr>
+                <w:rFonts w:cstheme="minorHAnsi"/>
+                <w:sz w:val="22"/>
+                <w:szCs w:val="22"/>
+              </w:rPr>
+              <w:t>7.21</w:t>
+            </w:r>
+          </w:p>
+        </w:tc>
+        <w:tc>
+          <w:tcPr>
+            <w:tcW w:w="1890" w:type="dxa"/>
+            <w:vAlign w:val="center"/>
+          </w:tcPr>
+          <w:p>
+            <w:pPr>
+              <w:rPr>
+                <w:rFonts w:cstheme="minorHAnsi"/>
+                <w:sz w:val="22"/>
+                <w:szCs w:val="22"/>
+              </w:rPr>
+            </w:pPr>
+            <w:r>
+              <w:rPr>
+                <w:rFonts w:cstheme="minorHAnsi"/>
+                <w:sz w:val="22"/>
+                <w:szCs w:val="22"/>
+              </w:rPr>
+              <w:t>7.30</w:t>
+            </w:r>
+          </w:p>
+        </w:tc>
+        <w:tc>
+          <w:tcPr>
+            <w:tcW w:w="2250" w:type="dxa"/>
+            <w:vAlign w:val="center"/>
+          </w:tcPr>
+          <w:p>
+            <w:pPr>
+              <w:rPr>
+                <w:rFonts w:cstheme="minorHAnsi"/>
+                <w:sz w:val="22"/>
+                <w:szCs w:val="22"/>
+              </w:rPr>
+            </w:pPr>
+            <w:r>
+              <w:rPr>
+                <w:rFonts w:cstheme="minorHAnsi"/>
+                <w:sz w:val="22"/>
+                <w:szCs w:val="22"/>
+              </w:rPr>
+              <w:t>6.11</w:t>
+            </w:r>
+          </w:p>
+        </w:tc>
+      </w:tr>
+      <w:tr>
+        <w:tc>
+          <w:tcPr>
+            <w:tcW w:w="1386" w:type="dxa"/>
+            <w:vAlign w:val="center"/>
+          </w:tcPr>
+          <w:p>
+            <w:pPr>
+              <w:rPr>
+                <w:rFonts w:cstheme="minorHAnsi"/>
+                <w:sz w:val="22"/>
+                <w:szCs w:val="22"/>
+              </w:rPr>
+            </w:pPr>
+            <w:r>
+              <w:rPr>
+                <w:rFonts w:cstheme="minorHAnsi"/>
+                <w:b/>
+                <w:bCs/>
+                <w:sz w:val="22"/>
+                <w:szCs w:val="22"/>
+              </w:rPr>
+              <w:t>Salinity / TDS</w:t>
+            </w:r>
+          </w:p>
+        </w:tc>
+        <w:tc>
+          <w:tcPr>
+            <w:tcW w:w="1485" w:type="dxa"/>
+            <w:vAlign w:val="center"/>
+          </w:tcPr>
+          <w:p>
+            <w:pPr>
+              <w:rPr>
+                <w:rFonts w:cstheme="minorHAnsi"/>
+                <w:sz w:val="22"/>
+                <w:szCs w:val="22"/>
+              </w:rPr>
+            </w:pPr>
+            <w:r>
+              <w:rPr>
+                <w:rFonts w:cstheme="minorHAnsi"/>
+                <w:sz w:val="22"/>
+                <w:szCs w:val="22"/>
+              </w:rPr>
+              <w:t>8 mg/L</w:t>
+            </w:r>
+          </w:p>
+        </w:tc>
+        <w:tc>
+          <w:tcPr>
+            <w:tcW w:w="2074" w:type="dxa"/>
+            <w:vAlign w:val="center"/>
+          </w:tcPr>
+          <w:p>
+            <w:pPr>
+              <w:rPr>
+                <w:rFonts w:cstheme="minorHAnsi"/>
+                <w:sz w:val="22"/>
+                <w:szCs w:val="22"/>
+              </w:rPr>
+            </w:pPr>
+            <w:r>
+              <w:rPr>
+                <w:rFonts w:cstheme="minorHAnsi"/>
+                <w:sz w:val="22"/>
+                <w:szCs w:val="22"/>
+              </w:rPr>
+              <w:t>28 mg/L</w:t>
+            </w:r>
+          </w:p>
+        </w:tc>
+        <w:tc>
+          <w:tcPr>
+            <w:tcW w:w="1890" w:type="dxa"/>
+            <w:vAlign w:val="center"/>
+          </w:tcPr>
+          <w:p>
+            <w:pPr>
+              <w:rPr>
+                <w:rFonts w:cstheme="minorHAnsi"/>
+                <w:sz w:val="22"/>
+                <w:szCs w:val="22"/>
+              </w:rPr>
+            </w:pPr>
+            <w:r>
+              <w:rPr>
+                <w:rFonts w:cstheme="minorHAnsi"/>
+                <w:sz w:val="22"/>
+                <w:szCs w:val="22"/>
+              </w:rPr>
+              <w:t>23 mg/L</w:t>
+            </w:r>
+          </w:p>
+        </w:tc>
+        <w:tc>
+          <w:tcPr>
+            <w:tcW w:w="2250" w:type="dxa"/>
+            <w:vAlign w:val="center"/>
+          </w:tcPr>
+          <w:p>
+            <w:pPr>
+              <w:rPr>
+                <w:rFonts w:cstheme="minorHAnsi"/>
+                <w:sz w:val="22"/>
+                <w:szCs w:val="22"/>
+              </w:rPr>
+            </w:pPr>
+            <w:r>
+              <w:rPr>
+                <w:rFonts w:cstheme="minorHAnsi"/>
+                <w:sz w:val="22"/>
+                <w:szCs w:val="22"/>
+              </w:rPr>
+              <w:t>628 mg/L</w:t>
+            </w:r>
+          </w:p>
+        </w:tc>
+      </w:tr>
+      <w:tr>
+        <w:tc>
+          <w:tcPr>
+            <w:tcW w:w="1386" w:type="dxa"/>
+            <w:vAlign w:val="center"/>
+          </w:tcPr>
+          <w:p>
+            <w:pPr>
+              <w:rPr>
+                <w:rFonts w:cstheme="minorHAnsi"/>
+                <w:sz w:val="22"/>
+                <w:szCs w:val="22"/>
+              </w:rPr>
+            </w:pPr>
+            <w:r>
+              <w:rPr>
+                <w:rFonts w:cstheme="minorHAnsi"/>
+                <w:b/>
+                <w:bCs/>
+                <w:sz w:val="22"/>
+                <w:szCs w:val="22"/>
+              </w:rPr>
+              <w:t>Nitrogen (N)</w:t>
+            </w:r>
+          </w:p>
+        </w:tc>
+        <w:tc>
+          <w:tcPr>
+            <w:tcW w:w="1485" w:type="dxa"/>
+            <w:vAlign w:val="center"/>
+          </w:tcPr>
+          <w:p>
+            <w:pPr>
+              <w:rPr>
+                <w:rFonts w:cstheme="minorHAnsi"/>
+                <w:sz w:val="22"/>
+                <w:szCs w:val="22"/>
+              </w:rPr>
+            </w:pPr>
+            <w:r>
+              <w:rPr>
+                <w:rFonts w:cstheme="minorHAnsi"/>
+                <w:sz w:val="22"/>
+                <w:szCs w:val="22"/>
+              </w:rPr>
+              <w:t>4 mg/kg</w:t>
+            </w:r>
+          </w:p>
+        </w:tc>
+        <w:tc>
+          <w:tcPr>
+            <w:tcW w:w="2074" w:type="dxa"/>
+            <w:vAlign w:val="center"/>
+          </w:tcPr>
+          <w:p>
+            <w:pPr>
+              <w:rPr>
+                <w:rFonts w:cstheme="minorHAnsi"/>
+                <w:sz w:val="22"/>
+                <w:szCs w:val="22"/>
+              </w:rPr>
+            </w:pPr>
+            <w:r>
+              <w:rPr>
+                <w:rFonts w:cstheme="minorHAnsi"/>
+                <w:sz w:val="22"/>
+                <w:szCs w:val="22"/>
+              </w:rPr>
+              <w:t>13 mg/kg</w:t>
+            </w:r>
+          </w:p>
+        </w:tc>
+        <w:tc>
+          <w:tcPr>
+            <w:tcW w:w="1890" w:type="dxa"/>
+            <w:vAlign w:val="center"/>
+          </w:tcPr>
+          <w:p>
+            <w:pPr>
+              <w:rPr>
+                <w:rFonts w:cstheme="minorHAnsi"/>
+                <w:sz w:val="22"/>
+                <w:szCs w:val="22"/>
+              </w:rPr>
+            </w:pPr>
+            <w:r>
+              <w:rPr>
+                <w:rFonts w:cstheme="minorHAnsi"/>
+                <w:sz w:val="22"/>
+                <w:szCs w:val="22"/>
+              </w:rPr>
+              <w:t>11 mg/kg</w:t>
+            </w:r>
+          </w:p>
+        </w:tc>
+        <w:tc>
+          <w:tcPr>
+            <w:tcW w:w="2250" w:type="dxa"/>
+            <w:vAlign w:val="center"/>
+          </w:tcPr>
+          <w:p>
+            <w:pPr>
+              <w:rPr>
+                <w:rFonts w:cstheme="minorHAnsi"/>
+                <w:sz w:val="22"/>
+                <w:szCs w:val="22"/>
+              </w:rPr>
+            </w:pPr>
+            <w:r>
+              <w:rPr>
+                <w:rFonts w:cstheme="minorHAnsi"/>
+                <w:sz w:val="22"/>
+                <w:szCs w:val="22"/>
+              </w:rPr>
+              <w:t>132 mg/kg</w:t>
+            </w:r>
+          </w:p>
+        </w:tc>
+      </w:tr>
+      <w:tr>
+        <w:tc>
+          <w:tcPr>
+            <w:tcW w:w="1386" w:type="dxa"/>
+            <w:vAlign w:val="center"/>
+          </w:tcPr>
+          <w:p>
+            <w:pPr>
+              <w:rPr>
+                <w:rFonts w:cstheme="minorHAnsi"/>
+                <w:sz w:val="22"/>
+                <w:szCs w:val="22"/>
+              </w:rPr>
+            </w:pPr>
+            <w:r>
+              <w:rPr>
+                <w:rFonts w:cstheme="minorHAnsi"/>
+                <w:b/>
+                <w:bCs/>
+                <w:sz w:val="22"/>
+                <w:szCs w:val="22"/>
+              </w:rPr>
+              <w:t>Phosphorus (P)</w:t>
+            </w:r>
+          </w:p>
+        </w:tc>
+        <w:tc>
+          <w:tcPr>
+            <w:tcW w:w="1485" w:type="dxa"/>
+            <w:vAlign w:val="center"/>
+          </w:tcPr>
+          <w:p>
+            <w:pPr>
+              <w:rPr>
+                <w:rFonts w:cstheme="minorHAnsi"/>
+                <w:sz w:val="22"/>
+                <w:szCs w:val="22"/>
+              </w:rPr>
+            </w:pPr>
+            <w:r>
+              <w:rPr>
+                <w:rFonts w:cstheme="minorHAnsi"/>
+                <w:sz w:val="22"/>
+                <w:szCs w:val="22"/>
+              </w:rPr>
+              <w:t>1 mg/kg</w:t>
+            </w:r>
+          </w:p>
+        </w:tc>
+        <w:tc>
+          <w:tcPr>
+            <w:tcW w:w="2074" w:type="dxa"/>
+            <w:vAlign w:val="center"/>
+          </w:tcPr>
+          <w:p>
+            <w:pPr>
+              <w:rPr>
+                <w:rFonts w:cstheme="minorHAnsi"/>
+                <w:sz w:val="22"/>
+                <w:szCs w:val="22"/>
+              </w:rPr>
+            </w:pPr>
+            <w:r>
+              <w:rPr>
+                <w:rFonts w:cstheme="minorHAnsi"/>
+                <w:sz w:val="22"/>
+                <w:szCs w:val="22"/>
+              </w:rPr>
+              <w:t>1 mg/kg</w:t>
+            </w:r>
+          </w:p>
+        </w:tc>
+        <w:tc>
+          <w:tcPr>
+            <w:tcW w:w="1890" w:type="dxa"/>
+            <w:vAlign w:val="center"/>
+          </w:tcPr>
+          <w:p>
+            <w:pPr>
+              <w:rPr>
+                <w:rFonts w:cstheme="minorHAnsi"/>
+                <w:sz w:val="22"/>
+                <w:szCs w:val="22"/>
+              </w:rPr>
+            </w:pPr>
+            <w:r>
+              <w:rPr>
+                <w:rFonts w:cstheme="minorHAnsi"/>
+                <w:sz w:val="22"/>
+                <w:szCs w:val="22"/>
+              </w:rPr>
+              <w:t>1 mg/kg</w:t>
+            </w:r>
+          </w:p>
+        </w:tc>
+        <w:tc>
+          <w:tcPr>
+            <w:tcW w:w="2250" w:type="dxa"/>
+            <w:vAlign w:val="center"/>
+          </w:tcPr>
+          <w:p>
+            <w:pPr>
+              <w:rPr>
+                <w:rFonts w:cstheme="minorHAnsi"/>
+                <w:sz w:val="22"/>
+                <w:szCs w:val="22"/>
+              </w:rPr>
+            </w:pPr>
+            <w:r>
+              <w:rPr>
+                <w:rFonts w:cstheme="minorHAnsi"/>
+                <w:sz w:val="22"/>
+                <w:szCs w:val="22"/>
+              </w:rPr>
+              <w:t>35 mg/kg</w:t>
+            </w:r>
+          </w:p>
+        </w:tc>
+      </w:tr>
+      <w:tr>
+        <w:tc>
+          <w:tcPr>
+            <w:tcW w:w="1386" w:type="dxa"/>
+            <w:vAlign w:val="center"/>
+          </w:tcPr>
+          <w:p>
+            <w:pPr>
+              <w:rPr>
+                <w:rFonts w:cstheme="minorHAnsi"/>
+                <w:sz w:val="22"/>
+                <w:szCs w:val="22"/>
+              </w:rPr>
+            </w:pPr>
+            <w:r>
+              <w:rPr>
+                <w:rFonts w:cstheme="minorHAnsi"/>
+                <w:b/>
+                <w:bCs/>
+                <w:sz w:val="22"/>
+                <w:szCs w:val="22"/>
+              </w:rPr>
+              <w:t>Potassium (K)</w:t>
+            </w:r>
+          </w:p>
+        </w:tc>
+        <w:tc>
+          <w:tcPr>
+            <w:tcW w:w="1485" w:type="dxa"/>
+            <w:vAlign w:val="center"/>
+          </w:tcPr>
+          <w:p>
+            <w:pPr>
+              <w:rPr>
+                <w:rFonts w:cstheme="minorHAnsi"/>
+                <w:sz w:val="22"/>
+                <w:szCs w:val="22"/>
+              </w:rPr>
+            </w:pPr>
+            <w:r>
+              <w:rPr>
+                <w:rFonts w:cstheme="minorHAnsi"/>
+                <w:sz w:val="22"/>
+                <w:szCs w:val="22"/>
+              </w:rPr>
+              <w:t>4 mg/kg</w:t>
+            </w:r>
+          </w:p>
+        </w:tc>
+        <w:tc>
+          <w:tcPr>
+            <w:tcW w:w="2074" w:type="dxa"/>
+            <w:vAlign w:val="center"/>
+          </w:tcPr>
+          <w:p>
+            <w:pPr>
+              <w:rPr>
+                <w:rFonts w:cstheme="minorHAnsi"/>
+                <w:sz w:val="22"/>
+                <w:szCs w:val="22"/>
+              </w:rPr>
+            </w:pPr>
+            <w:r>
+              <w:rPr>
+                <w:rFonts w:cstheme="minorHAnsi"/>
+                <w:sz w:val="22"/>
+                <w:szCs w:val="22"/>
+              </w:rPr>
+              <w:t>15 mg/kg</w:t>
+            </w:r>
+          </w:p>
+        </w:tc>
+        <w:tc>
+          <w:tcPr>
+            <w:tcW w:w="1890" w:type="dxa"/>
+            <w:vAlign w:val="center"/>
+          </w:tcPr>
+          <w:p>
+            <w:pPr>
+              <w:rPr>
+                <w:rFonts w:cstheme="minorHAnsi"/>
+                <w:sz w:val="22"/>
+                <w:szCs w:val="22"/>
+              </w:rPr>
+            </w:pPr>
+            <w:r>
+              <w:rPr>
+                <w:rFonts w:cstheme="minorHAnsi"/>
+                <w:sz w:val="22"/>
+                <w:szCs w:val="22"/>
+              </w:rPr>
+              <w:t>12 mg/kg</w:t>
+            </w:r>
+          </w:p>
+        </w:tc>
+        <w:tc>
+          <w:tcPr>
+            <w:tcW w:w="2250" w:type="dxa"/>
+            <w:vAlign w:val="center"/>
+          </w:tcPr>
+          <w:p>
+            <w:pPr>
+              <w:rPr>
+                <w:rFonts w:cstheme="minorHAnsi"/>
+                <w:sz w:val="22"/>
+                <w:szCs w:val="22"/>
+              </w:rPr>
+            </w:pPr>
+            <w:r>
+              <w:rPr>
+                <w:rFonts w:cstheme="minorHAnsi"/>
+                <w:sz w:val="22"/>
+                <w:szCs w:val="22"/>
+              </w:rPr>
+              <w:t>176 mg/kg</w:t>
+            </w:r>
+          </w:p>
+        </w:tc>
+      </w:tr>
+    </w:tbl>
+    <w:p>
+      <w:pPr>
+        <w:rPr>
+          <w:sz w:val="22"/>
+          <w:szCs w:val="22"/>
+        </w:rPr>
+      </w:pPr>
+    </w:p>
+    <w:p>
+      <w:r>
+        <w:t xml:space="preserve">Key findings: </w:t>
+      </w:r>
+    </w:p>
+    <w:p>
+      <w:pPr>
+        <w:pStyle w:val="ListParagraph"/>
+        <w:numPr>
+          <w:ilvl w:val="0"/>
+          <w:numId w:val="2"/>
+        </w:numPr>
+      </w:pPr>
+      <w:r>
+        <w:t>Temperature sensor is in the black resin or plastic. When you grip and hold it, the temperature will increase.</w:t>
+      </w:r>
+    </w:p>
+    <w:p>
+      <w:pPr>
+        <w:pStyle w:val="ListParagraph"/>
+        <w:numPr>
+          <w:ilvl w:val="0"/>
+          <w:numId w:val="2"/>
+        </w:numPr>
+      </w:pPr>
+      <w:r>
+        <w:t>The probe returns data instantly, but if we want to measure temperature, the black part must be inserted for around 5 minutes or buy another temperature sensor that instantly reads the temperature.</w:t>
+      </w:r>
+    </w:p>
+    <w:p>
+      <w:pPr>
+        <w:pStyle w:val="ListParagraph"/>
+        <w:numPr>
+          <w:ilvl w:val="0"/>
+          <w:numId w:val="2"/>
+        </w:numPr>
+      </w:pPr>
+      <w:r>
+        <w:t>Data are coming from hexadecimal values</w:t>
+      </w:r>
+    </w:p>
+    <w:p>
+      <w:pPr>
+        <w:pStyle w:val="ListParagraph"/>
+        <w:numPr>
+          <w:ilvl w:val="0"/>
+          <w:numId w:val="2"/>
+        </w:numPr>
+      </w:pPr>
+      <w:r>
+        <w:t>NPK and salinity is indeed derived from conductivity as proven by the vinegar result</w:t>
+      </w:r>
+    </w:p>
+    <w:p>
+      <w:pPr>
+        <w:pStyle w:val="ListParagraph"/>
+        <w:numPr>
+          <w:ilvl w:val="0"/>
+          <w:numId w:val="2"/>
+        </w:numPr>
+      </w:pPr>
+      <w:r>
+        <w:t>pH value must be further calibrated because vinegar pH must be around 2 or 3; the result is 6.</w:t>
+      </w:r>
+    </w:p>
+    <w:p>
+      <w:pPr>
+        <w:pStyle w:val="ListParagraph"/>
+        <w:numPr>
+          <w:ilvl w:val="0"/>
+          <w:numId w:val="2"/>
+        </w:numPr>
+      </w:pPr>
+      <w:r>
+        <w:t>Moisture I think is good.</w:t>
       </w:r>
     </w:p>
     <w:p/>
+    <w:p/>
+    <w:p>
+      <w:r>
+        <w:t>(Un-tabulated tests; includes test with wrong code)</w:t>
+      </w:r>
+    </w:p>
     <w:p>
       <w:pPr>
         <w:rPr>
@@ -615,13 +3504,15 @@
           <w:b/>
           <w:bCs/>
         </w:rPr>
-        <w:lastRenderedPageBreak/>
         <w:t xml:space="preserve">- </w:t>
       </w:r>
       <w:r>
         <w:t>instant reading upon insertion</w:t>
       </w:r>
       <w:r>
+        <w:rPr>
+          <w:noProof/>
+        </w:rPr>
         <w:drawing>
           <wp:inline distT="0" distB="0" distL="0" distR="0" wp14:anchorId="2654FC78" wp14:editId="430B58F6">
             <wp:extent cx="5943600" cy="1749425"/>
@@ -722,6 +3613,10 @@
     </w:p>
     <w:p>
       <w:r>
+        <w:rPr>
+          <w:noProof/>
+        </w:rPr>
+        <w:lastRenderedPageBreak/>
         <w:drawing>
           <wp:inline distT="0" distB="0" distL="0" distR="0" wp14:anchorId="5FF6054A" wp14:editId="1E5B57E6">
             <wp:extent cx="5943600" cy="1557655"/>
@@ -761,12 +3656,14 @@
     </w:p>
     <w:p>
       <w:r>
-        <w:lastRenderedPageBreak/>
         <w:t xml:space="preserve">Result after removing </w:t>
       </w:r>
     </w:p>
     <w:p>
       <w:r>
+        <w:rPr>
+          <w:noProof/>
+        </w:rPr>
         <w:drawing>
           <wp:inline distT="0" distB="0" distL="0" distR="0" wp14:anchorId="02EDB9E6" wp14:editId="030AE620">
             <wp:extent cx="5943600" cy="1720215"/>
@@ -811,6 +3708,9 @@
     </w:p>
     <w:p>
       <w:r>
+        <w:rPr>
+          <w:noProof/>
+        </w:rPr>
         <w:drawing>
           <wp:inline distT="0" distB="0" distL="0" distR="0" wp14:anchorId="28426D19" wp14:editId="7D16A9CC">
             <wp:extent cx="5943600" cy="840105"/>
@@ -855,6 +3755,9 @@
     </w:p>
     <w:p>
       <w:r>
+        <w:rPr>
+          <w:noProof/>
+        </w:rPr>
         <w:drawing>
           <wp:inline distT="0" distB="0" distL="0" distR="0" wp14:anchorId="4CF26750" wp14:editId="4C4E22CA">
             <wp:extent cx="5943600" cy="793750"/>
@@ -899,6 +3802,9 @@
     </w:p>
     <w:p>
       <w:r>
+        <w:rPr>
+          <w:noProof/>
+        </w:rPr>
         <w:drawing>
           <wp:inline distT="0" distB="0" distL="0" distR="0" wp14:anchorId="39DC2730" wp14:editId="5D89E7BF">
             <wp:extent cx="5943600" cy="695960"/>
@@ -943,6 +3849,10 @@
     </w:p>
     <w:p>
       <w:r>
+        <w:rPr>
+          <w:noProof/>
+        </w:rPr>
+        <w:lastRenderedPageBreak/>
         <w:drawing>
           <wp:inline distT="0" distB="0" distL="0" distR="0" wp14:anchorId="591F7019" wp14:editId="7BCB0530">
             <wp:extent cx="5943600" cy="743585"/>
@@ -982,11 +3892,30 @@
     </w:p>
     <w:p>
       <w:r>
-        <w:t>Fully inserted (incuding the black part)(after code fix):</w:t>
-      </w:r>
-    </w:p>
-    <w:p>
-      <w:r>
+        <w:t>Fully inserted (</w:t>
+      </w:r>
+      <w:proofErr w:type="spellStart"/>
+      <w:r>
+        <w:t>incuding</w:t>
+      </w:r>
+      <w:proofErr w:type="spellEnd"/>
+      <w:r>
+        <w:t xml:space="preserve"> the black </w:t>
+      </w:r>
+      <w:proofErr w:type="gramStart"/>
+      <w:r>
+        <w:t>part)(</w:t>
+      </w:r>
+      <w:proofErr w:type="gramEnd"/>
+      <w:r>
+        <w:t>after code fix):</w:t>
+      </w:r>
+    </w:p>
+    <w:p>
+      <w:r>
+        <w:rPr>
+          <w:noProof/>
+        </w:rPr>
         <w:drawing>
           <wp:inline distT="0" distB="0" distL="0" distR="0" wp14:anchorId="0EAD0349" wp14:editId="1374EF9B">
             <wp:extent cx="5943600" cy="709295"/>
@@ -1026,12 +3955,14 @@
     </w:p>
     <w:p>
       <w:r>
-        <w:lastRenderedPageBreak/>
         <w:t>Edge of the container:</w:t>
       </w:r>
     </w:p>
     <w:p>
       <w:r>
+        <w:rPr>
+          <w:noProof/>
+        </w:rPr>
         <w:drawing>
           <wp:inline distT="0" distB="0" distL="0" distR="0" wp14:anchorId="61933014" wp14:editId="0719492A">
             <wp:extent cx="5943600" cy="800100"/>
@@ -1129,6 +4060,9 @@
     </w:p>
     <w:p>
       <w:r>
+        <w:rPr>
+          <w:noProof/>
+        </w:rPr>
         <w:drawing>
           <wp:inline distT="0" distB="0" distL="0" distR="0" wp14:anchorId="0C47AF76" wp14:editId="036F2FEB">
             <wp:extent cx="5943600" cy="815975"/>
@@ -1252,6 +4186,7 @@
         <w:rPr>
           <w:b/>
           <w:bCs/>
+          <w:noProof/>
         </w:rPr>
         <w:drawing>
           <wp:inline distT="0" distB="0" distL="0" distR="0" wp14:anchorId="24455516" wp14:editId="42B7E560">
@@ -1360,6 +4295,9 @@
     </w:p>
     <w:p>
       <w:r>
+        <w:rPr>
+          <w:noProof/>
+        </w:rPr>
         <w:drawing>
           <wp:inline distT="0" distB="0" distL="0" distR="0" wp14:anchorId="5629D2AB" wp14:editId="5455B3B1">
             <wp:extent cx="5943600" cy="1443990"/>
@@ -1460,6 +4398,9 @@
     </w:p>
     <w:p>
       <w:r>
+        <w:rPr>
+          <w:noProof/>
+        </w:rPr>
         <w:drawing>
           <wp:inline distT="0" distB="0" distL="0" distR="0" wp14:anchorId="72930DED" wp14:editId="167C76DB">
             <wp:extent cx="5943600" cy="708660"/>
@@ -1711,6 +4652,7 @@
       </w:pPr>
       <w:r>
         <w:rPr>
+          <w:noProof/>
           <w:sz w:val="22"/>
           <w:szCs w:val="22"/>
         </w:rPr>
@@ -1775,6 +4717,7 @@
       </w:pPr>
       <w:r>
         <w:rPr>
+          <w:noProof/>
           <w:sz w:val="22"/>
           <w:szCs w:val="22"/>
         </w:rPr>
@@ -1822,11 +4765,76 @@
           <w:szCs w:val="22"/>
         </w:rPr>
       </w:pPr>
-      <w:r>
-        <w:rPr>
-          <w:sz w:val="22"/>
-          <w:szCs w:val="22"/>
-        </w:rPr>
+    </w:p>
+    <w:p>
+      <w:pPr>
+        <w:rPr>
+          <w:sz w:val="22"/>
+          <w:szCs w:val="22"/>
+        </w:rPr>
+      </w:pPr>
+    </w:p>
+    <w:p>
+      <w:pPr>
+        <w:rPr>
+          <w:sz w:val="22"/>
+          <w:szCs w:val="22"/>
+        </w:rPr>
+      </w:pPr>
+    </w:p>
+    <w:p>
+      <w:pPr>
+        <w:rPr>
+          <w:sz w:val="22"/>
+          <w:szCs w:val="22"/>
+        </w:rPr>
+      </w:pPr>
+    </w:p>
+    <w:p>
+      <w:pPr>
+        <w:rPr>
+          <w:sz w:val="22"/>
+          <w:szCs w:val="22"/>
+        </w:rPr>
+      </w:pPr>
+    </w:p>
+    <w:p>
+      <w:pPr>
+        <w:rPr>
+          <w:sz w:val="22"/>
+          <w:szCs w:val="22"/>
+        </w:rPr>
+      </w:pPr>
+    </w:p>
+    <w:p>
+      <w:pPr>
+        <w:rPr>
+          <w:sz w:val="22"/>
+          <w:szCs w:val="22"/>
+        </w:rPr>
+      </w:pPr>
+    </w:p>
+    <w:p>
+      <w:pPr>
+        <w:rPr>
+          <w:sz w:val="22"/>
+          <w:szCs w:val="22"/>
+        </w:rPr>
+      </w:pPr>
+    </w:p>
+    <w:p>
+      <w:pPr>
+        <w:rPr>
+          <w:sz w:val="22"/>
+          <w:szCs w:val="22"/>
+        </w:rPr>
+      </w:pPr>
+      <w:r>
+        <w:rPr>
+          <w:sz w:val="22"/>
+          <w:szCs w:val="22"/>
+        </w:rPr>
+        <w:lastRenderedPageBreak/>
         <w:t>half inserted:</w:t>
       </w:r>
     </w:p>
@@ -1839,14 +4847,14 @@
       </w:pPr>
       <w:r>
         <w:rPr>
-          <w:sz w:val="22"/>
-          <w:szCs w:val="22"/>
-        </w:rPr>
-        <w:lastRenderedPageBreak/>
+          <w:noProof/>
+          <w:sz w:val="22"/>
+          <w:szCs w:val="22"/>
+        </w:rPr>
         <w:drawing>
-          <wp:inline distT="0" distB="0" distL="0" distR="0" wp14:anchorId="27CBA201" wp14:editId="079521D7">
-            <wp:extent cx="5943600" cy="2262505"/>
-            <wp:effectExtent l="0" t="0" r="0" b="4445"/>
+          <wp:inline distT="0" distB="0" distL="0" distR="0" wp14:anchorId="27CBA201" wp14:editId="6BA50E34">
+            <wp:extent cx="4240280" cy="1614115"/>
+            <wp:effectExtent l="0" t="0" r="8255" b="5715"/>
             <wp:docPr id="1256038860" name="Picture 1"/>
             <wp:cNvGraphicFramePr>
               <a:graphicFrameLocks xmlns:a="http://schemas.openxmlformats.org/drawingml/2006/main" noChangeAspect="1"/>
@@ -1867,7 +4875,7 @@
                   <pic:spPr>
                     <a:xfrm>
                       <a:off x="0" y="0"/>
-                      <a:ext cx="5943600" cy="2262505"/>
+                      <a:ext cx="4252174" cy="1618643"/>
                     </a:xfrm>
                     <a:prstGeom prst="rect">
                       <a:avLst/>
@@ -1904,13 +4912,14 @@
       </w:pPr>
       <w:r>
         <w:rPr>
+          <w:noProof/>
           <w:sz w:val="22"/>
           <w:szCs w:val="22"/>
         </w:rPr>
         <w:drawing>
-          <wp:inline distT="0" distB="0" distL="0" distR="0" wp14:anchorId="29B3B912" wp14:editId="610BC330">
-            <wp:extent cx="5943600" cy="756285"/>
-            <wp:effectExtent l="0" t="0" r="0" b="5715"/>
+          <wp:inline distT="0" distB="0" distL="0" distR="0" wp14:anchorId="29B3B912" wp14:editId="14783A48">
+            <wp:extent cx="4073851" cy="1478942"/>
+            <wp:effectExtent l="0" t="0" r="3175" b="6985"/>
             <wp:docPr id="1222811294" name="Picture 1"/>
             <wp:cNvGraphicFramePr>
               <a:graphicFrameLocks xmlns:a="http://schemas.openxmlformats.org/drawingml/2006/main" noChangeAspect="1"/>
@@ -1922,20 +4931,29 @@
                     <pic:cNvPr id="1222811294" name=""/>
                     <pic:cNvPicPr/>
                   </pic:nvPicPr>
-                  <pic:blipFill>
+                  <pic:blipFill rotWithShape="1">
                     <a:blip r:embed="rId39"/>
+                    <a:srcRect r="64950"/>
                     <a:stretch>
                       <a:fillRect/>
                     </a:stretch>
                   </pic:blipFill>
-                  <pic:spPr>
+                  <pic:spPr bwMode="auto">
                     <a:xfrm>
                       <a:off x="0" y="0"/>
-                      <a:ext cx="5943600" cy="756285"/>
+                      <a:ext cx="4082447" cy="1482062"/>
                     </a:xfrm>
                     <a:prstGeom prst="rect">
                       <a:avLst/>
                     </a:prstGeom>
+                    <a:ln>
+                      <a:noFill/>
+                    </a:ln>
+                    <a:extLst>
+                      <a:ext uri="{53640926-AAD7-44D8-BBD7-CCE9431645EC}">
+                        <a14:shadowObscured xmlns:a14="http://schemas.microsoft.com/office/drawing/2010/main"/>
+                      </a:ext>
+                    </a:extLst>
                   </pic:spPr>
                 </pic:pic>
               </a:graphicData>
@@ -1968,13 +4986,14 @@
       </w:pPr>
       <w:r>
         <w:rPr>
+          <w:noProof/>
           <w:sz w:val="22"/>
           <w:szCs w:val="22"/>
         </w:rPr>
         <w:drawing>
-          <wp:inline distT="0" distB="0" distL="0" distR="0" wp14:anchorId="124A3556" wp14:editId="6B6F90E3">
-            <wp:extent cx="5943600" cy="793750"/>
-            <wp:effectExtent l="0" t="0" r="0" b="6350"/>
+          <wp:inline distT="0" distB="0" distL="0" distR="0" wp14:anchorId="124A3556" wp14:editId="324CDBC3">
+            <wp:extent cx="3410912" cy="1486894"/>
+            <wp:effectExtent l="0" t="0" r="0" b="0"/>
             <wp:docPr id="19003313" name="Picture 1"/>
             <wp:cNvGraphicFramePr>
               <a:graphicFrameLocks xmlns:a="http://schemas.openxmlformats.org/drawingml/2006/main" noChangeAspect="1"/>
@@ -1986,20 +5005,29 @@
                     <pic:cNvPr id="19003313" name=""/>
                     <pic:cNvPicPr/>
                   </pic:nvPicPr>
-                  <pic:blipFill>
+                  <pic:blipFill rotWithShape="1">
                     <a:blip r:embed="rId40"/>
+                    <a:srcRect r="69365"/>
                     <a:stretch>
                       <a:fillRect/>
                     </a:stretch>
                   </pic:blipFill>
-                  <pic:spPr>
+                  <pic:spPr bwMode="auto">
                     <a:xfrm>
                       <a:off x="0" y="0"/>
-                      <a:ext cx="5943600" cy="793750"/>
+                      <a:ext cx="3413379" cy="1487969"/>
                     </a:xfrm>
                     <a:prstGeom prst="rect">
                       <a:avLst/>
                     </a:prstGeom>
+                    <a:ln>
+                      <a:noFill/>
+                    </a:ln>
+                    <a:extLst>
+                      <a:ext uri="{53640926-AAD7-44D8-BBD7-CCE9431645EC}">
+                        <a14:shadowObscured xmlns:a14="http://schemas.microsoft.com/office/drawing/2010/main"/>
+                      </a:ext>
+                    </a:extLst>
                   </pic:spPr>
                 </pic:pic>
               </a:graphicData>
@@ -2040,6 +5068,7 @@
       </w:pPr>
       <w:r>
         <w:rPr>
+          <w:noProof/>
           <w:sz w:val="22"/>
           <w:szCs w:val="22"/>
         </w:rPr>
@@ -2104,9 +5133,11 @@
       </w:pPr>
       <w:r>
         <w:rPr>
-          <w:sz w:val="22"/>
-          <w:szCs w:val="22"/>
-        </w:rPr>
+          <w:noProof/>
+          <w:sz w:val="22"/>
+          <w:szCs w:val="22"/>
+        </w:rPr>
+        <w:lastRenderedPageBreak/>
         <w:drawing>
           <wp:inline distT="0" distB="0" distL="0" distR="0" wp14:anchorId="06F660B0" wp14:editId="7A58852F">
             <wp:extent cx="5943600" cy="1440180"/>
@@ -2176,6 +5207,7 @@
       </w:pPr>
       <w:r>
         <w:rPr>
+          <w:noProof/>
           <w:sz w:val="22"/>
           <w:szCs w:val="22"/>
         </w:rPr>
@@ -2240,6 +5272,7 @@
       </w:pPr>
       <w:r>
         <w:rPr>
+          <w:noProof/>
           <w:sz w:val="22"/>
           <w:szCs w:val="22"/>
         </w:rPr>
@@ -2295,14 +5328,6 @@
           <w:szCs w:val="22"/>
         </w:rPr>
       </w:pPr>
-    </w:p>
-    <w:p>
-      <w:pPr>
-        <w:rPr>
-          <w:sz w:val="22"/>
-          <w:szCs w:val="22"/>
-        </w:rPr>
-      </w:pPr>
       <w:r>
         <w:rPr>
           <w:sz w:val="22"/>
@@ -2320,6 +5345,7 @@
       </w:pPr>
       <w:r>
         <w:rPr>
+          <w:noProof/>
           <w:sz w:val="22"/>
           <w:szCs w:val="22"/>
         </w:rPr>
@@ -2361,6 +5387,7 @@
       </w:r>
       <w:r>
         <w:rPr>
+          <w:noProof/>
           <w:sz w:val="22"/>
           <w:szCs w:val="22"/>
         </w:rPr>
@@ -2413,7 +5440,23 @@
           <w:sz w:val="22"/>
           <w:szCs w:val="22"/>
         </w:rPr>
-        <w:t>Verdict: soil moisture sensor needs calibration, it gets to 100% easily.</w:t>
+        <w:t xml:space="preserve">Verdict: soil moisture sensor needs </w:t>
+      </w:r>
+      <w:proofErr w:type="gramStart"/>
+      <w:r>
+        <w:rPr>
+          <w:sz w:val="22"/>
+          <w:szCs w:val="22"/>
+        </w:rPr>
+        <w:t>calibration,</w:t>
+      </w:r>
+      <w:proofErr w:type="gramEnd"/>
+      <w:r>
+        <w:rPr>
+          <w:sz w:val="22"/>
+          <w:szCs w:val="22"/>
+        </w:rPr>
+        <w:t xml:space="preserve"> it gets to 100% easily.</w:t>
       </w:r>
     </w:p>
     <w:sectPr>
@@ -2429,10 +5472,11 @@
 <file path=word/numbering.xml><?xml version="1.0" encoding="utf-8"?>
 <w:numbering xmlns:wpc="http://schemas.microsoft.com/office/word/2010/wordprocessingCanvas" xmlns:cx="http://schemas.microsoft.com/office/drawing/2014/chartex" xmlns:cx1="http://schemas.microsoft.com/office/drawing/2015/9/8/chartex" xmlns:cx2="http://schemas.microsoft.com/office/drawing/2015/10/21/chartex" xmlns:cx3="http://schemas.microsoft.com/office/drawing/2016/5/9/chartex" xmlns:cx4="http://schemas.microsoft.com/office/drawing/2016/5/10/chartex" xmlns:cx5="http://schemas.microsoft.com/office/drawing/2016/5/11/chartex" xmlns:cx6="http://schemas.microsoft.com/office/drawing/2016/5/12/chartex" xmlns:cx7="http://schemas.microsoft.com/office/drawing/2016/5/13/chartex" xmlns:cx8="http://schemas.microsoft.com/office/drawing/2016/5/14/chartex" xmlns:mc="http://schemas.openxmlformats.org/markup-compatibility/2006" xmlns:aink="http://schemas.microsoft.com/office/drawing/2016/ink" xmlns:am3d="http://schemas.microsoft.com/office/drawing/2017/model3d" xmlns:o="urn:schemas-microsoft-com:office:office" xmlns:oel="http://schemas.microsoft.com/office/2019/extlst" xmlns:r="http://schemas.openxmlformats.org/officeDocument/2006/relationships" xmlns:m="http://schemas.openxmlformats.org/officeDocument/2006/math" xmlns:v="urn:schemas-microsoft-com:vml" xmlns:wp14="http://schemas.microsoft.com/office/word/2010/wordprocessingDrawing" xmlns:wp="http://schemas.openxmlformats.org/drawingml/2006/wordprocessingDrawing" xmlns:w10="urn:schemas-microsoft-com:office:word" xmlns:w="http://schemas.openxmlformats.org/wordprocessingml/2006/main" xmlns:w14="http://schemas.microsoft.com/office/word/2010/wordml" xmlns:w15="http://schemas.microsoft.com/office/word/2012/wordml" xmlns:w16cei="http://schemas.microsoft.com/office/word/2026/wordml/cei" xmlns:w16cex="http://schemas.microsoft.com/office/word/2018/wordml/cex" xmlns:w16cid="http://schemas.microsoft.com/office/word/2016/wordml/cid" xmlns:w16="http://schemas.microsoft.com/office/word/2018/wordml" xmlns:w16du="http://schemas.microsoft.com/office/word/2023/wordml/word16du" xmlns:w16sdtdh="http://schemas.microsoft.com/office/word/2020/wordml/sdtdatahash" xmlns:w16sdtfl="http://schemas.microsoft.com/office/word/2024/wordml/sdtformatlock" xmlns:w16se="http://schemas.microsoft.com/office/word/2015/wordml/symex" xmlns:wpg="http://schemas.microsoft.com/office/word/2010/wordprocessingGroup" xmlns:wpi="http://schemas.microsoft.com/office/word/2010/wordprocessingInk" xmlns:wne="http://schemas.microsoft.com/office/word/2006/wordml" xmlns:wps="http://schemas.microsoft.com/office/word/2010/wordprocessingShape" mc:Ignorable="w14 w15 w16se w16cid w16 w16cex w16sdtdh w16sdtfl w16du wp14">
   <w:abstractNum w:abstractNumId="0" w15:restartNumberingAfterBreak="0">
-    <w:nsid w:val="65065F77"/>
+    <w:nsid w:val="33F61F5C"/>
     <w:multiLevelType w:val="hybridMultilevel"/>
-    <w:tmpl w:val="0F72D102"/>
-    <w:lvl w:ilvl="0" w:tplc="C5BE944E">
+    <w:tmpl w:val="BFCA41F0"/>
+    <w:lvl w:ilvl="0" w:tplc="335CB0E4">
+      <w:start w:val="12"/>
       <w:numFmt w:val="bullet"/>
       <w:lvlText w:val="-"/>
       <w:lvlJc w:val="left"/>
@@ -2540,7 +5584,122 @@
       </w:rPr>
     </w:lvl>
   </w:abstractNum>
+  <w:abstractNum w:abstractNumId="1" w15:restartNumberingAfterBreak="0">
+    <w:nsid w:val="65065F77"/>
+    <w:multiLevelType w:val="hybridMultilevel"/>
+    <w:tmpl w:val="0F72D102"/>
+    <w:lvl w:ilvl="0" w:tplc="C5BE944E">
+      <w:numFmt w:val="bullet"/>
+      <w:lvlText w:val="-"/>
+      <w:lvlJc w:val="left"/>
+      <w:pPr>
+        <w:ind w:left="720" w:hanging="360"/>
+      </w:pPr>
+      <w:rPr>
+        <w:rFonts w:ascii="Calibri" w:eastAsiaTheme="minorHAnsi" w:hAnsi="Calibri" w:cs="Calibri" w:hint="default"/>
+      </w:rPr>
+    </w:lvl>
+    <w:lvl w:ilvl="1" w:tplc="34090003" w:tentative="1">
+      <w:start w:val="1"/>
+      <w:numFmt w:val="bullet"/>
+      <w:lvlText w:val="o"/>
+      <w:lvlJc w:val="left"/>
+      <w:pPr>
+        <w:ind w:left="1440" w:hanging="360"/>
+      </w:pPr>
+      <w:rPr>
+        <w:rFonts w:ascii="Courier New" w:hAnsi="Courier New" w:cs="Courier New" w:hint="default"/>
+      </w:rPr>
+    </w:lvl>
+    <w:lvl w:ilvl="2" w:tplc="34090005" w:tentative="1">
+      <w:start w:val="1"/>
+      <w:numFmt w:val="bullet"/>
+      <w:lvlText w:val=""/>
+      <w:lvlJc w:val="left"/>
+      <w:pPr>
+        <w:ind w:left="2160" w:hanging="360"/>
+      </w:pPr>
+      <w:rPr>
+        <w:rFonts w:ascii="Wingdings" w:hAnsi="Wingdings" w:hint="default"/>
+      </w:rPr>
+    </w:lvl>
+    <w:lvl w:ilvl="3" w:tplc="34090001" w:tentative="1">
+      <w:start w:val="1"/>
+      <w:numFmt w:val="bullet"/>
+      <w:lvlText w:val=""/>
+      <w:lvlJc w:val="left"/>
+      <w:pPr>
+        <w:ind w:left="2880" w:hanging="360"/>
+      </w:pPr>
+      <w:rPr>
+        <w:rFonts w:ascii="Symbol" w:hAnsi="Symbol" w:hint="default"/>
+      </w:rPr>
+    </w:lvl>
+    <w:lvl w:ilvl="4" w:tplc="34090003" w:tentative="1">
+      <w:start w:val="1"/>
+      <w:numFmt w:val="bullet"/>
+      <w:lvlText w:val="o"/>
+      <w:lvlJc w:val="left"/>
+      <w:pPr>
+        <w:ind w:left="3600" w:hanging="360"/>
+      </w:pPr>
+      <w:rPr>
+        <w:rFonts w:ascii="Courier New" w:hAnsi="Courier New" w:cs="Courier New" w:hint="default"/>
+      </w:rPr>
+    </w:lvl>
+    <w:lvl w:ilvl="5" w:tplc="34090005" w:tentative="1">
+      <w:start w:val="1"/>
+      <w:numFmt w:val="bullet"/>
+      <w:lvlText w:val=""/>
+      <w:lvlJc w:val="left"/>
+      <w:pPr>
+        <w:ind w:left="4320" w:hanging="360"/>
+      </w:pPr>
+      <w:rPr>
+        <w:rFonts w:ascii="Wingdings" w:hAnsi="Wingdings" w:hint="default"/>
+      </w:rPr>
+    </w:lvl>
+    <w:lvl w:ilvl="6" w:tplc="34090001" w:tentative="1">
+      <w:start w:val="1"/>
+      <w:numFmt w:val="bullet"/>
+      <w:lvlText w:val=""/>
+      <w:lvlJc w:val="left"/>
+      <w:pPr>
+        <w:ind w:left="5040" w:hanging="360"/>
+      </w:pPr>
+      <w:rPr>
+        <w:rFonts w:ascii="Symbol" w:hAnsi="Symbol" w:hint="default"/>
+      </w:rPr>
+    </w:lvl>
+    <w:lvl w:ilvl="7" w:tplc="34090003" w:tentative="1">
+      <w:start w:val="1"/>
+      <w:numFmt w:val="bullet"/>
+      <w:lvlText w:val="o"/>
+      <w:lvlJc w:val="left"/>
+      <w:pPr>
+        <w:ind w:left="5760" w:hanging="360"/>
+      </w:pPr>
+      <w:rPr>
+        <w:rFonts w:ascii="Courier New" w:hAnsi="Courier New" w:cs="Courier New" w:hint="default"/>
+      </w:rPr>
+    </w:lvl>
+    <w:lvl w:ilvl="8" w:tplc="34090005" w:tentative="1">
+      <w:start w:val="1"/>
+      <w:numFmt w:val="bullet"/>
+      <w:lvlText w:val=""/>
+      <w:lvlJc w:val="left"/>
+      <w:pPr>
+        <w:ind w:left="6480" w:hanging="360"/>
+      </w:pPr>
+      <w:rPr>
+        <w:rFonts w:ascii="Wingdings" w:hAnsi="Wingdings" w:hint="default"/>
+      </w:rPr>
+    </w:lvl>
+  </w:abstractNum>
   <w:num w:numId="1" w16cid:durableId="170995013">
+    <w:abstractNumId w:val="1"/>
+  </w:num>
+  <w:num w:numId="2" w16cid:durableId="146559351">
     <w:abstractNumId w:val="0"/>
   </w:num>
 </w:numbering>
@@ -3149,7 +6308,6 @@
   <w:style w:type="character" w:default="1" w:styleId="DefaultParagraphFont">
     <w:name w:val="Default Paragraph Font"/>
     <w:uiPriority w:val="1"/>
-    <w:semiHidden/>
     <w:unhideWhenUsed/>
   </w:style>
   <w:style w:type="table" w:default="1" w:styleId="TableNormal">
@@ -3463,6 +6621,36 @@
       <w:spacing w:val="5"/>
     </w:rPr>
   </w:style>
+  <w:style w:type="table" w:styleId="TableGrid">
+    <w:name w:val="Table Grid"/>
+    <w:basedOn w:val="TableNormal"/>
+    <w:uiPriority w:val="39"/>
+    <w:rsid w:val="002F5C78"/>
+    <w:pPr>
+      <w:spacing w:after="0" w:line="240" w:lineRule="auto"/>
+    </w:pPr>
+    <w:tblPr>
+      <w:tblBorders>
+        <w:top w:val="single" w:sz="4" w:space="0" w:color="auto"/>
+        <w:left w:val="single" w:sz="4" w:space="0" w:color="auto"/>
+        <w:bottom w:val="single" w:sz="4" w:space="0" w:color="auto"/>
+        <w:right w:val="single" w:sz="4" w:space="0" w:color="auto"/>
+        <w:insideH w:val="single" w:sz="4" w:space="0" w:color="auto"/>
+        <w:insideV w:val="single" w:sz="4" w:space="0" w:color="auto"/>
+      </w:tblBorders>
+    </w:tblPr>
+  </w:style>
+  <w:style w:type="character" w:styleId="Strong">
+    <w:name w:val="Strong"/>
+    <w:basedOn w:val="DefaultParagraphFont"/>
+    <w:uiPriority w:val="22"/>
+    <w:qFormat/>
+    <w:rsid w:val="002F5C78"/>
+    <w:rPr>
+      <w:b/>
+      <w:bCs/>
+    </w:rPr>
+  </w:style>
 </w:styles>
 </file>
 

</xml_diff>